<commit_message>
feat: implement order consideration control
</commit_message>
<xml_diff>
--- a/Requirements/RMS.docx
+++ b/Requirements/RMS.docx
@@ -355,13 +355,7 @@
         <w:rPr>
           <w:lang w:val="en-US"/>
         </w:rPr>
-        <w:t xml:space="preserve"> [GCE] [INFO] LMT_CHECK_</w:t>
-      </w:r>
-      <w:r>
-        <w:rPr>
-          <w:lang w:val="en-US"/>
-        </w:rPr>
-        <w:t>NEW or LMT_CHECK_AMEND (NEW for new order and AMEND for Amend order)</w:t>
+        <w:t xml:space="preserve"> [GCE] [INFO] LMT_CHECK_NEW or LMT_CHECK_AMEND (NEW for new order and AMEND for Amend order)</w:t>
       </w:r>
     </w:p>
     <w:p>
@@ -402,8 +396,43 @@
         <w:rPr>
           <w:lang w:val="en-US"/>
         </w:rPr>
-        <w:t xml:space="preserve">] </w:t>
-      </w:r>
+        <w:t>] $</w:t>
+      </w:r>
+      <w:proofErr w:type="spellStart"/>
+      <w:r>
+        <w:rPr>
+          <w:lang w:val="en-US"/>
+        </w:rPr>
+        <w:t>Control_Name</w:t>
+      </w:r>
+      <w:proofErr w:type="spellEnd"/>
+      <w:r>
+        <w:rPr>
+          <w:lang w:val="en-US"/>
+        </w:rPr>
+        <w:t xml:space="preserve"> LMT=$limit ORD=$</w:t>
+      </w:r>
+      <w:proofErr w:type="spellStart"/>
+      <w:r>
+        <w:rPr>
+          <w:lang w:val="en-US"/>
+        </w:rPr>
+        <w:t>ord</w:t>
+      </w:r>
+      <w:proofErr w:type="spellEnd"/>
+      <w:r>
+        <w:rPr>
+          <w:lang w:val="en-US"/>
+        </w:rPr>
+        <w:t xml:space="preserve"> (If control passes)</w:t>
+      </w:r>
+    </w:p>
+    <w:p>
+      <w:pPr>
+        <w:rPr>
+          <w:lang w:val="en-US"/>
+        </w:rPr>
+      </w:pPr>
       <w:r>
         <w:rPr>
           <w:lang w:val="en-US"/>
@@ -415,6 +444,34 @@
         <w:rPr>
           <w:lang w:val="en-US"/>
         </w:rPr>
+        <w:t>date_$timestamp</w:t>
+      </w:r>
+      <w:proofErr w:type="spellEnd"/>
+      <w:r>
+        <w:rPr>
+          <w:lang w:val="en-US"/>
+        </w:rPr>
+        <w:t xml:space="preserve"> [GCE] [$</w:t>
+      </w:r>
+      <w:proofErr w:type="spellStart"/>
+      <w:r>
+        <w:rPr>
+          <w:lang w:val="en-US"/>
+        </w:rPr>
+        <w:t>log_level</w:t>
+      </w:r>
+      <w:proofErr w:type="spellEnd"/>
+      <w:r>
+        <w:rPr>
+          <w:lang w:val="en-US"/>
+        </w:rPr>
+        <w:t>] $</w:t>
+      </w:r>
+      <w:proofErr w:type="spellStart"/>
+      <w:r>
+        <w:rPr>
+          <w:lang w:val="en-US"/>
+        </w:rPr>
         <w:t>Control_Name</w:t>
       </w:r>
       <w:proofErr w:type="spellEnd"/>
@@ -422,21 +479,21 @@
         <w:rPr>
           <w:lang w:val="en-US"/>
         </w:rPr>
-        <w:t xml:space="preserve"> LMT=$limit ORD=$</w:t>
+        <w:t xml:space="preserve"> $</w:t>
       </w:r>
       <w:proofErr w:type="spellStart"/>
       <w:r>
         <w:rPr>
           <w:lang w:val="en-US"/>
         </w:rPr>
-        <w:t>ord</w:t>
+        <w:t>reject_message</w:t>
       </w:r>
       <w:proofErr w:type="spellEnd"/>
       <w:r>
         <w:rPr>
           <w:lang w:val="en-US"/>
         </w:rPr>
-        <w:t xml:space="preserve"> (If control passes)</w:t>
+        <w:t xml:space="preserve"> (If control breaches)</w:t>
       </w:r>
     </w:p>
     <w:p>
@@ -477,27 +534,54 @@
         <w:rPr>
           <w:lang w:val="en-US"/>
         </w:rPr>
-        <w:t>] $</w:t>
+        <w:t>] n controls validated, x passed, y failed (controls summary)</w:t>
+      </w:r>
+    </w:p>
+    <w:p>
+      <w:pPr>
+        <w:rPr>
+          <w:lang w:val="en-US"/>
+        </w:rPr>
+      </w:pPr>
+      <w:r>
+        <w:rPr>
+          <w:lang w:val="en-US"/>
+        </w:rPr>
+        <w:t>$</w:t>
       </w:r>
       <w:proofErr w:type="spellStart"/>
       <w:r>
         <w:rPr>
           <w:lang w:val="en-US"/>
         </w:rPr>
-        <w:t>Control_Name</w:t>
+        <w:t>date_$timestamp</w:t>
       </w:r>
       <w:proofErr w:type="spellEnd"/>
       <w:r>
         <w:rPr>
           <w:lang w:val="en-US"/>
         </w:rPr>
-        <w:t xml:space="preserve"> $</w:t>
+        <w:t xml:space="preserve"> [GCE] [INFO] $</w:t>
       </w:r>
       <w:proofErr w:type="spellStart"/>
       <w:r>
         <w:rPr>
           <w:lang w:val="en-US"/>
         </w:rPr>
+        <w:t>concat</w:t>
+      </w:r>
+      <w:proofErr w:type="spellEnd"/>
+      <w:r>
+        <w:rPr>
+          <w:lang w:val="en-US"/>
+        </w:rPr>
+        <w:t xml:space="preserve"> of $</w:t>
+      </w:r>
+      <w:proofErr w:type="spellStart"/>
+      <w:r>
+        <w:rPr>
+          <w:lang w:val="en-US"/>
+        </w:rPr>
         <w:t>reject_message</w:t>
       </w:r>
       <w:proofErr w:type="spellEnd"/>
@@ -505,7 +589,21 @@
         <w:rPr>
           <w:lang w:val="en-US"/>
         </w:rPr>
-        <w:t xml:space="preserve"> (If control breaches)</w:t>
+        <w:t xml:space="preserve"> (</w:t>
+      </w:r>
+      <w:proofErr w:type="spellStart"/>
+      <w:r>
+        <w:rPr>
+          <w:lang w:val="en-US"/>
+        </w:rPr>
+        <w:t>concat</w:t>
+      </w:r>
+      <w:proofErr w:type="spellEnd"/>
+      <w:r>
+        <w:rPr>
+          <w:lang w:val="en-US"/>
+        </w:rPr>
+        <w:t xml:space="preserve"> of all reject messages by comma)</w:t>
       </w:r>
     </w:p>
     <w:p>
@@ -532,147 +630,7 @@
         <w:rPr>
           <w:lang w:val="en-US"/>
         </w:rPr>
-        <w:t xml:space="preserve"> [GCE] [$</w:t>
-      </w:r>
-      <w:proofErr w:type="spellStart"/>
-      <w:r>
-        <w:rPr>
-          <w:lang w:val="en-US"/>
-        </w:rPr>
-        <w:t>log_level</w:t>
-      </w:r>
-      <w:proofErr w:type="spellEnd"/>
-      <w:r>
-        <w:rPr>
-          <w:lang w:val="en-US"/>
-        </w:rPr>
-        <w:t xml:space="preserve">] </w:t>
-      </w:r>
-      <w:r>
-        <w:rPr>
-          <w:lang w:val="en-US"/>
-        </w:rPr>
-        <w:t>n controls validated, x passed, y failed (controls summary)</w:t>
-      </w:r>
-    </w:p>
-    <w:p>
-      <w:pPr>
-        <w:rPr>
-          <w:lang w:val="en-US"/>
-        </w:rPr>
-      </w:pPr>
-      <w:r>
-        <w:rPr>
-          <w:lang w:val="en-US"/>
-        </w:rPr>
-        <w:t>$</w:t>
-      </w:r>
-      <w:proofErr w:type="spellStart"/>
-      <w:r>
-        <w:rPr>
-          <w:lang w:val="en-US"/>
-        </w:rPr>
-        <w:t>date_$timestamp</w:t>
-      </w:r>
-      <w:proofErr w:type="spellEnd"/>
-      <w:r>
-        <w:rPr>
-          <w:lang w:val="en-US"/>
-        </w:rPr>
-        <w:t xml:space="preserve"> [GCE]</w:t>
-      </w:r>
-      <w:r>
-        <w:rPr>
-          <w:lang w:val="en-US"/>
-        </w:rPr>
-        <w:t xml:space="preserve"> [INFO</w:t>
-      </w:r>
-      <w:r>
-        <w:rPr>
-          <w:lang w:val="en-US"/>
-        </w:rPr>
-        <w:t xml:space="preserve">] </w:t>
-      </w:r>
-      <w:r>
-        <w:rPr>
-          <w:lang w:val="en-US"/>
-        </w:rPr>
-        <w:t>$</w:t>
-      </w:r>
-      <w:proofErr w:type="spellStart"/>
-      <w:r>
-        <w:rPr>
-          <w:lang w:val="en-US"/>
-        </w:rPr>
-        <w:t>concat</w:t>
-      </w:r>
-      <w:proofErr w:type="spellEnd"/>
-      <w:r>
-        <w:rPr>
-          <w:lang w:val="en-US"/>
-        </w:rPr>
-        <w:t xml:space="preserve"> of $</w:t>
-      </w:r>
-      <w:proofErr w:type="spellStart"/>
-      <w:r>
-        <w:rPr>
-          <w:lang w:val="en-US"/>
-        </w:rPr>
-        <w:t>reject_message</w:t>
-      </w:r>
-      <w:proofErr w:type="spellEnd"/>
-      <w:r>
-        <w:rPr>
-          <w:lang w:val="en-US"/>
-        </w:rPr>
-        <w:t xml:space="preserve"> (</w:t>
-      </w:r>
-      <w:proofErr w:type="spellStart"/>
-      <w:r>
-        <w:rPr>
-          <w:lang w:val="en-US"/>
-        </w:rPr>
-        <w:t>concat</w:t>
-      </w:r>
-      <w:proofErr w:type="spellEnd"/>
-      <w:r>
-        <w:rPr>
-          <w:lang w:val="en-US"/>
-        </w:rPr>
-        <w:t xml:space="preserve"> of all reject messages by comma)</w:t>
-      </w:r>
-    </w:p>
-    <w:p>
-      <w:pPr>
-        <w:rPr>
-          <w:lang w:val="en-US"/>
-        </w:rPr>
-      </w:pPr>
-      <w:r>
-        <w:rPr>
-          <w:lang w:val="en-US"/>
-        </w:rPr>
-        <w:t>$</w:t>
-      </w:r>
-      <w:proofErr w:type="spellStart"/>
-      <w:r>
-        <w:rPr>
-          <w:lang w:val="en-US"/>
-        </w:rPr>
-        <w:t>date_$timestamp</w:t>
-      </w:r>
-      <w:proofErr w:type="spellEnd"/>
-      <w:r>
-        <w:rPr>
-          <w:lang w:val="en-US"/>
-        </w:rPr>
-        <w:t xml:space="preserve"> [GCE] [</w:t>
-      </w:r>
-      <w:r>
-        <w:rPr>
-          <w:lang w:val="en-US"/>
-        </w:rPr>
-        <w:t>INFO] LMT_CHECK_OVER</w:t>
+        <w:t xml:space="preserve"> [GCE] [INFO] LMT_CHECK_OVER</w:t>
       </w:r>
       <w:r>
         <w:rPr>
@@ -1217,13 +1175,7 @@
               <w:rPr>
                 <w:lang w:val="en-US"/>
               </w:rPr>
-              <w:t xml:space="preserve">Max Order </w:t>
-            </w:r>
-            <w:r>
-              <w:rPr>
-                <w:lang w:val="en-US"/>
-              </w:rPr>
-              <w:t>Price</w:t>
+              <w:t>Max Order Price</w:t>
             </w:r>
           </w:p>
         </w:tc>
@@ -1261,25 +1213,7 @@
               <w:rPr>
                 <w:lang w:val="en-US"/>
               </w:rPr>
-              <w:t xml:space="preserve">Allows order </w:t>
-            </w:r>
-            <w:r>
-              <w:rPr>
-                <w:lang w:val="en-US"/>
-              </w:rPr>
-              <w:t>price</w:t>
-            </w:r>
-            <w:r>
-              <w:rPr>
-                <w:lang w:val="en-US"/>
-              </w:rPr>
-              <w:t xml:space="preserve"> till configured limit </w:t>
-            </w:r>
-            <w:r>
-              <w:rPr>
-                <w:lang w:val="en-US"/>
-              </w:rPr>
-              <w:t>price</w:t>
+              <w:t>Allows order price till configured limit price</w:t>
             </w:r>
           </w:p>
         </w:tc>
@@ -1317,19 +1251,7 @@
               <w:rPr>
                 <w:lang w:val="en-US"/>
               </w:rPr>
-              <w:t xml:space="preserve">If Limit / LMT is 1000, orders are allowed till 1000, any order with </w:t>
-            </w:r>
-            <w:r>
-              <w:rPr>
-                <w:lang w:val="en-US"/>
-              </w:rPr>
-              <w:t>price</w:t>
-            </w:r>
-            <w:r>
-              <w:rPr>
-                <w:lang w:val="en-US"/>
-              </w:rPr>
-              <w:t xml:space="preserve"> &gt;= 1000 will be rejected.</w:t>
+              <w:t>If Limit / LMT is 1000, orders are allowed till 1000, any order with price &gt;= 1000 will be rejected.</w:t>
             </w:r>
             <w:r>
               <w:rPr>
@@ -1400,19 +1322,7 @@
               <w:rPr>
                 <w:lang w:val="en-US"/>
               </w:rPr>
-              <w:t xml:space="preserve">Order </w:t>
-            </w:r>
-            <w:r>
-              <w:rPr>
-                <w:lang w:val="en-US"/>
-              </w:rPr>
-              <w:t>price</w:t>
-            </w:r>
-            <w:r>
-              <w:rPr>
-                <w:lang w:val="en-US"/>
-              </w:rPr>
-              <w:t xml:space="preserve"> is too big, LMT=$LMT, ORD=$ORD</w:t>
+              <w:t>Order price is too big, LMT=$LMT, ORD=$ORD</w:t>
             </w:r>
           </w:p>
         </w:tc>
@@ -1425,6 +1335,711 @@
         </w:rPr>
       </w:pPr>
     </w:p>
+    <w:p>
+      <w:pPr>
+        <w:rPr>
+          <w:lang w:val="en-US"/>
+        </w:rPr>
+      </w:pPr>
+    </w:p>
+    <w:p>
+      <w:pPr>
+        <w:rPr>
+          <w:lang w:val="en-US"/>
+        </w:rPr>
+      </w:pPr>
+    </w:p>
+    <w:tbl>
+      <w:tblPr>
+        <w:tblStyle w:val="TableGrid"/>
+        <w:tblW w:w="0" w:type="auto"/>
+        <w:tblLook w:val="04A0" w:firstRow="1" w:lastRow="0" w:firstColumn="1" w:lastColumn="0" w:noHBand="0" w:noVBand="1"/>
+      </w:tblPr>
+      <w:tblGrid>
+        <w:gridCol w:w="2122"/>
+        <w:gridCol w:w="6894"/>
+      </w:tblGrid>
+      <w:tr>
+        <w:tc>
+          <w:tcPr>
+            <w:tcW w:w="2122" w:type="dxa"/>
+          </w:tcPr>
+          <w:p>
+            <w:pPr>
+              <w:rPr>
+                <w:lang w:val="en-US"/>
+              </w:rPr>
+            </w:pPr>
+            <w:r>
+              <w:rPr>
+                <w:lang w:val="en-US"/>
+              </w:rPr>
+              <w:lastRenderedPageBreak/>
+              <w:t>Control Name</w:t>
+            </w:r>
+          </w:p>
+        </w:tc>
+        <w:tc>
+          <w:tcPr>
+            <w:tcW w:w="6894" w:type="dxa"/>
+          </w:tcPr>
+          <w:p>
+            <w:pPr>
+              <w:rPr>
+                <w:lang w:val="en-US"/>
+              </w:rPr>
+            </w:pPr>
+            <w:r>
+              <w:rPr>
+                <w:lang w:val="en-US"/>
+              </w:rPr>
+              <w:t xml:space="preserve">Max Order </w:t>
+            </w:r>
+            <w:r>
+              <w:rPr>
+                <w:lang w:val="en-US"/>
+              </w:rPr>
+              <w:t>Consideration</w:t>
+            </w:r>
+          </w:p>
+        </w:tc>
+      </w:tr>
+      <w:tr>
+        <w:tc>
+          <w:tcPr>
+            <w:tcW w:w="2122" w:type="dxa"/>
+          </w:tcPr>
+          <w:p>
+            <w:pPr>
+              <w:rPr>
+                <w:lang w:val="en-US"/>
+              </w:rPr>
+            </w:pPr>
+            <w:r>
+              <w:rPr>
+                <w:lang w:val="en-US"/>
+              </w:rPr>
+              <w:t>Description</w:t>
+            </w:r>
+          </w:p>
+        </w:tc>
+        <w:tc>
+          <w:tcPr>
+            <w:tcW w:w="6894" w:type="dxa"/>
+          </w:tcPr>
+          <w:p>
+            <w:pPr>
+              <w:rPr>
+                <w:lang w:val="en-US"/>
+              </w:rPr>
+            </w:pPr>
+            <w:r>
+              <w:rPr>
+                <w:lang w:val="en-US"/>
+              </w:rPr>
+              <w:t xml:space="preserve">Allows order </w:t>
+            </w:r>
+            <w:r>
+              <w:rPr>
+                <w:lang w:val="en-US"/>
+              </w:rPr>
+              <w:t>value</w:t>
+            </w:r>
+            <w:r>
+              <w:rPr>
+                <w:lang w:val="en-US"/>
+              </w:rPr>
+              <w:t xml:space="preserve"> till configured limit size</w:t>
+            </w:r>
+          </w:p>
+        </w:tc>
+      </w:tr>
+      <w:tr>
+        <w:tc>
+          <w:tcPr>
+            <w:tcW w:w="2122" w:type="dxa"/>
+          </w:tcPr>
+          <w:p>
+            <w:pPr>
+              <w:rPr>
+                <w:lang w:val="en-US"/>
+              </w:rPr>
+            </w:pPr>
+            <w:r>
+              <w:rPr>
+                <w:lang w:val="en-US"/>
+              </w:rPr>
+              <w:t>Working</w:t>
+            </w:r>
+          </w:p>
+        </w:tc>
+        <w:tc>
+          <w:tcPr>
+            <w:tcW w:w="6894" w:type="dxa"/>
+          </w:tcPr>
+          <w:p>
+            <w:pPr>
+              <w:rPr>
+                <w:lang w:val="en-US"/>
+              </w:rPr>
+            </w:pPr>
+            <w:r>
+              <w:rPr>
+                <w:lang w:val="en-US"/>
+              </w:rPr>
+              <w:t>If Limit / LMT is 1000</w:t>
+            </w:r>
+            <w:r>
+              <w:rPr>
+                <w:lang w:val="en-US"/>
+              </w:rPr>
+              <w:t xml:space="preserve"> HKD</w:t>
+            </w:r>
+            <w:r>
+              <w:rPr>
+                <w:lang w:val="en-US"/>
+              </w:rPr>
+              <w:t>, order</w:t>
+            </w:r>
+            <w:r>
+              <w:rPr>
+                <w:lang w:val="en-US"/>
+              </w:rPr>
+              <w:t xml:space="preserve"> value</w:t>
+            </w:r>
+            <w:r>
+              <w:rPr>
+                <w:lang w:val="en-US"/>
+              </w:rPr>
+              <w:t xml:space="preserve"> </w:t>
+            </w:r>
+            <w:proofErr w:type="gramStart"/>
+            <w:r>
+              <w:rPr>
+                <w:lang w:val="en-US"/>
+              </w:rPr>
+              <w:t>are</w:t>
+            </w:r>
+            <w:proofErr w:type="gramEnd"/>
+            <w:r>
+              <w:rPr>
+                <w:lang w:val="en-US"/>
+              </w:rPr>
+              <w:t xml:space="preserve"> allowed till 1000</w:t>
+            </w:r>
+            <w:r>
+              <w:rPr>
+                <w:lang w:val="en-US"/>
+              </w:rPr>
+              <w:t xml:space="preserve"> HKD</w:t>
+            </w:r>
+            <w:r>
+              <w:rPr>
+                <w:lang w:val="en-US"/>
+              </w:rPr>
+              <w:t xml:space="preserve">, any order with </w:t>
+            </w:r>
+            <w:r>
+              <w:rPr>
+                <w:lang w:val="en-US"/>
+              </w:rPr>
+              <w:t>Value</w:t>
+            </w:r>
+            <w:r>
+              <w:rPr>
+                <w:lang w:val="en-US"/>
+              </w:rPr>
+              <w:t xml:space="preserve"> &gt;= 1000</w:t>
+            </w:r>
+            <w:r>
+              <w:rPr>
+                <w:lang w:val="en-US"/>
+              </w:rPr>
+              <w:t xml:space="preserve"> HKD</w:t>
+            </w:r>
+            <w:r>
+              <w:rPr>
+                <w:lang w:val="en-US"/>
+              </w:rPr>
+              <w:t xml:space="preserve"> will be rejected.</w:t>
+            </w:r>
+          </w:p>
+          <w:p>
+            <w:pPr>
+              <w:rPr>
+                <w:lang w:val="en-US"/>
+              </w:rPr>
+            </w:pPr>
+          </w:p>
+          <w:p>
+            <w:pPr>
+              <w:rPr>
+                <w:lang w:val="en-US"/>
+              </w:rPr>
+            </w:pPr>
+            <w:r>
+              <w:rPr>
+                <w:lang w:val="en-US"/>
+              </w:rPr>
+              <w:t xml:space="preserve">Order Value = Order Quantity * </w:t>
+            </w:r>
+            <w:r>
+              <w:rPr>
+                <w:lang w:val="en-US"/>
+              </w:rPr>
+              <w:t>Reference</w:t>
+            </w:r>
+            <w:r>
+              <w:rPr>
+                <w:lang w:val="en-US"/>
+              </w:rPr>
+              <w:t xml:space="preserve"> price</w:t>
+            </w:r>
+            <w:r>
+              <w:rPr>
+                <w:lang w:val="en-US"/>
+              </w:rPr>
+              <w:t xml:space="preserve"> * </w:t>
+            </w:r>
+            <w:proofErr w:type="spellStart"/>
+            <w:r>
+              <w:rPr>
+                <w:lang w:val="en-US"/>
+              </w:rPr>
+              <w:t>xr</w:t>
+            </w:r>
+            <w:proofErr w:type="spellEnd"/>
+            <w:r>
+              <w:rPr>
+                <w:lang w:val="en-US"/>
+              </w:rPr>
+              <w:t xml:space="preserve"> rate (FX rate to be used if Order Currency is different from Limit currency)</w:t>
+            </w:r>
+          </w:p>
+          <w:p>
+            <w:pPr>
+              <w:rPr>
+                <w:lang w:val="en-US"/>
+              </w:rPr>
+            </w:pPr>
+            <w:r>
+              <w:rPr>
+                <w:lang w:val="en-US"/>
+              </w:rPr>
+              <w:t xml:space="preserve">Reference price = </w:t>
+            </w:r>
+            <w:r>
+              <w:rPr>
+                <w:lang w:val="en-US"/>
+              </w:rPr>
+              <w:t>For Limit order it is Limit price</w:t>
+            </w:r>
+          </w:p>
+          <w:p>
+            <w:pPr>
+              <w:rPr>
+                <w:lang w:val="en-US"/>
+              </w:rPr>
+            </w:pPr>
+            <w:r>
+              <w:rPr>
+                <w:lang w:val="en-US"/>
+              </w:rPr>
+              <w:t>For Market orders, it is Bo/Ask for Buy side and Bb/Bid for Sell Side orders, in absence of Ask/Bid prices, it should fallback to last and then fallback to open and should use close price if all other prices are unavailable.</w:t>
+            </w:r>
+          </w:p>
+          <w:p>
+            <w:pPr>
+              <w:rPr>
+                <w:lang w:val="en-US"/>
+              </w:rPr>
+            </w:pPr>
+            <w:r>
+              <w:rPr>
+                <w:lang w:val="en-US"/>
+              </w:rPr>
+              <w:br/>
+              <w:t xml:space="preserve">ORD is order </w:t>
+            </w:r>
+            <w:r>
+              <w:rPr>
+                <w:lang w:val="en-US"/>
+              </w:rPr>
+              <w:t>value</w:t>
+            </w:r>
+            <w:r>
+              <w:rPr>
+                <w:lang w:val="en-US"/>
+              </w:rPr>
+              <w:t xml:space="preserve">, LMT is limit </w:t>
+            </w:r>
+            <w:r>
+              <w:rPr>
+                <w:lang w:val="en-US"/>
+              </w:rPr>
+              <w:t>value</w:t>
+            </w:r>
+            <w:r>
+              <w:rPr>
+                <w:lang w:val="en-US"/>
+              </w:rPr>
+              <w:br/>
+              <w:t>Pass: ORD =&lt; LMT</w:t>
+            </w:r>
+          </w:p>
+          <w:p>
+            <w:pPr>
+              <w:rPr>
+                <w:lang w:val="en-US"/>
+              </w:rPr>
+            </w:pPr>
+            <w:r>
+              <w:rPr>
+                <w:lang w:val="en-US"/>
+              </w:rPr>
+              <w:t>Fail: ORD &gt; LMT</w:t>
+            </w:r>
+          </w:p>
+        </w:tc>
+      </w:tr>
+      <w:tr>
+        <w:tc>
+          <w:tcPr>
+            <w:tcW w:w="2122" w:type="dxa"/>
+          </w:tcPr>
+          <w:p>
+            <w:pPr>
+              <w:rPr>
+                <w:lang w:val="en-US"/>
+              </w:rPr>
+            </w:pPr>
+            <w:r>
+              <w:rPr>
+                <w:lang w:val="en-US"/>
+              </w:rPr>
+              <w:t>Rejection message</w:t>
+            </w:r>
+          </w:p>
+        </w:tc>
+        <w:tc>
+          <w:tcPr>
+            <w:tcW w:w="6894" w:type="dxa"/>
+          </w:tcPr>
+          <w:p>
+            <w:pPr>
+              <w:rPr>
+                <w:lang w:val="en-US"/>
+              </w:rPr>
+            </w:pPr>
+            <w:r>
+              <w:rPr>
+                <w:lang w:val="en-US"/>
+              </w:rPr>
+              <w:t xml:space="preserve">Order </w:t>
+            </w:r>
+            <w:r>
+              <w:rPr>
+                <w:lang w:val="en-US"/>
+              </w:rPr>
+              <w:t>Value</w:t>
+            </w:r>
+            <w:r>
+              <w:rPr>
+                <w:lang w:val="en-US"/>
+              </w:rPr>
+              <w:t xml:space="preserve"> is too big, LMT=$LMT, ORD=$ORD</w:t>
+            </w:r>
+          </w:p>
+        </w:tc>
+      </w:tr>
+      <w:tr>
+        <w:tc>
+          <w:tcPr>
+            <w:tcW w:w="2122" w:type="dxa"/>
+          </w:tcPr>
+          <w:p>
+            <w:pPr>
+              <w:rPr>
+                <w:lang w:val="en-US"/>
+              </w:rPr>
+            </w:pPr>
+            <w:r>
+              <w:rPr>
+                <w:lang w:val="en-US"/>
+              </w:rPr>
+              <w:t>Example1</w:t>
+            </w:r>
+          </w:p>
+        </w:tc>
+        <w:tc>
+          <w:tcPr>
+            <w:tcW w:w="6894" w:type="dxa"/>
+          </w:tcPr>
+          <w:p>
+            <w:pPr>
+              <w:rPr>
+                <w:lang w:val="en-US"/>
+              </w:rPr>
+            </w:pPr>
+            <w:r>
+              <w:rPr>
+                <w:lang w:val="en-US"/>
+              </w:rPr>
+              <w:t>If LMT is 1000 USD and order price is 100 HKD for 10 quantity, order value should be calculated as below.</w:t>
+            </w:r>
+          </w:p>
+          <w:p>
+            <w:pPr>
+              <w:rPr>
+                <w:lang w:val="en-US"/>
+              </w:rPr>
+            </w:pPr>
+            <w:r>
+              <w:rPr>
+                <w:lang w:val="en-US"/>
+              </w:rPr>
+              <w:t xml:space="preserve">If </w:t>
+            </w:r>
+            <w:proofErr w:type="spellStart"/>
+            <w:r>
+              <w:rPr>
+                <w:lang w:val="en-US"/>
+              </w:rPr>
+              <w:t>xr</w:t>
+            </w:r>
+            <w:proofErr w:type="spellEnd"/>
+            <w:r>
+              <w:rPr>
+                <w:lang w:val="en-US"/>
+              </w:rPr>
+              <w:t xml:space="preserve"> rate is 0.13 (to be get from </w:t>
+            </w:r>
+            <w:proofErr w:type="spellStart"/>
+            <w:r>
+              <w:rPr>
+                <w:lang w:val="en-US"/>
+              </w:rPr>
+              <w:t>yfinance</w:t>
+            </w:r>
+            <w:proofErr w:type="spellEnd"/>
+            <w:r>
+              <w:rPr>
+                <w:lang w:val="en-US"/>
+              </w:rPr>
+              <w:t xml:space="preserve"> as HKD=X as ticker to get </w:t>
+            </w:r>
+            <w:proofErr w:type="spellStart"/>
+            <w:r>
+              <w:rPr>
+                <w:lang w:val="en-US"/>
+              </w:rPr>
+              <w:t>fx</w:t>
+            </w:r>
+            <w:proofErr w:type="spellEnd"/>
+            <w:r>
+              <w:rPr>
+                <w:lang w:val="en-US"/>
+              </w:rPr>
+              <w:t xml:space="preserve"> price)</w:t>
+            </w:r>
+          </w:p>
+          <w:p>
+            <w:pPr>
+              <w:rPr>
+                <w:lang w:val="en-US"/>
+              </w:rPr>
+            </w:pPr>
+            <w:r>
+              <w:rPr>
+                <w:lang w:val="en-US"/>
+              </w:rPr>
+              <w:t>LMT: 1000 USD</w:t>
+            </w:r>
+          </w:p>
+          <w:p>
+            <w:pPr>
+              <w:rPr>
+                <w:lang w:val="en-US"/>
+              </w:rPr>
+            </w:pPr>
+            <w:r>
+              <w:rPr>
+                <w:lang w:val="en-US"/>
+              </w:rPr>
+              <w:t>ORD: 10 * 100 * 0.13 = 130 USD</w:t>
+            </w:r>
+          </w:p>
+        </w:tc>
+      </w:tr>
+      <w:tr>
+        <w:tc>
+          <w:tcPr>
+            <w:tcW w:w="2122" w:type="dxa"/>
+          </w:tcPr>
+          <w:p>
+            <w:pPr>
+              <w:rPr>
+                <w:lang w:val="en-US"/>
+              </w:rPr>
+            </w:pPr>
+            <w:r>
+              <w:rPr>
+                <w:lang w:val="en-US"/>
+              </w:rPr>
+              <w:t>Example2</w:t>
+            </w:r>
+          </w:p>
+        </w:tc>
+        <w:tc>
+          <w:tcPr>
+            <w:tcW w:w="6894" w:type="dxa"/>
+          </w:tcPr>
+          <w:p>
+            <w:pPr>
+              <w:rPr>
+                <w:lang w:val="en-US"/>
+              </w:rPr>
+            </w:pPr>
+            <w:r>
+              <w:rPr>
+                <w:lang w:val="en-US"/>
+              </w:rPr>
+              <w:t xml:space="preserve">If LMT is 1000 </w:t>
+            </w:r>
+            <w:r>
+              <w:rPr>
+                <w:lang w:val="en-US"/>
+              </w:rPr>
+              <w:t>HKD</w:t>
+            </w:r>
+            <w:r>
+              <w:rPr>
+                <w:lang w:val="en-US"/>
+              </w:rPr>
+              <w:t xml:space="preserve"> and order price is 100 HKD for 10 quantity, order value should be calculated as below.</w:t>
+            </w:r>
+          </w:p>
+          <w:p>
+            <w:pPr>
+              <w:rPr>
+                <w:lang w:val="en-US"/>
+              </w:rPr>
+            </w:pPr>
+            <w:r>
+              <w:rPr>
+                <w:lang w:val="en-US"/>
+              </w:rPr>
+              <w:t xml:space="preserve">If </w:t>
+            </w:r>
+            <w:proofErr w:type="spellStart"/>
+            <w:r>
+              <w:rPr>
+                <w:lang w:val="en-US"/>
+              </w:rPr>
+              <w:t>xr</w:t>
+            </w:r>
+            <w:proofErr w:type="spellEnd"/>
+            <w:r>
+              <w:rPr>
+                <w:lang w:val="en-US"/>
+              </w:rPr>
+              <w:t xml:space="preserve"> rate is 0.13 (to be get from </w:t>
+            </w:r>
+            <w:proofErr w:type="spellStart"/>
+            <w:r>
+              <w:rPr>
+                <w:lang w:val="en-US"/>
+              </w:rPr>
+              <w:t>yfinance</w:t>
+            </w:r>
+            <w:proofErr w:type="spellEnd"/>
+            <w:r>
+              <w:rPr>
+                <w:lang w:val="en-US"/>
+              </w:rPr>
+              <w:t xml:space="preserve"> as HKD=X as ticker to get </w:t>
+            </w:r>
+            <w:proofErr w:type="spellStart"/>
+            <w:r>
+              <w:rPr>
+                <w:lang w:val="en-US"/>
+              </w:rPr>
+              <w:t>fx</w:t>
+            </w:r>
+            <w:proofErr w:type="spellEnd"/>
+            <w:r>
+              <w:rPr>
+                <w:lang w:val="en-US"/>
+              </w:rPr>
+              <w:t xml:space="preserve"> price)</w:t>
+            </w:r>
+          </w:p>
+          <w:p>
+            <w:pPr>
+              <w:rPr>
+                <w:lang w:val="en-US"/>
+              </w:rPr>
+            </w:pPr>
+            <w:r>
+              <w:rPr>
+                <w:lang w:val="en-US"/>
+              </w:rPr>
+              <w:t>LMT: 1000 USD</w:t>
+            </w:r>
+          </w:p>
+          <w:p>
+            <w:pPr>
+              <w:rPr>
+                <w:lang w:val="en-US"/>
+              </w:rPr>
+            </w:pPr>
+            <w:r>
+              <w:rPr>
+                <w:lang w:val="en-US"/>
+              </w:rPr>
+              <w:t xml:space="preserve">ORD: 10 * 100 * </w:t>
+            </w:r>
+            <w:r>
+              <w:rPr>
+                <w:lang w:val="en-US"/>
+              </w:rPr>
+              <w:t>1 (as LMT currency is same as Order currency)</w:t>
+            </w:r>
+            <w:r>
+              <w:rPr>
+                <w:lang w:val="en-US"/>
+              </w:rPr>
+              <w:t xml:space="preserve"> = 1</w:t>
+            </w:r>
+            <w:r>
+              <w:rPr>
+                <w:lang w:val="en-US"/>
+              </w:rPr>
+              <w:t>00</w:t>
+            </w:r>
+            <w:r>
+              <w:rPr>
+                <w:lang w:val="en-US"/>
+              </w:rPr>
+              <w:t xml:space="preserve">0 </w:t>
+            </w:r>
+            <w:r>
+              <w:rPr>
+                <w:lang w:val="en-US"/>
+              </w:rPr>
+              <w:t>HK</w:t>
+            </w:r>
+            <w:r>
+              <w:rPr>
+                <w:lang w:val="en-US"/>
+              </w:rPr>
+              <w:t>D</w:t>
+            </w:r>
+          </w:p>
+        </w:tc>
+      </w:tr>
+    </w:tbl>
+    <w:p/>
     <w:sectPr>
       <w:pgSz w:w="11906" w:h="16838"/>
       <w:pgMar w:top="1440" w:right="1440" w:bottom="1440" w:left="1440" w:header="708" w:footer="708" w:gutter="0"/>
@@ -2024,7 +2639,7 @@
   <w:style w:type="paragraph" w:default="1" w:styleId="Normal">
     <w:name w:val="Normal"/>
     <w:qFormat/>
-    <w:rsid w:val="00416F62"/>
+    <w:rsid w:val="00593E15"/>
   </w:style>
   <w:style w:type="paragraph" w:styleId="Heading1">
     <w:name w:val="heading 1"/>
@@ -2228,6 +2843,7 @@
   <w:style w:type="character" w:default="1" w:styleId="DefaultParagraphFont">
     <w:name w:val="Default Paragraph Font"/>
     <w:uiPriority w:val="1"/>
+    <w:semiHidden/>
     <w:unhideWhenUsed/>
   </w:style>
   <w:style w:type="table" w:default="1" w:styleId="TableNormal">

</xml_diff>

<commit_message>
feat: implement SQLite-backed RMS control limits management in DataMgr with CSV bulk loading and unit tests
</commit_message>
<xml_diff>
--- a/Requirements/RMS.docx
+++ b/Requirements/RMS.docx
@@ -902,6 +902,474 @@
         </w:rPr>
         <w:t>End of limit checking - Start of limit checking)</w:t>
       </w:r>
+    </w:p>
+    <w:p>
+      <w:pPr>
+        <w:rPr>
+          <w:lang w:val="en-US"/>
+        </w:rPr>
+      </w:pPr>
+    </w:p>
+    <w:p>
+      <w:pPr>
+        <w:rPr>
+          <w:lang w:val="en-US"/>
+        </w:rPr>
+      </w:pPr>
+      <w:r>
+        <w:rPr>
+          <w:b/>
+          <w:bCs/>
+          <w:u w:val="single"/>
+          <w:lang w:val="en-US"/>
+        </w:rPr>
+        <w:t>Controls</w:t>
+      </w:r>
+      <w:r>
+        <w:rPr>
+          <w:lang w:val="en-US"/>
+        </w:rPr>
+        <w:t>:</w:t>
+      </w:r>
+    </w:p>
+    <w:p>
+      <w:pPr>
+        <w:rPr>
+          <w:lang w:val="en-US"/>
+        </w:rPr>
+      </w:pPr>
+      <w:r>
+        <w:rPr>
+          <w:lang w:val="en-US"/>
+        </w:rPr>
+        <w:t>Individual Order Checks:</w:t>
+      </w:r>
+    </w:p>
+    <w:p>
+      <w:pPr>
+        <w:pStyle w:val="ListParagraph"/>
+        <w:numPr>
+          <w:ilvl w:val="0"/>
+          <w:numId w:val="3"/>
+        </w:numPr>
+        <w:rPr>
+          <w:lang w:val="en-US"/>
+        </w:rPr>
+      </w:pPr>
+      <w:r>
+        <w:rPr>
+          <w:lang w:val="en-US"/>
+        </w:rPr>
+        <w:t>Qty/Value:</w:t>
+      </w:r>
+    </w:p>
+    <w:p>
+      <w:pPr>
+        <w:pStyle w:val="ListParagraph"/>
+        <w:numPr>
+          <w:ilvl w:val="1"/>
+          <w:numId w:val="3"/>
+        </w:numPr>
+        <w:rPr>
+          <w:lang w:val="en-US"/>
+        </w:rPr>
+      </w:pPr>
+      <w:proofErr w:type="spellStart"/>
+      <w:r>
+        <w:rPr>
+          <w:lang w:val="en-US"/>
+        </w:rPr>
+        <w:t>MaxOrderSize</w:t>
+      </w:r>
+      <w:proofErr w:type="spellEnd"/>
+    </w:p>
+    <w:p>
+      <w:pPr>
+        <w:pStyle w:val="ListParagraph"/>
+        <w:numPr>
+          <w:ilvl w:val="1"/>
+          <w:numId w:val="3"/>
+        </w:numPr>
+        <w:rPr>
+          <w:lang w:val="en-US"/>
+        </w:rPr>
+      </w:pPr>
+      <w:proofErr w:type="spellStart"/>
+      <w:r>
+        <w:rPr>
+          <w:lang w:val="en-US"/>
+        </w:rPr>
+        <w:t>MaxOrderPrice</w:t>
+      </w:r>
+      <w:proofErr w:type="spellEnd"/>
+    </w:p>
+    <w:p>
+      <w:pPr>
+        <w:pStyle w:val="ListParagraph"/>
+        <w:numPr>
+          <w:ilvl w:val="1"/>
+          <w:numId w:val="3"/>
+        </w:numPr>
+        <w:rPr>
+          <w:lang w:val="en-US"/>
+        </w:rPr>
+      </w:pPr>
+      <w:proofErr w:type="spellStart"/>
+      <w:r>
+        <w:rPr>
+          <w:lang w:val="en-US"/>
+        </w:rPr>
+        <w:t>MaxOrderValue</w:t>
+      </w:r>
+      <w:proofErr w:type="spellEnd"/>
+    </w:p>
+    <w:p>
+      <w:pPr>
+        <w:pStyle w:val="ListParagraph"/>
+        <w:numPr>
+          <w:ilvl w:val="1"/>
+          <w:numId w:val="3"/>
+        </w:numPr>
+        <w:rPr>
+          <w:lang w:val="en-US"/>
+        </w:rPr>
+      </w:pPr>
+      <w:proofErr w:type="spellStart"/>
+      <w:r>
+        <w:rPr>
+          <w:lang w:val="en-US"/>
+        </w:rPr>
+        <w:t>MaxOrderADV</w:t>
+      </w:r>
+      <w:proofErr w:type="spellEnd"/>
+    </w:p>
+    <w:p>
+      <w:pPr>
+        <w:pStyle w:val="ListParagraph"/>
+        <w:numPr>
+          <w:ilvl w:val="0"/>
+          <w:numId w:val="3"/>
+        </w:numPr>
+        <w:rPr>
+          <w:lang w:val="en-US"/>
+        </w:rPr>
+      </w:pPr>
+      <w:r>
+        <w:rPr>
+          <w:lang w:val="en-US"/>
+        </w:rPr>
+        <w:t>Price Checks:</w:t>
+      </w:r>
+    </w:p>
+    <w:p>
+      <w:pPr>
+        <w:pStyle w:val="ListParagraph"/>
+        <w:numPr>
+          <w:ilvl w:val="1"/>
+          <w:numId w:val="3"/>
+        </w:numPr>
+        <w:rPr>
+          <w:lang w:val="en-US"/>
+        </w:rPr>
+      </w:pPr>
+      <w:proofErr w:type="spellStart"/>
+      <w:r>
+        <w:rPr>
+          <w:lang w:val="en-US"/>
+        </w:rPr>
+        <w:t>ClosePriceTolerance</w:t>
+      </w:r>
+      <w:proofErr w:type="spellEnd"/>
+    </w:p>
+    <w:p>
+      <w:pPr>
+        <w:pStyle w:val="ListParagraph"/>
+        <w:numPr>
+          <w:ilvl w:val="1"/>
+          <w:numId w:val="3"/>
+        </w:numPr>
+        <w:rPr>
+          <w:lang w:val="en-US"/>
+        </w:rPr>
+      </w:pPr>
+      <w:proofErr w:type="spellStart"/>
+      <w:r>
+        <w:rPr>
+          <w:lang w:val="en-US"/>
+        </w:rPr>
+        <w:t>LastPriceTolerance</w:t>
+      </w:r>
+      <w:proofErr w:type="spellEnd"/>
+    </w:p>
+    <w:p>
+      <w:pPr>
+        <w:pStyle w:val="ListParagraph"/>
+        <w:numPr>
+          <w:ilvl w:val="1"/>
+          <w:numId w:val="3"/>
+        </w:numPr>
+        <w:rPr>
+          <w:lang w:val="en-US"/>
+        </w:rPr>
+      </w:pPr>
+      <w:proofErr w:type="spellStart"/>
+      <w:r>
+        <w:rPr>
+          <w:lang w:val="en-US"/>
+        </w:rPr>
+        <w:t>BBOTolerance</w:t>
+      </w:r>
+      <w:proofErr w:type="spellEnd"/>
+    </w:p>
+    <w:p>
+      <w:pPr>
+        <w:pStyle w:val="ListParagraph"/>
+        <w:numPr>
+          <w:ilvl w:val="1"/>
+          <w:numId w:val="3"/>
+        </w:numPr>
+        <w:rPr>
+          <w:lang w:val="en-US"/>
+        </w:rPr>
+      </w:pPr>
+      <w:proofErr w:type="spellStart"/>
+      <w:r>
+        <w:rPr>
+          <w:lang w:val="en-US"/>
+        </w:rPr>
+        <w:t>MarketDepthCheck</w:t>
+      </w:r>
+      <w:proofErr w:type="spellEnd"/>
+    </w:p>
+    <w:p>
+      <w:pPr>
+        <w:rPr>
+          <w:lang w:val="en-US"/>
+        </w:rPr>
+      </w:pPr>
+      <w:r>
+        <w:rPr>
+          <w:lang w:val="en-US"/>
+        </w:rPr>
+        <w:t>Aggregate Checks:</w:t>
+      </w:r>
+    </w:p>
+    <w:p>
+      <w:pPr>
+        <w:pStyle w:val="ListParagraph"/>
+        <w:numPr>
+          <w:ilvl w:val="0"/>
+          <w:numId w:val="4"/>
+        </w:numPr>
+        <w:rPr>
+          <w:lang w:val="en-US"/>
+        </w:rPr>
+      </w:pPr>
+      <w:r>
+        <w:rPr>
+          <w:lang w:val="en-US"/>
+        </w:rPr>
+        <w:t>Position Checks</w:t>
+      </w:r>
+    </w:p>
+    <w:p>
+      <w:pPr>
+        <w:pStyle w:val="ListParagraph"/>
+        <w:numPr>
+          <w:ilvl w:val="1"/>
+          <w:numId w:val="4"/>
+        </w:numPr>
+        <w:rPr>
+          <w:lang w:val="en-US"/>
+        </w:rPr>
+      </w:pPr>
+      <w:proofErr w:type="spellStart"/>
+      <w:r>
+        <w:rPr>
+          <w:lang w:val="en-US"/>
+        </w:rPr>
+        <w:t>MaxDailyVolume</w:t>
+      </w:r>
+      <w:proofErr w:type="spellEnd"/>
+    </w:p>
+    <w:p>
+      <w:pPr>
+        <w:pStyle w:val="ListParagraph"/>
+        <w:numPr>
+          <w:ilvl w:val="1"/>
+          <w:numId w:val="4"/>
+        </w:numPr>
+        <w:rPr>
+          <w:lang w:val="en-US"/>
+        </w:rPr>
+      </w:pPr>
+      <w:proofErr w:type="spellStart"/>
+      <w:r>
+        <w:rPr>
+          <w:lang w:val="en-US"/>
+        </w:rPr>
+        <w:t>MaxDailyValue</w:t>
+      </w:r>
+      <w:proofErr w:type="spellEnd"/>
+    </w:p>
+    <w:p>
+      <w:pPr>
+        <w:pStyle w:val="ListParagraph"/>
+        <w:numPr>
+          <w:ilvl w:val="1"/>
+          <w:numId w:val="4"/>
+        </w:numPr>
+        <w:rPr>
+          <w:lang w:val="en-US"/>
+        </w:rPr>
+      </w:pPr>
+      <w:proofErr w:type="spellStart"/>
+      <w:r>
+        <w:rPr>
+          <w:lang w:val="en-US"/>
+        </w:rPr>
+        <w:t>MaxDailyNetValue</w:t>
+      </w:r>
+      <w:proofErr w:type="spellEnd"/>
+    </w:p>
+    <w:p>
+      <w:pPr>
+        <w:pStyle w:val="ListParagraph"/>
+        <w:numPr>
+          <w:ilvl w:val="1"/>
+          <w:numId w:val="4"/>
+        </w:numPr>
+        <w:rPr>
+          <w:lang w:val="en-US"/>
+        </w:rPr>
+      </w:pPr>
+      <w:proofErr w:type="spellStart"/>
+      <w:r>
+        <w:rPr>
+          <w:lang w:val="en-US"/>
+        </w:rPr>
+        <w:t>MaxDailyTurnover</w:t>
+      </w:r>
+      <w:proofErr w:type="spellEnd"/>
+    </w:p>
+    <w:p>
+      <w:pPr>
+        <w:pStyle w:val="ListParagraph"/>
+        <w:numPr>
+          <w:ilvl w:val="1"/>
+          <w:numId w:val="4"/>
+        </w:numPr>
+        <w:rPr>
+          <w:lang w:val="en-US"/>
+        </w:rPr>
+      </w:pPr>
+      <w:proofErr w:type="spellStart"/>
+      <w:r>
+        <w:rPr>
+          <w:lang w:val="en-US"/>
+        </w:rPr>
+        <w:t>MaxDailyExposure</w:t>
+      </w:r>
+      <w:proofErr w:type="spellEnd"/>
+    </w:p>
+    <w:p>
+      <w:pPr>
+        <w:pStyle w:val="ListParagraph"/>
+        <w:numPr>
+          <w:ilvl w:val="1"/>
+          <w:numId w:val="4"/>
+        </w:numPr>
+        <w:rPr>
+          <w:lang w:val="en-US"/>
+        </w:rPr>
+      </w:pPr>
+      <w:proofErr w:type="spellStart"/>
+      <w:r>
+        <w:rPr>
+          <w:lang w:val="en-US"/>
+        </w:rPr>
+        <w:t>MaxDailyOpenValue</w:t>
+      </w:r>
+      <w:proofErr w:type="spellEnd"/>
+    </w:p>
+    <w:p>
+      <w:pPr>
+        <w:pStyle w:val="ListParagraph"/>
+        <w:numPr>
+          <w:ilvl w:val="1"/>
+          <w:numId w:val="4"/>
+        </w:numPr>
+        <w:rPr>
+          <w:lang w:val="en-US"/>
+        </w:rPr>
+      </w:pPr>
+      <w:proofErr w:type="spellStart"/>
+      <w:r>
+        <w:rPr>
+          <w:lang w:val="en-US"/>
+        </w:rPr>
+        <w:t>MaxDailyActiveOrders</w:t>
+      </w:r>
+      <w:proofErr w:type="spellEnd"/>
+    </w:p>
+    <w:p>
+      <w:pPr>
+        <w:pStyle w:val="ListParagraph"/>
+        <w:numPr>
+          <w:ilvl w:val="0"/>
+          <w:numId w:val="4"/>
+        </w:numPr>
+        <w:rPr>
+          <w:lang w:val="en-US"/>
+        </w:rPr>
+      </w:pPr>
+      <w:r>
+        <w:rPr>
+          <w:lang w:val="en-US"/>
+        </w:rPr>
+        <w:lastRenderedPageBreak/>
+        <w:t>Non position checks</w:t>
+      </w:r>
+    </w:p>
+    <w:p>
+      <w:pPr>
+        <w:pStyle w:val="ListParagraph"/>
+        <w:numPr>
+          <w:ilvl w:val="1"/>
+          <w:numId w:val="4"/>
+        </w:numPr>
+        <w:rPr>
+          <w:lang w:val="en-US"/>
+        </w:rPr>
+      </w:pPr>
+      <w:proofErr w:type="spellStart"/>
+      <w:r>
+        <w:rPr>
+          <w:lang w:val="en-US"/>
+        </w:rPr>
+        <w:t>DuplicateOrders</w:t>
+      </w:r>
+      <w:proofErr w:type="spellEnd"/>
+    </w:p>
+    <w:p>
+      <w:pPr>
+        <w:pStyle w:val="ListParagraph"/>
+        <w:numPr>
+          <w:ilvl w:val="1"/>
+          <w:numId w:val="4"/>
+        </w:numPr>
+        <w:rPr>
+          <w:lang w:val="en-US"/>
+        </w:rPr>
+      </w:pPr>
+      <w:proofErr w:type="spellStart"/>
+      <w:r>
+        <w:rPr>
+          <w:lang w:val="en-US"/>
+        </w:rPr>
+        <w:t>BurstOrders</w:t>
+      </w:r>
+      <w:proofErr w:type="spellEnd"/>
     </w:p>
     <w:p>
       <w:pPr>
@@ -1374,7 +1842,6 @@
               <w:rPr>
                 <w:lang w:val="en-US"/>
               </w:rPr>
-              <w:lastRenderedPageBreak/>
               <w:t>Control Name</w:t>
             </w:r>
           </w:p>
@@ -1393,13 +1860,7 @@
               <w:rPr>
                 <w:lang w:val="en-US"/>
               </w:rPr>
-              <w:t xml:space="preserve">Max Order </w:t>
-            </w:r>
-            <w:r>
-              <w:rPr>
-                <w:lang w:val="en-US"/>
-              </w:rPr>
-              <w:t>Consideration</w:t>
+              <w:t>Max Order Consideration</w:t>
             </w:r>
           </w:p>
         </w:tc>
@@ -1437,19 +1898,7 @@
               <w:rPr>
                 <w:lang w:val="en-US"/>
               </w:rPr>
-              <w:t xml:space="preserve">Allows order </w:t>
-            </w:r>
-            <w:r>
-              <w:rPr>
-                <w:lang w:val="en-US"/>
-              </w:rPr>
-              <w:t>value</w:t>
-            </w:r>
-            <w:r>
-              <w:rPr>
-                <w:lang w:val="en-US"/>
-              </w:rPr>
-              <w:t xml:space="preserve"> till configured limit size</w:t>
+              <w:t>Allows order value till configured limit size</w:t>
             </w:r>
           </w:p>
         </w:tc>
@@ -1499,19 +1948,7 @@
               <w:rPr>
                 <w:lang w:val="en-US"/>
               </w:rPr>
-              <w:t>, order</w:t>
-            </w:r>
-            <w:r>
-              <w:rPr>
-                <w:lang w:val="en-US"/>
-              </w:rPr>
-              <w:t xml:space="preserve"> value</w:t>
-            </w:r>
-            <w:r>
-              <w:rPr>
-                <w:lang w:val="en-US"/>
-              </w:rPr>
-              <w:t xml:space="preserve"> </w:t>
+              <w:t xml:space="preserve">, order value </w:t>
             </w:r>
             <w:proofErr w:type="gramStart"/>
             <w:r>
@@ -1537,19 +1974,7 @@
               <w:rPr>
                 <w:lang w:val="en-US"/>
               </w:rPr>
-              <w:t xml:space="preserve">, any order with </w:t>
-            </w:r>
-            <w:r>
-              <w:rPr>
-                <w:lang w:val="en-US"/>
-              </w:rPr>
-              <w:t>Value</w:t>
-            </w:r>
-            <w:r>
-              <w:rPr>
-                <w:lang w:val="en-US"/>
-              </w:rPr>
-              <w:t xml:space="preserve"> &gt;= 1000</w:t>
+              <w:t>, any order with Value &gt;= 1000</w:t>
             </w:r>
             <w:r>
               <w:rPr>
@@ -1658,6 +2083,7 @@
               <w:rPr>
                 <w:lang w:val="en-US"/>
               </w:rPr>
+              <w:lastRenderedPageBreak/>
               <w:br/>
               <w:t xml:space="preserve">ORD is order </w:t>
             </w:r>
@@ -1717,6 +2143,7 @@
               <w:rPr>
                 <w:lang w:val="en-US"/>
               </w:rPr>
+              <w:lastRenderedPageBreak/>
               <w:t>Rejection message</w:t>
             </w:r>
           </w:p>
@@ -1904,19 +2331,7 @@
               <w:rPr>
                 <w:lang w:val="en-US"/>
               </w:rPr>
-              <w:t xml:space="preserve">If LMT is 1000 </w:t>
-            </w:r>
-            <w:r>
-              <w:rPr>
-                <w:lang w:val="en-US"/>
-              </w:rPr>
-              <w:t>HKD</w:t>
-            </w:r>
-            <w:r>
-              <w:rPr>
-                <w:lang w:val="en-US"/>
-              </w:rPr>
-              <w:t xml:space="preserve"> and order price is 100 HKD for 10 quantity, order value should be calculated as below.</w:t>
+              <w:t>If LMT is 1000 HKD and order price is 100 HKD for 10 quantity, order value should be calculated as below.</w:t>
             </w:r>
           </w:p>
           <w:p>
@@ -1997,43 +2412,7 @@
               <w:rPr>
                 <w:lang w:val="en-US"/>
               </w:rPr>
-              <w:t xml:space="preserve">ORD: 10 * 100 * </w:t>
-            </w:r>
-            <w:r>
-              <w:rPr>
-                <w:lang w:val="en-US"/>
-              </w:rPr>
-              <w:t>1 (as LMT currency is same as Order currency)</w:t>
-            </w:r>
-            <w:r>
-              <w:rPr>
-                <w:lang w:val="en-US"/>
-              </w:rPr>
-              <w:t xml:space="preserve"> = 1</w:t>
-            </w:r>
-            <w:r>
-              <w:rPr>
-                <w:lang w:val="en-US"/>
-              </w:rPr>
-              <w:t>00</w:t>
-            </w:r>
-            <w:r>
-              <w:rPr>
-                <w:lang w:val="en-US"/>
-              </w:rPr>
-              <w:t xml:space="preserve">0 </w:t>
-            </w:r>
-            <w:r>
-              <w:rPr>
-                <w:lang w:val="en-US"/>
-              </w:rPr>
-              <w:t>HK</w:t>
-            </w:r>
-            <w:r>
-              <w:rPr>
-                <w:lang w:val="en-US"/>
-              </w:rPr>
-              <w:t>D</w:t>
+              <w:t>ORD: 10 * 100 * 1 (as LMT currency is same as Order currency) = 1000 HKD</w:t>
             </w:r>
           </w:p>
         </w:tc>
@@ -2142,6 +2521,119 @@
     </w:lvl>
   </w:abstractNum>
   <w:abstractNum w:abstractNumId="1" w15:restartNumberingAfterBreak="0">
+    <w:nsid w:val="26524EB4"/>
+    <w:multiLevelType w:val="hybridMultilevel"/>
+    <w:tmpl w:val="4064890A"/>
+    <w:lvl w:ilvl="0" w:tplc="40090001">
+      <w:start w:val="1"/>
+      <w:numFmt w:val="bullet"/>
+      <w:lvlText w:val=""/>
+      <w:lvlJc w:val="left"/>
+      <w:pPr>
+        <w:ind w:left="720" w:hanging="360"/>
+      </w:pPr>
+      <w:rPr>
+        <w:rFonts w:ascii="Symbol" w:hAnsi="Symbol" w:hint="default"/>
+      </w:rPr>
+    </w:lvl>
+    <w:lvl w:ilvl="1" w:tplc="40090003">
+      <w:start w:val="1"/>
+      <w:numFmt w:val="bullet"/>
+      <w:lvlText w:val="o"/>
+      <w:lvlJc w:val="left"/>
+      <w:pPr>
+        <w:ind w:left="1440" w:hanging="360"/>
+      </w:pPr>
+      <w:rPr>
+        <w:rFonts w:ascii="Courier New" w:hAnsi="Courier New" w:cs="Courier New" w:hint="default"/>
+      </w:rPr>
+    </w:lvl>
+    <w:lvl w:ilvl="2" w:tplc="40090005" w:tentative="1">
+      <w:start w:val="1"/>
+      <w:numFmt w:val="bullet"/>
+      <w:lvlText w:val=""/>
+      <w:lvlJc w:val="left"/>
+      <w:pPr>
+        <w:ind w:left="2160" w:hanging="360"/>
+      </w:pPr>
+      <w:rPr>
+        <w:rFonts w:ascii="Wingdings" w:hAnsi="Wingdings" w:hint="default"/>
+      </w:rPr>
+    </w:lvl>
+    <w:lvl w:ilvl="3" w:tplc="40090001" w:tentative="1">
+      <w:start w:val="1"/>
+      <w:numFmt w:val="bullet"/>
+      <w:lvlText w:val=""/>
+      <w:lvlJc w:val="left"/>
+      <w:pPr>
+        <w:ind w:left="2880" w:hanging="360"/>
+      </w:pPr>
+      <w:rPr>
+        <w:rFonts w:ascii="Symbol" w:hAnsi="Symbol" w:hint="default"/>
+      </w:rPr>
+    </w:lvl>
+    <w:lvl w:ilvl="4" w:tplc="40090003" w:tentative="1">
+      <w:start w:val="1"/>
+      <w:numFmt w:val="bullet"/>
+      <w:lvlText w:val="o"/>
+      <w:lvlJc w:val="left"/>
+      <w:pPr>
+        <w:ind w:left="3600" w:hanging="360"/>
+      </w:pPr>
+      <w:rPr>
+        <w:rFonts w:ascii="Courier New" w:hAnsi="Courier New" w:cs="Courier New" w:hint="default"/>
+      </w:rPr>
+    </w:lvl>
+    <w:lvl w:ilvl="5" w:tplc="40090005" w:tentative="1">
+      <w:start w:val="1"/>
+      <w:numFmt w:val="bullet"/>
+      <w:lvlText w:val=""/>
+      <w:lvlJc w:val="left"/>
+      <w:pPr>
+        <w:ind w:left="4320" w:hanging="360"/>
+      </w:pPr>
+      <w:rPr>
+        <w:rFonts w:ascii="Wingdings" w:hAnsi="Wingdings" w:hint="default"/>
+      </w:rPr>
+    </w:lvl>
+    <w:lvl w:ilvl="6" w:tplc="40090001" w:tentative="1">
+      <w:start w:val="1"/>
+      <w:numFmt w:val="bullet"/>
+      <w:lvlText w:val=""/>
+      <w:lvlJc w:val="left"/>
+      <w:pPr>
+        <w:ind w:left="5040" w:hanging="360"/>
+      </w:pPr>
+      <w:rPr>
+        <w:rFonts w:ascii="Symbol" w:hAnsi="Symbol" w:hint="default"/>
+      </w:rPr>
+    </w:lvl>
+    <w:lvl w:ilvl="7" w:tplc="40090003" w:tentative="1">
+      <w:start w:val="1"/>
+      <w:numFmt w:val="bullet"/>
+      <w:lvlText w:val="o"/>
+      <w:lvlJc w:val="left"/>
+      <w:pPr>
+        <w:ind w:left="5760" w:hanging="360"/>
+      </w:pPr>
+      <w:rPr>
+        <w:rFonts w:ascii="Courier New" w:hAnsi="Courier New" w:cs="Courier New" w:hint="default"/>
+      </w:rPr>
+    </w:lvl>
+    <w:lvl w:ilvl="8" w:tplc="40090005" w:tentative="1">
+      <w:start w:val="1"/>
+      <w:numFmt w:val="bullet"/>
+      <w:lvlText w:val=""/>
+      <w:lvlJc w:val="left"/>
+      <w:pPr>
+        <w:ind w:left="6480" w:hanging="360"/>
+      </w:pPr>
+      <w:rPr>
+        <w:rFonts w:ascii="Wingdings" w:hAnsi="Wingdings" w:hint="default"/>
+      </w:rPr>
+    </w:lvl>
+  </w:abstractNum>
+  <w:abstractNum w:abstractNumId="2" w15:restartNumberingAfterBreak="0">
     <w:nsid w:val="348C0F96"/>
     <w:multiLevelType w:val="hybridMultilevel"/>
     <w:tmpl w:val="CEAC334A"/>
@@ -2230,11 +2722,130 @@
       </w:pPr>
     </w:lvl>
   </w:abstractNum>
+  <w:abstractNum w:abstractNumId="3" w15:restartNumberingAfterBreak="0">
+    <w:nsid w:val="5D0F49FF"/>
+    <w:multiLevelType w:val="hybridMultilevel"/>
+    <w:tmpl w:val="7EB6839C"/>
+    <w:lvl w:ilvl="0" w:tplc="40090001">
+      <w:start w:val="1"/>
+      <w:numFmt w:val="bullet"/>
+      <w:lvlText w:val=""/>
+      <w:lvlJc w:val="left"/>
+      <w:pPr>
+        <w:ind w:left="720" w:hanging="360"/>
+      </w:pPr>
+      <w:rPr>
+        <w:rFonts w:ascii="Symbol" w:hAnsi="Symbol" w:hint="default"/>
+      </w:rPr>
+    </w:lvl>
+    <w:lvl w:ilvl="1" w:tplc="40090003">
+      <w:start w:val="1"/>
+      <w:numFmt w:val="bullet"/>
+      <w:lvlText w:val="o"/>
+      <w:lvlJc w:val="left"/>
+      <w:pPr>
+        <w:ind w:left="1440" w:hanging="360"/>
+      </w:pPr>
+      <w:rPr>
+        <w:rFonts w:ascii="Courier New" w:hAnsi="Courier New" w:cs="Courier New" w:hint="default"/>
+      </w:rPr>
+    </w:lvl>
+    <w:lvl w:ilvl="2" w:tplc="40090005" w:tentative="1">
+      <w:start w:val="1"/>
+      <w:numFmt w:val="bullet"/>
+      <w:lvlText w:val=""/>
+      <w:lvlJc w:val="left"/>
+      <w:pPr>
+        <w:ind w:left="2160" w:hanging="360"/>
+      </w:pPr>
+      <w:rPr>
+        <w:rFonts w:ascii="Wingdings" w:hAnsi="Wingdings" w:hint="default"/>
+      </w:rPr>
+    </w:lvl>
+    <w:lvl w:ilvl="3" w:tplc="40090001" w:tentative="1">
+      <w:start w:val="1"/>
+      <w:numFmt w:val="bullet"/>
+      <w:lvlText w:val=""/>
+      <w:lvlJc w:val="left"/>
+      <w:pPr>
+        <w:ind w:left="2880" w:hanging="360"/>
+      </w:pPr>
+      <w:rPr>
+        <w:rFonts w:ascii="Symbol" w:hAnsi="Symbol" w:hint="default"/>
+      </w:rPr>
+    </w:lvl>
+    <w:lvl w:ilvl="4" w:tplc="40090003" w:tentative="1">
+      <w:start w:val="1"/>
+      <w:numFmt w:val="bullet"/>
+      <w:lvlText w:val="o"/>
+      <w:lvlJc w:val="left"/>
+      <w:pPr>
+        <w:ind w:left="3600" w:hanging="360"/>
+      </w:pPr>
+      <w:rPr>
+        <w:rFonts w:ascii="Courier New" w:hAnsi="Courier New" w:cs="Courier New" w:hint="default"/>
+      </w:rPr>
+    </w:lvl>
+    <w:lvl w:ilvl="5" w:tplc="40090005" w:tentative="1">
+      <w:start w:val="1"/>
+      <w:numFmt w:val="bullet"/>
+      <w:lvlText w:val=""/>
+      <w:lvlJc w:val="left"/>
+      <w:pPr>
+        <w:ind w:left="4320" w:hanging="360"/>
+      </w:pPr>
+      <w:rPr>
+        <w:rFonts w:ascii="Wingdings" w:hAnsi="Wingdings" w:hint="default"/>
+      </w:rPr>
+    </w:lvl>
+    <w:lvl w:ilvl="6" w:tplc="40090001" w:tentative="1">
+      <w:start w:val="1"/>
+      <w:numFmt w:val="bullet"/>
+      <w:lvlText w:val=""/>
+      <w:lvlJc w:val="left"/>
+      <w:pPr>
+        <w:ind w:left="5040" w:hanging="360"/>
+      </w:pPr>
+      <w:rPr>
+        <w:rFonts w:ascii="Symbol" w:hAnsi="Symbol" w:hint="default"/>
+      </w:rPr>
+    </w:lvl>
+    <w:lvl w:ilvl="7" w:tplc="40090003" w:tentative="1">
+      <w:start w:val="1"/>
+      <w:numFmt w:val="bullet"/>
+      <w:lvlText w:val="o"/>
+      <w:lvlJc w:val="left"/>
+      <w:pPr>
+        <w:ind w:left="5760" w:hanging="360"/>
+      </w:pPr>
+      <w:rPr>
+        <w:rFonts w:ascii="Courier New" w:hAnsi="Courier New" w:cs="Courier New" w:hint="default"/>
+      </w:rPr>
+    </w:lvl>
+    <w:lvl w:ilvl="8" w:tplc="40090005" w:tentative="1">
+      <w:start w:val="1"/>
+      <w:numFmt w:val="bullet"/>
+      <w:lvlText w:val=""/>
+      <w:lvlJc w:val="left"/>
+      <w:pPr>
+        <w:ind w:left="6480" w:hanging="360"/>
+      </w:pPr>
+      <w:rPr>
+        <w:rFonts w:ascii="Wingdings" w:hAnsi="Wingdings" w:hint="default"/>
+      </w:rPr>
+    </w:lvl>
+  </w:abstractNum>
   <w:num w:numId="1" w16cid:durableId="474683635">
-    <w:abstractNumId w:val="1"/>
+    <w:abstractNumId w:val="2"/>
   </w:num>
   <w:num w:numId="2" w16cid:durableId="620722203">
     <w:abstractNumId w:val="0"/>
+  </w:num>
+  <w:num w:numId="3" w16cid:durableId="142815744">
+    <w:abstractNumId w:val="3"/>
+  </w:num>
+  <w:num w:numId="4" w16cid:durableId="1885024850">
+    <w:abstractNumId w:val="1"/>
   </w:num>
 </w:numbering>
 </file>

</xml_diff>

<commit_message>
feat: implement core DataMgr infrastructure for instrument static data and RMS control limits management
</commit_message>
<xml_diff>
--- a/Requirements/RMS.docx
+++ b/Requirements/RMS.docx
@@ -12,21 +12,7 @@
         <w:rPr>
           <w:lang w:val="en-US"/>
         </w:rPr>
-        <w:t xml:space="preserve">Generate plan for </w:t>
-      </w:r>
-      <w:proofErr w:type="gramStart"/>
-      <w:r>
-        <w:rPr>
-          <w:lang w:val="en-US"/>
-        </w:rPr>
-        <w:t>python based</w:t>
-      </w:r>
-      <w:proofErr w:type="gramEnd"/>
-      <w:r>
-        <w:rPr>
-          <w:lang w:val="en-US"/>
-        </w:rPr>
-        <w:t xml:space="preserve"> RMS (Risk management System) </w:t>
+        <w:t xml:space="preserve">Generate plan for python based RMS (Risk management System) </w:t>
       </w:r>
       <w:r>
         <w:rPr>
@@ -678,21 +664,7 @@
         <w:rPr>
           <w:lang w:val="en-US"/>
         </w:rPr>
-        <w:t>$timestamp = HH:</w:t>
-      </w:r>
-      <w:proofErr w:type="gramStart"/>
-      <w:r>
-        <w:rPr>
-          <w:lang w:val="en-US"/>
-        </w:rPr>
-        <w:t>MM:SS.</w:t>
-      </w:r>
-      <w:proofErr w:type="gramEnd"/>
-      <w:r>
-        <w:rPr>
-          <w:lang w:val="en-US"/>
-        </w:rPr>
-        <w:t>123456789 (time in nano seconds)</w:t>
+        <w:t>$timestamp = HH:MM:SS.123456789 (time in nano seconds)</w:t>
       </w:r>
     </w:p>
     <w:p>
@@ -886,21 +858,7 @@
         <w:rPr>
           <w:lang w:val="en-US"/>
         </w:rPr>
-        <w:t xml:space="preserve"> = time taken to do limit </w:t>
-      </w:r>
-      <w:proofErr w:type="gramStart"/>
-      <w:r>
-        <w:rPr>
-          <w:lang w:val="en-US"/>
-        </w:rPr>
-        <w:t>checking  (</w:t>
-      </w:r>
-      <w:proofErr w:type="gramEnd"/>
-      <w:r>
-        <w:rPr>
-          <w:lang w:val="en-US"/>
-        </w:rPr>
-        <w:t>End of limit checking - Start of limit checking)</w:t>
+        <w:t xml:space="preserve"> = time taken to do limit checking  (End of limit checking - Start of limit checking)</w:t>
       </w:r>
     </w:p>
     <w:p>
@@ -982,6 +940,12 @@
         <w:t>MaxOrderSize</w:t>
       </w:r>
       <w:proofErr w:type="spellEnd"/>
+      <w:r>
+        <w:rPr>
+          <w:lang w:val="en-US"/>
+        </w:rPr>
+        <w:t xml:space="preserve"> (implemented)</w:t>
+      </w:r>
     </w:p>
     <w:p>
       <w:pPr>
@@ -1002,6 +966,12 @@
         <w:t>MaxOrderPrice</w:t>
       </w:r>
       <w:proofErr w:type="spellEnd"/>
+      <w:r>
+        <w:rPr>
+          <w:lang w:val="en-US"/>
+        </w:rPr>
+        <w:t xml:space="preserve">  (implemented)</w:t>
+      </w:r>
     </w:p>
     <w:p>
       <w:pPr>
@@ -1022,6 +992,12 @@
         <w:t>MaxOrderValue</w:t>
       </w:r>
       <w:proofErr w:type="spellEnd"/>
+      <w:r>
+        <w:rPr>
+          <w:lang w:val="en-US"/>
+        </w:rPr>
+        <w:t xml:space="preserve">  (implemented)</w:t>
+      </w:r>
     </w:p>
     <w:p>
       <w:pPr>
@@ -1507,16 +1483,35 @@
             <w:tcW w:w="6894" w:type="dxa"/>
           </w:tcPr>
           <w:p>
-            <w:pPr>
-              <w:rPr>
-                <w:lang w:val="en-US"/>
-              </w:rPr>
-            </w:pPr>
             <w:r>
               <w:rPr>
                 <w:lang w:val="en-US"/>
               </w:rPr>
               <w:t>If Limit / LMT is 1000, orders are allowed till 1000, any order with size &gt;= 1000 will be rejected.</w:t>
+            </w:r>
+            <w:r>
+              <w:rPr>
+                <w:lang w:val="en-US"/>
+              </w:rPr>
+              <w:br/>
+            </w:r>
+            <w:r>
+              <w:rPr>
+                <w:lang w:val="en-US"/>
+              </w:rPr>
+              <w:br/>
+              <w:t xml:space="preserve">LMT should be taken from </w:t>
+            </w:r>
+            <w:proofErr w:type="spellStart"/>
+            <w:r>
+              <w:t>MaxOrderSize</w:t>
+            </w:r>
+            <w:proofErr w:type="spellEnd"/>
+            <w:r>
+              <w:rPr>
+                <w:lang w:val="en-US"/>
+              </w:rPr>
+              <w:t xml:space="preserve"> in RMS limits</w:t>
             </w:r>
             <w:r>
               <w:rPr>
@@ -1721,6 +1716,38 @@
               </w:rPr>
               <w:t>If Limit / LMT is 1000, orders are allowed till 1000, any order with price &gt;= 1000 will be rejected.</w:t>
             </w:r>
+          </w:p>
+          <w:p>
+            <w:pPr>
+              <w:rPr>
+                <w:lang w:val="en-US"/>
+              </w:rPr>
+            </w:pPr>
+          </w:p>
+          <w:p>
+            <w:r>
+              <w:rPr>
+                <w:lang w:val="en-US"/>
+              </w:rPr>
+              <w:t>LMT should be taken from</w:t>
+            </w:r>
+            <w:r>
+              <w:rPr>
+                <w:lang w:val="en-US"/>
+              </w:rPr>
+              <w:t xml:space="preserve"> </w:t>
+            </w:r>
+            <w:proofErr w:type="spellStart"/>
+            <w:r>
+              <w:t>MaxOrderPrice</w:t>
+            </w:r>
+            <w:proofErr w:type="spellEnd"/>
+            <w:r>
+              <w:rPr>
+                <w:lang w:val="en-US"/>
+              </w:rPr>
+              <w:t xml:space="preserve"> in RMS limits</w:t>
+            </w:r>
             <w:r>
               <w:rPr>
                 <w:lang w:val="en-US"/>
@@ -1948,21 +1975,7 @@
               <w:rPr>
                 <w:lang w:val="en-US"/>
               </w:rPr>
-              <w:t xml:space="preserve">, order value </w:t>
-            </w:r>
-            <w:proofErr w:type="gramStart"/>
-            <w:r>
-              <w:rPr>
-                <w:lang w:val="en-US"/>
-              </w:rPr>
-              <w:t>are</w:t>
-            </w:r>
-            <w:proofErr w:type="gramEnd"/>
-            <w:r>
-              <w:rPr>
-                <w:lang w:val="en-US"/>
-              </w:rPr>
-              <w:t xml:space="preserve"> allowed till 1000</w:t>
+              <w:t>, order value are allowed till 1000</w:t>
             </w:r>
             <w:r>
               <w:rPr>
@@ -1997,6 +2010,35 @@
             </w:pPr>
           </w:p>
           <w:p>
+            <w:r>
+              <w:rPr>
+                <w:lang w:val="en-US"/>
+              </w:rPr>
+              <w:t xml:space="preserve">LMT should be taken from </w:t>
+            </w:r>
+            <w:proofErr w:type="spellStart"/>
+            <w:r>
+              <w:t>MaxOrderValue</w:t>
+            </w:r>
+            <w:proofErr w:type="spellEnd"/>
+            <w:r>
+              <w:t xml:space="preserve"> </w:t>
+            </w:r>
+            <w:r>
+              <w:rPr>
+                <w:lang w:val="en-US"/>
+              </w:rPr>
+              <w:t>in RMS limits</w:t>
+            </w:r>
+          </w:p>
+          <w:p>
+            <w:pPr>
+              <w:rPr>
+                <w:lang w:val="en-US"/>
+              </w:rPr>
+            </w:pPr>
+          </w:p>
+          <w:p>
             <w:pPr>
               <w:rPr>
                 <w:lang w:val="en-US"/>
@@ -2070,11 +2112,646 @@
               <w:rPr>
                 <w:lang w:val="en-US"/>
               </w:rPr>
-              <w:t>For Market orders, it is Bo/Ask for Buy side and Bb/Bid for Sell Side orders, in absence of Ask/Bid prices, it should fallback to last and then fallback to open and should use close price if all other prices are unavailable.</w:t>
-            </w:r>
-          </w:p>
-          <w:p>
-            <w:pPr>
+              <w:lastRenderedPageBreak/>
+              <w:t xml:space="preserve">For Market orders, it is Bo/Ask for Buy side and Bb/Bid for Sell Side orders, in absence of Ask/Bid prices, it should </w:t>
+            </w:r>
+            <w:proofErr w:type="spellStart"/>
+            <w:r>
+              <w:rPr>
+                <w:lang w:val="en-US"/>
+              </w:rPr>
+              <w:t>fallback</w:t>
+            </w:r>
+            <w:proofErr w:type="spellEnd"/>
+            <w:r>
+              <w:rPr>
+                <w:lang w:val="en-US"/>
+              </w:rPr>
+              <w:t xml:space="preserve"> to last and then fallback to open and should use close price if all other prices are unavailable.</w:t>
+            </w:r>
+          </w:p>
+          <w:p>
+            <w:pPr>
+              <w:rPr>
+                <w:lang w:val="en-US"/>
+              </w:rPr>
+            </w:pPr>
+            <w:r>
+              <w:rPr>
+                <w:lang w:val="en-US"/>
+              </w:rPr>
+              <w:br/>
+              <w:t xml:space="preserve">ORD is order </w:t>
+            </w:r>
+            <w:r>
+              <w:rPr>
+                <w:lang w:val="en-US"/>
+              </w:rPr>
+              <w:t>value</w:t>
+            </w:r>
+            <w:r>
+              <w:rPr>
+                <w:lang w:val="en-US"/>
+              </w:rPr>
+              <w:t xml:space="preserve">, LMT is limit </w:t>
+            </w:r>
+            <w:r>
+              <w:rPr>
+                <w:lang w:val="en-US"/>
+              </w:rPr>
+              <w:t>value</w:t>
+            </w:r>
+            <w:r>
+              <w:rPr>
+                <w:lang w:val="en-US"/>
+              </w:rPr>
+              <w:br/>
+              <w:t>Pass: ORD =&lt; LMT</w:t>
+            </w:r>
+          </w:p>
+          <w:p>
+            <w:pPr>
+              <w:rPr>
+                <w:lang w:val="en-US"/>
+              </w:rPr>
+            </w:pPr>
+            <w:r>
+              <w:rPr>
+                <w:lang w:val="en-US"/>
+              </w:rPr>
+              <w:t>Fail: ORD &gt; LMT</w:t>
+            </w:r>
+          </w:p>
+        </w:tc>
+      </w:tr>
+      <w:tr>
+        <w:tc>
+          <w:tcPr>
+            <w:tcW w:w="2122" w:type="dxa"/>
+          </w:tcPr>
+          <w:p>
+            <w:pPr>
+              <w:rPr>
+                <w:lang w:val="en-US"/>
+              </w:rPr>
+            </w:pPr>
+            <w:r>
+              <w:rPr>
+                <w:lang w:val="en-US"/>
+              </w:rPr>
+              <w:lastRenderedPageBreak/>
+              <w:t>Rejection message</w:t>
+            </w:r>
+          </w:p>
+        </w:tc>
+        <w:tc>
+          <w:tcPr>
+            <w:tcW w:w="6894" w:type="dxa"/>
+          </w:tcPr>
+          <w:p>
+            <w:pPr>
+              <w:rPr>
+                <w:lang w:val="en-US"/>
+              </w:rPr>
+            </w:pPr>
+            <w:r>
+              <w:rPr>
+                <w:lang w:val="en-US"/>
+              </w:rPr>
+              <w:t xml:space="preserve">Order </w:t>
+            </w:r>
+            <w:r>
+              <w:rPr>
+                <w:lang w:val="en-US"/>
+              </w:rPr>
+              <w:t>Value</w:t>
+            </w:r>
+            <w:r>
+              <w:rPr>
+                <w:lang w:val="en-US"/>
+              </w:rPr>
+              <w:t xml:space="preserve"> is too big, LMT=$LMT, ORD=$ORD</w:t>
+            </w:r>
+          </w:p>
+        </w:tc>
+      </w:tr>
+      <w:tr>
+        <w:tc>
+          <w:tcPr>
+            <w:tcW w:w="2122" w:type="dxa"/>
+          </w:tcPr>
+          <w:p>
+            <w:pPr>
+              <w:rPr>
+                <w:lang w:val="en-US"/>
+              </w:rPr>
+            </w:pPr>
+            <w:r>
+              <w:rPr>
+                <w:lang w:val="en-US"/>
+              </w:rPr>
+              <w:t>Example1</w:t>
+            </w:r>
+          </w:p>
+        </w:tc>
+        <w:tc>
+          <w:tcPr>
+            <w:tcW w:w="6894" w:type="dxa"/>
+          </w:tcPr>
+          <w:p>
+            <w:pPr>
+              <w:rPr>
+                <w:lang w:val="en-US"/>
+              </w:rPr>
+            </w:pPr>
+            <w:r>
+              <w:rPr>
+                <w:lang w:val="en-US"/>
+              </w:rPr>
+              <w:t>If LMT is 1000 USD and order price is 100 HKD for 10 quantity, order value should be calculated as below.</w:t>
+            </w:r>
+          </w:p>
+          <w:p>
+            <w:pPr>
+              <w:rPr>
+                <w:lang w:val="en-US"/>
+              </w:rPr>
+            </w:pPr>
+            <w:r>
+              <w:rPr>
+                <w:lang w:val="en-US"/>
+              </w:rPr>
+              <w:t xml:space="preserve">If </w:t>
+            </w:r>
+            <w:proofErr w:type="spellStart"/>
+            <w:r>
+              <w:rPr>
+                <w:lang w:val="en-US"/>
+              </w:rPr>
+              <w:t>xr</w:t>
+            </w:r>
+            <w:proofErr w:type="spellEnd"/>
+            <w:r>
+              <w:rPr>
+                <w:lang w:val="en-US"/>
+              </w:rPr>
+              <w:t xml:space="preserve"> rate is 0.13 (to be get from </w:t>
+            </w:r>
+            <w:proofErr w:type="spellStart"/>
+            <w:r>
+              <w:rPr>
+                <w:lang w:val="en-US"/>
+              </w:rPr>
+              <w:t>yfinance</w:t>
+            </w:r>
+            <w:proofErr w:type="spellEnd"/>
+            <w:r>
+              <w:rPr>
+                <w:lang w:val="en-US"/>
+              </w:rPr>
+              <w:t xml:space="preserve"> as HKD=X as ticker to get </w:t>
+            </w:r>
+            <w:proofErr w:type="spellStart"/>
+            <w:r>
+              <w:rPr>
+                <w:lang w:val="en-US"/>
+              </w:rPr>
+              <w:t>fx</w:t>
+            </w:r>
+            <w:proofErr w:type="spellEnd"/>
+            <w:r>
+              <w:rPr>
+                <w:lang w:val="en-US"/>
+              </w:rPr>
+              <w:t xml:space="preserve"> price)</w:t>
+            </w:r>
+          </w:p>
+          <w:p>
+            <w:pPr>
+              <w:rPr>
+                <w:lang w:val="en-US"/>
+              </w:rPr>
+            </w:pPr>
+            <w:r>
+              <w:rPr>
+                <w:lang w:val="en-US"/>
+              </w:rPr>
+              <w:t>LMT: 1000 USD</w:t>
+            </w:r>
+          </w:p>
+          <w:p>
+            <w:pPr>
+              <w:rPr>
+                <w:lang w:val="en-US"/>
+              </w:rPr>
+            </w:pPr>
+            <w:r>
+              <w:rPr>
+                <w:lang w:val="en-US"/>
+              </w:rPr>
+              <w:t>ORD: 10 * 100 * 0.13 = 130 USD</w:t>
+            </w:r>
+          </w:p>
+        </w:tc>
+      </w:tr>
+      <w:tr>
+        <w:tc>
+          <w:tcPr>
+            <w:tcW w:w="2122" w:type="dxa"/>
+          </w:tcPr>
+          <w:p>
+            <w:pPr>
+              <w:rPr>
+                <w:lang w:val="en-US"/>
+              </w:rPr>
+            </w:pPr>
+            <w:r>
+              <w:rPr>
+                <w:lang w:val="en-US"/>
+              </w:rPr>
+              <w:t>Example2</w:t>
+            </w:r>
+          </w:p>
+        </w:tc>
+        <w:tc>
+          <w:tcPr>
+            <w:tcW w:w="6894" w:type="dxa"/>
+          </w:tcPr>
+          <w:p>
+            <w:pPr>
+              <w:rPr>
+                <w:lang w:val="en-US"/>
+              </w:rPr>
+            </w:pPr>
+            <w:r>
+              <w:rPr>
+                <w:lang w:val="en-US"/>
+              </w:rPr>
+              <w:t>If LMT is 1000 HKD and order price is 100 HKD for 10 quantity, order value should be calculated as below.</w:t>
+            </w:r>
+          </w:p>
+          <w:p>
+            <w:pPr>
+              <w:rPr>
+                <w:lang w:val="en-US"/>
+              </w:rPr>
+            </w:pPr>
+            <w:r>
+              <w:rPr>
+                <w:lang w:val="en-US"/>
+              </w:rPr>
+              <w:t xml:space="preserve">If </w:t>
+            </w:r>
+            <w:proofErr w:type="spellStart"/>
+            <w:r>
+              <w:rPr>
+                <w:lang w:val="en-US"/>
+              </w:rPr>
+              <w:t>xr</w:t>
+            </w:r>
+            <w:proofErr w:type="spellEnd"/>
+            <w:r>
+              <w:rPr>
+                <w:lang w:val="en-US"/>
+              </w:rPr>
+              <w:t xml:space="preserve"> rate is 0.13 (to be get from </w:t>
+            </w:r>
+            <w:proofErr w:type="spellStart"/>
+            <w:r>
+              <w:rPr>
+                <w:lang w:val="en-US"/>
+              </w:rPr>
+              <w:t>yfinance</w:t>
+            </w:r>
+            <w:proofErr w:type="spellEnd"/>
+            <w:r>
+              <w:rPr>
+                <w:lang w:val="en-US"/>
+              </w:rPr>
+              <w:t xml:space="preserve"> as HKD=X as ticker to get </w:t>
+            </w:r>
+            <w:proofErr w:type="spellStart"/>
+            <w:r>
+              <w:rPr>
+                <w:lang w:val="en-US"/>
+              </w:rPr>
+              <w:t>fx</w:t>
+            </w:r>
+            <w:proofErr w:type="spellEnd"/>
+            <w:r>
+              <w:rPr>
+                <w:lang w:val="en-US"/>
+              </w:rPr>
+              <w:t xml:space="preserve"> price)</w:t>
+            </w:r>
+          </w:p>
+          <w:p>
+            <w:pPr>
+              <w:rPr>
+                <w:lang w:val="en-US"/>
+              </w:rPr>
+            </w:pPr>
+            <w:r>
+              <w:rPr>
+                <w:lang w:val="en-US"/>
+              </w:rPr>
+              <w:t>LMT: 1000 USD</w:t>
+            </w:r>
+          </w:p>
+          <w:p>
+            <w:pPr>
+              <w:rPr>
+                <w:lang w:val="en-US"/>
+              </w:rPr>
+            </w:pPr>
+            <w:r>
+              <w:rPr>
+                <w:lang w:val="en-US"/>
+              </w:rPr>
+              <w:t>ORD: 10 * 100 * 1 (as LMT currency is same as Order currency) = 1000 HKD</w:t>
+            </w:r>
+          </w:p>
+        </w:tc>
+      </w:tr>
+    </w:tbl>
+    <w:p/>
+    <w:tbl>
+      <w:tblPr>
+        <w:tblStyle w:val="TableGrid"/>
+        <w:tblW w:w="0" w:type="auto"/>
+        <w:tblLook w:val="04A0" w:firstRow="1" w:lastRow="0" w:firstColumn="1" w:lastColumn="0" w:noHBand="0" w:noVBand="1"/>
+      </w:tblPr>
+      <w:tblGrid>
+        <w:gridCol w:w="2122"/>
+        <w:gridCol w:w="6894"/>
+      </w:tblGrid>
+      <w:tr>
+        <w:tc>
+          <w:tcPr>
+            <w:tcW w:w="2122" w:type="dxa"/>
+            <w:tcBorders>
+              <w:top w:val="single" w:sz="4" w:space="0" w:color="auto"/>
+              <w:left w:val="single" w:sz="4" w:space="0" w:color="auto"/>
+              <w:bottom w:val="single" w:sz="4" w:space="0" w:color="auto"/>
+              <w:right w:val="single" w:sz="4" w:space="0" w:color="auto"/>
+            </w:tcBorders>
+            <w:hideMark/>
+          </w:tcPr>
+          <w:p>
+            <w:pPr>
+              <w:spacing w:after="160" w:line="278" w:lineRule="auto"/>
+              <w:rPr>
+                <w:lang w:val="en-US"/>
+              </w:rPr>
+            </w:pPr>
+            <w:r>
+              <w:rPr>
+                <w:lang w:val="en-US"/>
+              </w:rPr>
+              <w:t>Control Name</w:t>
+            </w:r>
+          </w:p>
+        </w:tc>
+        <w:tc>
+          <w:tcPr>
+            <w:tcW w:w="6894" w:type="dxa"/>
+            <w:tcBorders>
+              <w:top w:val="single" w:sz="4" w:space="0" w:color="auto"/>
+              <w:left w:val="single" w:sz="4" w:space="0" w:color="auto"/>
+              <w:bottom w:val="single" w:sz="4" w:space="0" w:color="auto"/>
+              <w:right w:val="single" w:sz="4" w:space="0" w:color="auto"/>
+            </w:tcBorders>
+            <w:hideMark/>
+          </w:tcPr>
+          <w:p>
+            <w:pPr>
+              <w:spacing w:after="160" w:line="278" w:lineRule="auto"/>
+              <w:rPr>
+                <w:lang w:val="en-US"/>
+              </w:rPr>
+            </w:pPr>
+            <w:r>
+              <w:rPr>
+                <w:lang w:val="en-US"/>
+              </w:rPr>
+              <w:t>Close Price Tolerance (</w:t>
+            </w:r>
+            <w:proofErr w:type="spellStart"/>
+            <w:r>
+              <w:rPr>
+                <w:lang w:val="en-US"/>
+              </w:rPr>
+              <w:t>cpt</w:t>
+            </w:r>
+            <w:proofErr w:type="spellEnd"/>
+            <w:r>
+              <w:rPr>
+                <w:lang w:val="en-US"/>
+              </w:rPr>
+              <w:t>)</w:t>
+            </w:r>
+          </w:p>
+        </w:tc>
+      </w:tr>
+      <w:tr>
+        <w:tc>
+          <w:tcPr>
+            <w:tcW w:w="2122" w:type="dxa"/>
+            <w:tcBorders>
+              <w:top w:val="single" w:sz="4" w:space="0" w:color="auto"/>
+              <w:left w:val="single" w:sz="4" w:space="0" w:color="auto"/>
+              <w:bottom w:val="single" w:sz="4" w:space="0" w:color="auto"/>
+              <w:right w:val="single" w:sz="4" w:space="0" w:color="auto"/>
+            </w:tcBorders>
+            <w:hideMark/>
+          </w:tcPr>
+          <w:p>
+            <w:pPr>
+              <w:spacing w:after="160" w:line="278" w:lineRule="auto"/>
+              <w:rPr>
+                <w:lang w:val="en-US"/>
+              </w:rPr>
+            </w:pPr>
+            <w:r>
+              <w:rPr>
+                <w:lang w:val="en-US"/>
+              </w:rPr>
+              <w:t>Description</w:t>
+            </w:r>
+          </w:p>
+        </w:tc>
+        <w:tc>
+          <w:tcPr>
+            <w:tcW w:w="6894" w:type="dxa"/>
+            <w:tcBorders>
+              <w:top w:val="single" w:sz="4" w:space="0" w:color="auto"/>
+              <w:left w:val="single" w:sz="4" w:space="0" w:color="auto"/>
+              <w:bottom w:val="single" w:sz="4" w:space="0" w:color="auto"/>
+              <w:right w:val="single" w:sz="4" w:space="0" w:color="auto"/>
+            </w:tcBorders>
+            <w:hideMark/>
+          </w:tcPr>
+          <w:p>
+            <w:pPr>
+              <w:spacing w:after="160" w:line="278" w:lineRule="auto"/>
+              <w:rPr>
+                <w:lang w:val="en-US"/>
+              </w:rPr>
+            </w:pPr>
+            <w:r>
+              <w:rPr>
+                <w:lang w:val="en-US"/>
+              </w:rPr>
+              <w:t>Allows order price deviation percentage from Close price till configured limit size</w:t>
+            </w:r>
+          </w:p>
+        </w:tc>
+      </w:tr>
+      <w:tr>
+        <w:tc>
+          <w:tcPr>
+            <w:tcW w:w="2122" w:type="dxa"/>
+            <w:tcBorders>
+              <w:top w:val="single" w:sz="4" w:space="0" w:color="auto"/>
+              <w:left w:val="single" w:sz="4" w:space="0" w:color="auto"/>
+              <w:bottom w:val="single" w:sz="4" w:space="0" w:color="auto"/>
+              <w:right w:val="single" w:sz="4" w:space="0" w:color="auto"/>
+            </w:tcBorders>
+            <w:hideMark/>
+          </w:tcPr>
+          <w:p>
+            <w:pPr>
+              <w:spacing w:after="160" w:line="278" w:lineRule="auto"/>
+              <w:rPr>
+                <w:lang w:val="en-US"/>
+              </w:rPr>
+            </w:pPr>
+            <w:r>
+              <w:rPr>
+                <w:lang w:val="en-US"/>
+              </w:rPr>
+              <w:t>Working</w:t>
+            </w:r>
+          </w:p>
+        </w:tc>
+        <w:tc>
+          <w:tcPr>
+            <w:tcW w:w="6894" w:type="dxa"/>
+            <w:tcBorders>
+              <w:top w:val="single" w:sz="4" w:space="0" w:color="auto"/>
+              <w:left w:val="single" w:sz="4" w:space="0" w:color="auto"/>
+              <w:bottom w:val="single" w:sz="4" w:space="0" w:color="auto"/>
+              <w:right w:val="single" w:sz="4" w:space="0" w:color="auto"/>
+            </w:tcBorders>
+            <w:hideMark/>
+          </w:tcPr>
+          <w:p>
+            <w:pPr>
+              <w:spacing w:after="160" w:line="278" w:lineRule="auto"/>
+              <w:rPr>
+                <w:lang w:val="en-US"/>
+              </w:rPr>
+            </w:pPr>
+            <w:r>
+              <w:rPr>
+                <w:lang w:val="en-US"/>
+              </w:rPr>
+              <w:t>If Limit / LMT is 10, order value is allowed till 10% away from Close price on both aggressive and passive side. Order price beyond Limit % will be rejected.</w:t>
+            </w:r>
+            <w:r>
+              <w:rPr>
+                <w:lang w:val="en-US"/>
+              </w:rPr>
+              <w:br/>
+            </w:r>
+          </w:p>
+          <w:p>
+            <w:pPr>
+              <w:spacing w:after="160" w:line="278" w:lineRule="auto"/>
+              <w:rPr>
+                <w:lang w:val="en-US"/>
+              </w:rPr>
+            </w:pPr>
+            <w:r>
+              <w:rPr>
+                <w:lang w:val="en-US"/>
+              </w:rPr>
+              <w:t xml:space="preserve">LMT value should be taken from </w:t>
+            </w:r>
+            <w:proofErr w:type="spellStart"/>
+            <w:r>
+              <w:t>ClosePriceTolerance</w:t>
+            </w:r>
+            <w:proofErr w:type="spellEnd"/>
+            <w:r>
+              <w:t xml:space="preserve"> in RMS limits</w:t>
+            </w:r>
+            <w:r>
+              <w:rPr>
+                <w:lang w:val="en-US"/>
+              </w:rPr>
+              <w:br/>
+            </w:r>
+          </w:p>
+          <w:p>
+            <w:pPr>
+              <w:spacing w:after="160" w:line="278" w:lineRule="auto"/>
+              <w:rPr>
+                <w:lang w:val="en-US"/>
+              </w:rPr>
+            </w:pPr>
+            <w:r>
+              <w:rPr>
+                <w:lang w:val="en-US"/>
+              </w:rPr>
+              <w:t>CPT  = abs((Close price - Reference price) / Close price) *100</w:t>
+            </w:r>
+          </w:p>
+          <w:p>
+            <w:pPr>
+              <w:spacing w:after="160" w:line="278" w:lineRule="auto"/>
+              <w:rPr>
+                <w:lang w:val="en-US"/>
+              </w:rPr>
+            </w:pPr>
+            <w:r>
+              <w:rPr>
+                <w:lang w:val="en-US"/>
+              </w:rPr>
+              <w:t>Reference price = For Limit order it is Limit price</w:t>
+            </w:r>
+          </w:p>
+          <w:p>
+            <w:pPr>
+              <w:spacing w:after="160" w:line="278" w:lineRule="auto"/>
+              <w:rPr>
+                <w:lang w:val="en-US"/>
+              </w:rPr>
+            </w:pPr>
+            <w:r>
+              <w:rPr>
+                <w:lang w:val="en-US"/>
+              </w:rPr>
+              <w:t xml:space="preserve">For Market orders, it is Bo/Ask for Buy side and Bb/Bid for Sell Side orders, in absence of Ask/Bid prices, it should </w:t>
+            </w:r>
+            <w:proofErr w:type="spellStart"/>
+            <w:r>
+              <w:rPr>
+                <w:lang w:val="en-US"/>
+              </w:rPr>
+              <w:t>fallback</w:t>
+            </w:r>
+            <w:proofErr w:type="spellEnd"/>
+            <w:r>
+              <w:rPr>
+                <w:lang w:val="en-US"/>
+              </w:rPr>
+              <w:t xml:space="preserve"> to last and then fallback to open and should use close price if all other prices are unavailable.</w:t>
+            </w:r>
+          </w:p>
+          <w:p>
+            <w:pPr>
+              <w:spacing w:after="160" w:line="278" w:lineRule="auto"/>
               <w:rPr>
                 <w:lang w:val="en-US"/>
               </w:rPr>
@@ -2085,25 +2762,7 @@
               </w:rPr>
               <w:lastRenderedPageBreak/>
               <w:br/>
-              <w:t xml:space="preserve">ORD is order </w:t>
-            </w:r>
-            <w:r>
-              <w:rPr>
-                <w:lang w:val="en-US"/>
-              </w:rPr>
-              <w:t>value</w:t>
-            </w:r>
-            <w:r>
-              <w:rPr>
-                <w:lang w:val="en-US"/>
-              </w:rPr>
-              <w:t xml:space="preserve">, LMT is limit </w:t>
-            </w:r>
-            <w:r>
-              <w:rPr>
-                <w:lang w:val="en-US"/>
-              </w:rPr>
-              <w:t>value</w:t>
+              <w:t>ORD is order value, LMT is limit value</w:t>
             </w:r>
             <w:r>
               <w:rPr>
@@ -2115,6 +2774,7 @@
           </w:p>
           <w:p>
             <w:pPr>
+              <w:spacing w:after="160" w:line="278" w:lineRule="auto"/>
               <w:rPr>
                 <w:lang w:val="en-US"/>
               </w:rPr>
@@ -2132,9 +2792,17 @@
         <w:tc>
           <w:tcPr>
             <w:tcW w:w="2122" w:type="dxa"/>
-          </w:tcPr>
-          <w:p>
-            <w:pPr>
+            <w:tcBorders>
+              <w:top w:val="single" w:sz="4" w:space="0" w:color="auto"/>
+              <w:left w:val="single" w:sz="4" w:space="0" w:color="auto"/>
+              <w:bottom w:val="single" w:sz="4" w:space="0" w:color="auto"/>
+              <w:right w:val="single" w:sz="4" w:space="0" w:color="auto"/>
+            </w:tcBorders>
+            <w:hideMark/>
+          </w:tcPr>
+          <w:p>
+            <w:pPr>
+              <w:spacing w:after="160" w:line="278" w:lineRule="auto"/>
               <w:rPr>
                 <w:lang w:val="en-US"/>
               </w:rPr>
@@ -2151,30 +2819,26 @@
         <w:tc>
           <w:tcPr>
             <w:tcW w:w="6894" w:type="dxa"/>
-          </w:tcPr>
-          <w:p>
-            <w:pPr>
-              <w:rPr>
-                <w:lang w:val="en-US"/>
-              </w:rPr>
-            </w:pPr>
-            <w:r>
-              <w:rPr>
-                <w:lang w:val="en-US"/>
-              </w:rPr>
-              <w:t xml:space="preserve">Order </w:t>
-            </w:r>
-            <w:r>
-              <w:rPr>
-                <w:lang w:val="en-US"/>
-              </w:rPr>
-              <w:t>Value</w:t>
-            </w:r>
-            <w:r>
-              <w:rPr>
-                <w:lang w:val="en-US"/>
-              </w:rPr>
-              <w:t xml:space="preserve"> is too big, LMT=$LMT, ORD=$ORD</w:t>
+            <w:tcBorders>
+              <w:top w:val="single" w:sz="4" w:space="0" w:color="auto"/>
+              <w:left w:val="single" w:sz="4" w:space="0" w:color="auto"/>
+              <w:bottom w:val="single" w:sz="4" w:space="0" w:color="auto"/>
+              <w:right w:val="single" w:sz="4" w:space="0" w:color="auto"/>
+            </w:tcBorders>
+            <w:hideMark/>
+          </w:tcPr>
+          <w:p>
+            <w:pPr>
+              <w:spacing w:after="160" w:line="278" w:lineRule="auto"/>
+              <w:rPr>
+                <w:lang w:val="en-US"/>
+              </w:rPr>
+            </w:pPr>
+            <w:r>
+              <w:rPr>
+                <w:lang w:val="en-US"/>
+              </w:rPr>
+              <w:t>Close Price Tolerance exceeds limit, LMT=$LMT, ORD=$ORD</w:t>
             </w:r>
           </w:p>
         </w:tc>
@@ -2183,117 +2847,90 @@
         <w:tc>
           <w:tcPr>
             <w:tcW w:w="2122" w:type="dxa"/>
-          </w:tcPr>
-          <w:p>
-            <w:pPr>
-              <w:rPr>
-                <w:lang w:val="en-US"/>
-              </w:rPr>
-            </w:pPr>
-            <w:r>
-              <w:rPr>
-                <w:lang w:val="en-US"/>
-              </w:rPr>
-              <w:t>Example1</w:t>
+            <w:tcBorders>
+              <w:top w:val="single" w:sz="4" w:space="0" w:color="auto"/>
+              <w:left w:val="single" w:sz="4" w:space="0" w:color="auto"/>
+              <w:bottom w:val="single" w:sz="4" w:space="0" w:color="auto"/>
+              <w:right w:val="single" w:sz="4" w:space="0" w:color="auto"/>
+            </w:tcBorders>
+            <w:hideMark/>
+          </w:tcPr>
+          <w:p>
+            <w:pPr>
+              <w:spacing w:after="160" w:line="278" w:lineRule="auto"/>
+              <w:rPr>
+                <w:lang w:val="en-US"/>
+              </w:rPr>
+            </w:pPr>
+            <w:r>
+              <w:rPr>
+                <w:lang w:val="en-US"/>
+              </w:rPr>
+              <w:t>Exception handling</w:t>
             </w:r>
           </w:p>
         </w:tc>
         <w:tc>
           <w:tcPr>
             <w:tcW w:w="6894" w:type="dxa"/>
-          </w:tcPr>
-          <w:p>
-            <w:pPr>
-              <w:rPr>
-                <w:lang w:val="en-US"/>
-              </w:rPr>
-            </w:pPr>
-            <w:r>
-              <w:rPr>
-                <w:lang w:val="en-US"/>
-              </w:rPr>
-              <w:t>If LMT is 1000 USD and order price is 100 HKD for 10 quantity, order value should be calculated as below.</w:t>
-            </w:r>
-          </w:p>
-          <w:p>
-            <w:pPr>
-              <w:rPr>
-                <w:lang w:val="en-US"/>
-              </w:rPr>
-            </w:pPr>
-            <w:r>
-              <w:rPr>
-                <w:lang w:val="en-US"/>
-              </w:rPr>
+            <w:tcBorders>
+              <w:top w:val="single" w:sz="4" w:space="0" w:color="auto"/>
+              <w:left w:val="single" w:sz="4" w:space="0" w:color="auto"/>
+              <w:bottom w:val="single" w:sz="4" w:space="0" w:color="auto"/>
+              <w:right w:val="single" w:sz="4" w:space="0" w:color="auto"/>
+            </w:tcBorders>
+            <w:hideMark/>
+          </w:tcPr>
+          <w:p>
+            <w:pPr>
+              <w:spacing w:after="160" w:line="278" w:lineRule="auto"/>
+            </w:pPr>
+            <w:r>
+              <w:rPr>
+                <w:lang w:val="en-US"/>
+              </w:rPr>
+              <w:t xml:space="preserve">If Close price is not available, based on </w:t>
+            </w:r>
+            <w:proofErr w:type="spellStart"/>
+            <w:r>
+              <w:t>invalid_close_price_action</w:t>
+            </w:r>
+            <w:proofErr w:type="spellEnd"/>
+          </w:p>
+          <w:p>
+            <w:pPr>
+              <w:spacing w:after="160" w:line="278" w:lineRule="auto"/>
+            </w:pPr>
+            <w:r>
+              <w:t>Config in limitchecker.ini.</w:t>
+            </w:r>
+            <w:r>
+              <w:br/>
               <w:t xml:space="preserve">If </w:t>
             </w:r>
             <w:proofErr w:type="spellStart"/>
             <w:r>
-              <w:rPr>
-                <w:lang w:val="en-US"/>
-              </w:rPr>
-              <w:t>xr</w:t>
+              <w:t>invalid_close_price_action</w:t>
             </w:r>
             <w:proofErr w:type="spellEnd"/>
             <w:r>
-              <w:rPr>
-                <w:lang w:val="en-US"/>
-              </w:rPr>
-              <w:t xml:space="preserve"> rate is 0.13 (to be get from </w:t>
+              <w:t xml:space="preserve"> = ignore, pass the control with message. “Close price is missing”</w:t>
+            </w:r>
+          </w:p>
+          <w:p>
+            <w:pPr>
+              <w:spacing w:after="160" w:line="278" w:lineRule="auto"/>
+            </w:pPr>
+            <w:r>
+              <w:t xml:space="preserve">If </w:t>
             </w:r>
             <w:proofErr w:type="spellStart"/>
             <w:r>
-              <w:rPr>
-                <w:lang w:val="en-US"/>
-              </w:rPr>
-              <w:t>yfinance</w:t>
+              <w:t>invalid_close_price_action</w:t>
             </w:r>
             <w:proofErr w:type="spellEnd"/>
             <w:r>
-              <w:rPr>
-                <w:lang w:val="en-US"/>
-              </w:rPr>
-              <w:t xml:space="preserve"> as HKD=X as ticker to get </w:t>
-            </w:r>
-            <w:proofErr w:type="spellStart"/>
-            <w:r>
-              <w:rPr>
-                <w:lang w:val="en-US"/>
-              </w:rPr>
-              <w:t>fx</w:t>
-            </w:r>
-            <w:proofErr w:type="spellEnd"/>
-            <w:r>
-              <w:rPr>
-                <w:lang w:val="en-US"/>
-              </w:rPr>
-              <w:t xml:space="preserve"> price)</w:t>
-            </w:r>
-          </w:p>
-          <w:p>
-            <w:pPr>
-              <w:rPr>
-                <w:lang w:val="en-US"/>
-              </w:rPr>
-            </w:pPr>
-            <w:r>
-              <w:rPr>
-                <w:lang w:val="en-US"/>
-              </w:rPr>
-              <w:t>LMT: 1000 USD</w:t>
-            </w:r>
-          </w:p>
-          <w:p>
-            <w:pPr>
-              <w:rPr>
-                <w:lang w:val="en-US"/>
-              </w:rPr>
-            </w:pPr>
-            <w:r>
-              <w:rPr>
-                <w:lang w:val="en-US"/>
-              </w:rPr>
-              <w:t>ORD: 10 * 100 * 0.13 = 130 USD</w:t>
+              <w:t xml:space="preserve"> = reject, reject the control with message. “Close price is missing”</w:t>
             </w:r>
           </w:p>
         </w:tc>
@@ -2302,9 +2939,99 @@
         <w:tc>
           <w:tcPr>
             <w:tcW w:w="2122" w:type="dxa"/>
-          </w:tcPr>
-          <w:p>
-            <w:pPr>
+            <w:tcBorders>
+              <w:top w:val="single" w:sz="4" w:space="0" w:color="auto"/>
+              <w:left w:val="single" w:sz="4" w:space="0" w:color="auto"/>
+              <w:bottom w:val="single" w:sz="4" w:space="0" w:color="auto"/>
+              <w:right w:val="single" w:sz="4" w:space="0" w:color="auto"/>
+            </w:tcBorders>
+            <w:hideMark/>
+          </w:tcPr>
+          <w:p>
+            <w:pPr>
+              <w:spacing w:after="160" w:line="278" w:lineRule="auto"/>
+              <w:rPr>
+                <w:lang w:val="en-US"/>
+              </w:rPr>
+            </w:pPr>
+            <w:r>
+              <w:rPr>
+                <w:lang w:val="en-US"/>
+              </w:rPr>
+              <w:t>Example1</w:t>
+            </w:r>
+          </w:p>
+        </w:tc>
+        <w:tc>
+          <w:tcPr>
+            <w:tcW w:w="6894" w:type="dxa"/>
+            <w:tcBorders>
+              <w:top w:val="single" w:sz="4" w:space="0" w:color="auto"/>
+              <w:left w:val="single" w:sz="4" w:space="0" w:color="auto"/>
+              <w:bottom w:val="single" w:sz="4" w:space="0" w:color="auto"/>
+              <w:right w:val="single" w:sz="4" w:space="0" w:color="auto"/>
+            </w:tcBorders>
+            <w:hideMark/>
+          </w:tcPr>
+          <w:p>
+            <w:pPr>
+              <w:spacing w:after="160" w:line="278" w:lineRule="auto"/>
+              <w:rPr>
+                <w:lang w:val="en-US"/>
+              </w:rPr>
+            </w:pPr>
+            <w:r>
+              <w:rPr>
+                <w:lang w:val="en-US"/>
+              </w:rPr>
+              <w:t>LMT is 10%</w:t>
+            </w:r>
+            <w:r>
+              <w:rPr>
+                <w:lang w:val="en-US"/>
+              </w:rPr>
+              <w:br/>
+              <w:t>Close price is 100</w:t>
+            </w:r>
+            <w:r>
+              <w:rPr>
+                <w:lang w:val="en-US"/>
+              </w:rPr>
+              <w:br/>
+              <w:t>Order limit price is 90</w:t>
+            </w:r>
+            <w:r>
+              <w:rPr>
+                <w:lang w:val="en-US"/>
+              </w:rPr>
+              <w:br/>
+              <w:t>ORD = abs((100 – 90)/100)*100 = 10%</w:t>
+            </w:r>
+            <w:r>
+              <w:rPr>
+                <w:lang w:val="en-US"/>
+              </w:rPr>
+              <w:br/>
+              <w:t>ORD =&lt; LMT hence order passes</w:t>
+            </w:r>
+          </w:p>
+        </w:tc>
+      </w:tr>
+      <w:tr>
+        <w:tc>
+          <w:tcPr>
+            <w:tcW w:w="2122" w:type="dxa"/>
+            <w:tcBorders>
+              <w:top w:val="single" w:sz="4" w:space="0" w:color="auto"/>
+              <w:left w:val="single" w:sz="4" w:space="0" w:color="auto"/>
+              <w:bottom w:val="single" w:sz="4" w:space="0" w:color="auto"/>
+              <w:right w:val="single" w:sz="4" w:space="0" w:color="auto"/>
+            </w:tcBorders>
+            <w:hideMark/>
+          </w:tcPr>
+          <w:p>
+            <w:pPr>
+              <w:spacing w:after="160" w:line="278" w:lineRule="auto"/>
               <w:rPr>
                 <w:lang w:val="en-US"/>
               </w:rPr>
@@ -2320,104 +3047,1645 @@
         <w:tc>
           <w:tcPr>
             <w:tcW w:w="6894" w:type="dxa"/>
-          </w:tcPr>
-          <w:p>
-            <w:pPr>
-              <w:rPr>
-                <w:lang w:val="en-US"/>
-              </w:rPr>
-            </w:pPr>
-            <w:r>
-              <w:rPr>
-                <w:lang w:val="en-US"/>
-              </w:rPr>
-              <w:t>If LMT is 1000 HKD and order price is 100 HKD for 10 quantity, order value should be calculated as below.</w:t>
-            </w:r>
-          </w:p>
-          <w:p>
-            <w:pPr>
-              <w:rPr>
-                <w:lang w:val="en-US"/>
-              </w:rPr>
-            </w:pPr>
-            <w:r>
-              <w:rPr>
-                <w:lang w:val="en-US"/>
-              </w:rPr>
-              <w:t xml:space="preserve">If </w:t>
-            </w:r>
-            <w:proofErr w:type="spellStart"/>
-            <w:r>
-              <w:rPr>
-                <w:lang w:val="en-US"/>
-              </w:rPr>
-              <w:t>xr</w:t>
-            </w:r>
-            <w:proofErr w:type="spellEnd"/>
-            <w:r>
-              <w:rPr>
-                <w:lang w:val="en-US"/>
-              </w:rPr>
-              <w:t xml:space="preserve"> rate is 0.13 (to be get from </w:t>
-            </w:r>
-            <w:proofErr w:type="spellStart"/>
-            <w:r>
-              <w:rPr>
-                <w:lang w:val="en-US"/>
-              </w:rPr>
-              <w:t>yfinance</w:t>
-            </w:r>
-            <w:proofErr w:type="spellEnd"/>
-            <w:r>
-              <w:rPr>
-                <w:lang w:val="en-US"/>
-              </w:rPr>
-              <w:t xml:space="preserve"> as HKD=X as ticker to get </w:t>
-            </w:r>
-            <w:proofErr w:type="spellStart"/>
-            <w:r>
-              <w:rPr>
-                <w:lang w:val="en-US"/>
-              </w:rPr>
-              <w:t>fx</w:t>
-            </w:r>
-            <w:proofErr w:type="spellEnd"/>
-            <w:r>
-              <w:rPr>
-                <w:lang w:val="en-US"/>
-              </w:rPr>
-              <w:t xml:space="preserve"> price)</w:t>
-            </w:r>
-          </w:p>
-          <w:p>
-            <w:pPr>
-              <w:rPr>
-                <w:lang w:val="en-US"/>
-              </w:rPr>
-            </w:pPr>
-            <w:r>
-              <w:rPr>
-                <w:lang w:val="en-US"/>
-              </w:rPr>
-              <w:t>LMT: 1000 USD</w:t>
-            </w:r>
-          </w:p>
-          <w:p>
-            <w:pPr>
-              <w:rPr>
-                <w:lang w:val="en-US"/>
-              </w:rPr>
-            </w:pPr>
-            <w:r>
-              <w:rPr>
-                <w:lang w:val="en-US"/>
-              </w:rPr>
-              <w:t>ORD: 10 * 100 * 1 (as LMT currency is same as Order currency) = 1000 HKD</w:t>
+            <w:tcBorders>
+              <w:top w:val="single" w:sz="4" w:space="0" w:color="auto"/>
+              <w:left w:val="single" w:sz="4" w:space="0" w:color="auto"/>
+              <w:bottom w:val="single" w:sz="4" w:space="0" w:color="auto"/>
+              <w:right w:val="single" w:sz="4" w:space="0" w:color="auto"/>
+            </w:tcBorders>
+            <w:hideMark/>
+          </w:tcPr>
+          <w:p>
+            <w:pPr>
+              <w:spacing w:after="160" w:line="278" w:lineRule="auto"/>
+              <w:rPr>
+                <w:lang w:val="en-US"/>
+              </w:rPr>
+            </w:pPr>
+            <w:r>
+              <w:rPr>
+                <w:lang w:val="en-US"/>
+              </w:rPr>
+              <w:t>LMT is 10%</w:t>
+            </w:r>
+            <w:r>
+              <w:rPr>
+                <w:lang w:val="en-US"/>
+              </w:rPr>
+              <w:br/>
+              <w:t>Close price is 100</w:t>
+            </w:r>
+            <w:r>
+              <w:rPr>
+                <w:lang w:val="en-US"/>
+              </w:rPr>
+              <w:br/>
+              <w:t>Order limit price is 111</w:t>
+            </w:r>
+            <w:r>
+              <w:rPr>
+                <w:lang w:val="en-US"/>
+              </w:rPr>
+              <w:br/>
+              <w:t>ORD = abs((100 – 111)/100)*100 = 11%</w:t>
+            </w:r>
+            <w:r>
+              <w:rPr>
+                <w:lang w:val="en-US"/>
+              </w:rPr>
+              <w:br/>
+              <w:t>ORD &gt; LMT hence order is rejected</w:t>
+            </w:r>
+          </w:p>
+        </w:tc>
+      </w:tr>
+      <w:tr>
+        <w:tc>
+          <w:tcPr>
+            <w:tcW w:w="2122" w:type="dxa"/>
+            <w:tcBorders>
+              <w:top w:val="single" w:sz="4" w:space="0" w:color="auto"/>
+              <w:left w:val="single" w:sz="4" w:space="0" w:color="auto"/>
+              <w:bottom w:val="single" w:sz="4" w:space="0" w:color="auto"/>
+              <w:right w:val="single" w:sz="4" w:space="0" w:color="auto"/>
+            </w:tcBorders>
+            <w:hideMark/>
+          </w:tcPr>
+          <w:p>
+            <w:pPr>
+              <w:spacing w:after="160" w:line="278" w:lineRule="auto"/>
+              <w:rPr>
+                <w:lang w:val="en-US"/>
+              </w:rPr>
+            </w:pPr>
+            <w:r>
+              <w:rPr>
+                <w:lang w:val="en-US"/>
+              </w:rPr>
+              <w:t>Example3</w:t>
+            </w:r>
+          </w:p>
+        </w:tc>
+        <w:tc>
+          <w:tcPr>
+            <w:tcW w:w="6894" w:type="dxa"/>
+            <w:tcBorders>
+              <w:top w:val="single" w:sz="4" w:space="0" w:color="auto"/>
+              <w:left w:val="single" w:sz="4" w:space="0" w:color="auto"/>
+              <w:bottom w:val="single" w:sz="4" w:space="0" w:color="auto"/>
+              <w:right w:val="single" w:sz="4" w:space="0" w:color="auto"/>
+            </w:tcBorders>
+            <w:hideMark/>
+          </w:tcPr>
+          <w:p>
+            <w:pPr>
+              <w:spacing w:after="160" w:line="278" w:lineRule="auto"/>
+              <w:rPr>
+                <w:lang w:val="en-US"/>
+              </w:rPr>
+            </w:pPr>
+            <w:r>
+              <w:rPr>
+                <w:lang w:val="en-US"/>
+              </w:rPr>
+              <w:t>LMT is 10%</w:t>
+            </w:r>
+            <w:r>
+              <w:rPr>
+                <w:lang w:val="en-US"/>
+              </w:rPr>
+              <w:br/>
+              <w:t>Close price is 100</w:t>
+            </w:r>
+            <w:r>
+              <w:rPr>
+                <w:lang w:val="en-US"/>
+              </w:rPr>
+              <w:br/>
+              <w:t>Order is a MKT order having reference price as 95</w:t>
+            </w:r>
+            <w:r>
+              <w:rPr>
+                <w:lang w:val="en-US"/>
+              </w:rPr>
+              <w:br/>
+              <w:t>ORD = abs((100 – 95)/100)*100 = 5%</w:t>
+            </w:r>
+            <w:r>
+              <w:rPr>
+                <w:lang w:val="en-US"/>
+              </w:rPr>
+              <w:br/>
+              <w:t>ORD =&lt; LMT hence order passes</w:t>
             </w:r>
           </w:p>
         </w:tc>
       </w:tr>
     </w:tbl>
+    <w:p/>
+    <w:p/>
+    <w:tbl>
+      <w:tblPr>
+        <w:tblStyle w:val="TableGrid"/>
+        <w:tblW w:w="0" w:type="auto"/>
+        <w:tblLook w:val="04A0" w:firstRow="1" w:lastRow="0" w:firstColumn="1" w:lastColumn="0" w:noHBand="0" w:noVBand="1"/>
+      </w:tblPr>
+      <w:tblGrid>
+        <w:gridCol w:w="2122"/>
+        <w:gridCol w:w="6894"/>
+      </w:tblGrid>
+      <w:tr>
+        <w:tc>
+          <w:tcPr>
+            <w:tcW w:w="2122" w:type="dxa"/>
+            <w:tcBorders>
+              <w:top w:val="single" w:sz="4" w:space="0" w:color="auto"/>
+              <w:left w:val="single" w:sz="4" w:space="0" w:color="auto"/>
+              <w:bottom w:val="single" w:sz="4" w:space="0" w:color="auto"/>
+              <w:right w:val="single" w:sz="4" w:space="0" w:color="auto"/>
+            </w:tcBorders>
+            <w:hideMark/>
+          </w:tcPr>
+          <w:p>
+            <w:pPr>
+              <w:spacing w:after="160" w:line="278" w:lineRule="auto"/>
+              <w:rPr>
+                <w:lang w:val="en-US"/>
+              </w:rPr>
+            </w:pPr>
+            <w:r>
+              <w:rPr>
+                <w:lang w:val="en-US"/>
+              </w:rPr>
+              <w:t>Control Name</w:t>
+            </w:r>
+          </w:p>
+        </w:tc>
+        <w:tc>
+          <w:tcPr>
+            <w:tcW w:w="6894" w:type="dxa"/>
+            <w:tcBorders>
+              <w:top w:val="single" w:sz="4" w:space="0" w:color="auto"/>
+              <w:left w:val="single" w:sz="4" w:space="0" w:color="auto"/>
+              <w:bottom w:val="single" w:sz="4" w:space="0" w:color="auto"/>
+              <w:right w:val="single" w:sz="4" w:space="0" w:color="auto"/>
+            </w:tcBorders>
+            <w:hideMark/>
+          </w:tcPr>
+          <w:p>
+            <w:pPr>
+              <w:spacing w:after="160" w:line="278" w:lineRule="auto"/>
+              <w:rPr>
+                <w:lang w:val="en-US"/>
+              </w:rPr>
+            </w:pPr>
+            <w:r>
+              <w:rPr>
+                <w:lang w:val="en-US"/>
+              </w:rPr>
+              <w:t>Last Price Tolerance (</w:t>
+            </w:r>
+            <w:proofErr w:type="spellStart"/>
+            <w:r>
+              <w:rPr>
+                <w:lang w:val="en-US"/>
+              </w:rPr>
+              <w:t>lpt</w:t>
+            </w:r>
+            <w:proofErr w:type="spellEnd"/>
+            <w:r>
+              <w:rPr>
+                <w:lang w:val="en-US"/>
+              </w:rPr>
+              <w:t>)</w:t>
+            </w:r>
+          </w:p>
+        </w:tc>
+      </w:tr>
+      <w:tr>
+        <w:tc>
+          <w:tcPr>
+            <w:tcW w:w="2122" w:type="dxa"/>
+            <w:tcBorders>
+              <w:top w:val="single" w:sz="4" w:space="0" w:color="auto"/>
+              <w:left w:val="single" w:sz="4" w:space="0" w:color="auto"/>
+              <w:bottom w:val="single" w:sz="4" w:space="0" w:color="auto"/>
+              <w:right w:val="single" w:sz="4" w:space="0" w:color="auto"/>
+            </w:tcBorders>
+            <w:hideMark/>
+          </w:tcPr>
+          <w:p>
+            <w:pPr>
+              <w:spacing w:after="160" w:line="278" w:lineRule="auto"/>
+              <w:rPr>
+                <w:lang w:val="en-US"/>
+              </w:rPr>
+            </w:pPr>
+            <w:r>
+              <w:rPr>
+                <w:lang w:val="en-US"/>
+              </w:rPr>
+              <w:t>Description</w:t>
+            </w:r>
+          </w:p>
+        </w:tc>
+        <w:tc>
+          <w:tcPr>
+            <w:tcW w:w="6894" w:type="dxa"/>
+            <w:tcBorders>
+              <w:top w:val="single" w:sz="4" w:space="0" w:color="auto"/>
+              <w:left w:val="single" w:sz="4" w:space="0" w:color="auto"/>
+              <w:bottom w:val="single" w:sz="4" w:space="0" w:color="auto"/>
+              <w:right w:val="single" w:sz="4" w:space="0" w:color="auto"/>
+            </w:tcBorders>
+            <w:hideMark/>
+          </w:tcPr>
+          <w:p>
+            <w:pPr>
+              <w:spacing w:after="160" w:line="278" w:lineRule="auto"/>
+              <w:rPr>
+                <w:lang w:val="en-US"/>
+              </w:rPr>
+            </w:pPr>
+            <w:r>
+              <w:rPr>
+                <w:lang w:val="en-US"/>
+              </w:rPr>
+              <w:t>Allows order price deviation percentage from Last price till configured limit size</w:t>
+            </w:r>
+          </w:p>
+        </w:tc>
+      </w:tr>
+      <w:tr>
+        <w:tc>
+          <w:tcPr>
+            <w:tcW w:w="2122" w:type="dxa"/>
+            <w:tcBorders>
+              <w:top w:val="single" w:sz="4" w:space="0" w:color="auto"/>
+              <w:left w:val="single" w:sz="4" w:space="0" w:color="auto"/>
+              <w:bottom w:val="single" w:sz="4" w:space="0" w:color="auto"/>
+              <w:right w:val="single" w:sz="4" w:space="0" w:color="auto"/>
+            </w:tcBorders>
+            <w:hideMark/>
+          </w:tcPr>
+          <w:p>
+            <w:pPr>
+              <w:spacing w:after="160" w:line="278" w:lineRule="auto"/>
+              <w:rPr>
+                <w:lang w:val="en-US"/>
+              </w:rPr>
+            </w:pPr>
+            <w:r>
+              <w:rPr>
+                <w:lang w:val="en-US"/>
+              </w:rPr>
+              <w:t>Working</w:t>
+            </w:r>
+          </w:p>
+        </w:tc>
+        <w:tc>
+          <w:tcPr>
+            <w:tcW w:w="6894" w:type="dxa"/>
+            <w:tcBorders>
+              <w:top w:val="single" w:sz="4" w:space="0" w:color="auto"/>
+              <w:left w:val="single" w:sz="4" w:space="0" w:color="auto"/>
+              <w:bottom w:val="single" w:sz="4" w:space="0" w:color="auto"/>
+              <w:right w:val="single" w:sz="4" w:space="0" w:color="auto"/>
+            </w:tcBorders>
+          </w:tcPr>
+          <w:p>
+            <w:pPr>
+              <w:spacing w:after="160" w:line="278" w:lineRule="auto"/>
+              <w:rPr>
+                <w:lang w:val="en-US"/>
+              </w:rPr>
+            </w:pPr>
+            <w:r>
+              <w:rPr>
+                <w:lang w:val="en-US"/>
+              </w:rPr>
+              <w:t>If Limit / LMT is 10, order value are allowed till 10% away from Last price on both aggressive and passive side. Order price beyond Limit % will be rejected.</w:t>
+            </w:r>
+          </w:p>
+          <w:p>
+            <w:pPr>
+              <w:spacing w:after="160" w:line="278" w:lineRule="auto"/>
+              <w:rPr>
+                <w:lang w:val="en-US"/>
+              </w:rPr>
+            </w:pPr>
+          </w:p>
+          <w:p>
+            <w:pPr>
+              <w:spacing w:after="160" w:line="278" w:lineRule="auto"/>
+              <w:rPr>
+                <w:lang w:val="en-US"/>
+              </w:rPr>
+            </w:pPr>
+            <w:r>
+              <w:rPr>
+                <w:lang w:val="en-US"/>
+              </w:rPr>
+              <w:t>LMT value should be taken from Last</w:t>
+            </w:r>
+            <w:proofErr w:type="spellStart"/>
+            <w:r>
+              <w:t>PriceTolerance</w:t>
+            </w:r>
+            <w:proofErr w:type="spellEnd"/>
+            <w:r>
+              <w:t xml:space="preserve"> in RMS limits</w:t>
+            </w:r>
+            <w:r>
+              <w:rPr>
+                <w:lang w:val="en-US"/>
+              </w:rPr>
+              <w:br/>
+            </w:r>
+          </w:p>
+          <w:p>
+            <w:pPr>
+              <w:spacing w:after="160" w:line="278" w:lineRule="auto"/>
+              <w:rPr>
+                <w:lang w:val="en-US"/>
+              </w:rPr>
+            </w:pPr>
+            <w:r>
+              <w:rPr>
+                <w:lang w:val="en-US"/>
+              </w:rPr>
+              <w:t>LPT  = abs((Last price - Reference price) / Last price) *100</w:t>
+            </w:r>
+          </w:p>
+          <w:p>
+            <w:pPr>
+              <w:spacing w:after="160" w:line="278" w:lineRule="auto"/>
+              <w:rPr>
+                <w:lang w:val="en-US"/>
+              </w:rPr>
+            </w:pPr>
+            <w:r>
+              <w:rPr>
+                <w:lang w:val="en-US"/>
+              </w:rPr>
+              <w:t>Reference price = For Limit order it is Limit price</w:t>
+            </w:r>
+          </w:p>
+          <w:p>
+            <w:pPr>
+              <w:spacing w:after="160" w:line="278" w:lineRule="auto"/>
+              <w:rPr>
+                <w:lang w:val="en-US"/>
+              </w:rPr>
+            </w:pPr>
+            <w:r>
+              <w:rPr>
+                <w:lang w:val="en-US"/>
+              </w:rPr>
+              <w:t xml:space="preserve">For Market orders, it is Bo/Ask for Buy side and Bb/Bid for Sell Side orders, in absence of Ask/Bid prices, it should </w:t>
+            </w:r>
+            <w:proofErr w:type="spellStart"/>
+            <w:r>
+              <w:rPr>
+                <w:lang w:val="en-US"/>
+              </w:rPr>
+              <w:t>fallback</w:t>
+            </w:r>
+            <w:proofErr w:type="spellEnd"/>
+            <w:r>
+              <w:rPr>
+                <w:lang w:val="en-US"/>
+              </w:rPr>
+              <w:t xml:space="preserve"> to last and then fallback to open and should use close price if all other prices are unavailable.</w:t>
+            </w:r>
+          </w:p>
+          <w:p>
+            <w:pPr>
+              <w:spacing w:after="160" w:line="278" w:lineRule="auto"/>
+              <w:rPr>
+                <w:lang w:val="en-US"/>
+              </w:rPr>
+            </w:pPr>
+            <w:r>
+              <w:rPr>
+                <w:lang w:val="en-US"/>
+              </w:rPr>
+              <w:br/>
+              <w:t>ORD is order value, LMT is limit value</w:t>
+            </w:r>
+            <w:r>
+              <w:rPr>
+                <w:lang w:val="en-US"/>
+              </w:rPr>
+              <w:br/>
+              <w:t>Pass: ORD =&lt; LMT</w:t>
+            </w:r>
+          </w:p>
+          <w:p>
+            <w:pPr>
+              <w:spacing w:after="160" w:line="278" w:lineRule="auto"/>
+              <w:rPr>
+                <w:lang w:val="en-US"/>
+              </w:rPr>
+            </w:pPr>
+            <w:r>
+              <w:rPr>
+                <w:lang w:val="en-US"/>
+              </w:rPr>
+              <w:t>Fail: ORD &gt; LMT</w:t>
+            </w:r>
+          </w:p>
+        </w:tc>
+      </w:tr>
+      <w:tr>
+        <w:tc>
+          <w:tcPr>
+            <w:tcW w:w="2122" w:type="dxa"/>
+            <w:tcBorders>
+              <w:top w:val="single" w:sz="4" w:space="0" w:color="auto"/>
+              <w:left w:val="single" w:sz="4" w:space="0" w:color="auto"/>
+              <w:bottom w:val="single" w:sz="4" w:space="0" w:color="auto"/>
+              <w:right w:val="single" w:sz="4" w:space="0" w:color="auto"/>
+            </w:tcBorders>
+            <w:hideMark/>
+          </w:tcPr>
+          <w:p>
+            <w:pPr>
+              <w:spacing w:after="160" w:line="278" w:lineRule="auto"/>
+              <w:rPr>
+                <w:lang w:val="en-US"/>
+              </w:rPr>
+            </w:pPr>
+            <w:r>
+              <w:rPr>
+                <w:lang w:val="en-US"/>
+              </w:rPr>
+              <w:lastRenderedPageBreak/>
+              <w:t>Config</w:t>
+            </w:r>
+          </w:p>
+        </w:tc>
+        <w:tc>
+          <w:tcPr>
+            <w:tcW w:w="6894" w:type="dxa"/>
+            <w:tcBorders>
+              <w:top w:val="single" w:sz="4" w:space="0" w:color="auto"/>
+              <w:left w:val="single" w:sz="4" w:space="0" w:color="auto"/>
+              <w:bottom w:val="single" w:sz="4" w:space="0" w:color="auto"/>
+              <w:right w:val="single" w:sz="4" w:space="0" w:color="auto"/>
+            </w:tcBorders>
+            <w:hideMark/>
+          </w:tcPr>
+          <w:p>
+            <w:pPr>
+              <w:spacing w:after="160" w:line="278" w:lineRule="auto"/>
+              <w:rPr>
+                <w:lang w:val="en-US"/>
+              </w:rPr>
+            </w:pPr>
+            <w:r>
+              <w:rPr>
+                <w:lang w:val="en-US"/>
+              </w:rPr>
+              <w:t>lpt_xsession1, lpt_xsession2, lpt_xsession3</w:t>
+            </w:r>
+            <w:r>
+              <w:rPr>
+                <w:lang w:val="en-US"/>
+              </w:rPr>
+              <w:br/>
+              <w:t xml:space="preserve">Based on the above config, last price can be </w:t>
+            </w:r>
+            <w:proofErr w:type="spellStart"/>
+            <w:r>
+              <w:rPr>
+                <w:lang w:val="en-US"/>
+              </w:rPr>
+              <w:t>overrriden</w:t>
+            </w:r>
+            <w:proofErr w:type="spellEnd"/>
+            <w:r>
+              <w:rPr>
+                <w:lang w:val="en-US"/>
+              </w:rPr>
+              <w:t xml:space="preserve"> with the configured price</w:t>
+            </w:r>
+          </w:p>
+        </w:tc>
+      </w:tr>
+      <w:tr>
+        <w:tc>
+          <w:tcPr>
+            <w:tcW w:w="2122" w:type="dxa"/>
+            <w:tcBorders>
+              <w:top w:val="single" w:sz="4" w:space="0" w:color="auto"/>
+              <w:left w:val="single" w:sz="4" w:space="0" w:color="auto"/>
+              <w:bottom w:val="single" w:sz="4" w:space="0" w:color="auto"/>
+              <w:right w:val="single" w:sz="4" w:space="0" w:color="auto"/>
+            </w:tcBorders>
+            <w:hideMark/>
+          </w:tcPr>
+          <w:p>
+            <w:pPr>
+              <w:spacing w:after="160" w:line="278" w:lineRule="auto"/>
+              <w:rPr>
+                <w:lang w:val="en-US"/>
+              </w:rPr>
+            </w:pPr>
+            <w:r>
+              <w:rPr>
+                <w:lang w:val="en-US"/>
+              </w:rPr>
+              <w:t>Rejection message</w:t>
+            </w:r>
+          </w:p>
+        </w:tc>
+        <w:tc>
+          <w:tcPr>
+            <w:tcW w:w="6894" w:type="dxa"/>
+            <w:tcBorders>
+              <w:top w:val="single" w:sz="4" w:space="0" w:color="auto"/>
+              <w:left w:val="single" w:sz="4" w:space="0" w:color="auto"/>
+              <w:bottom w:val="single" w:sz="4" w:space="0" w:color="auto"/>
+              <w:right w:val="single" w:sz="4" w:space="0" w:color="auto"/>
+            </w:tcBorders>
+            <w:hideMark/>
+          </w:tcPr>
+          <w:p>
+            <w:pPr>
+              <w:spacing w:after="160" w:line="278" w:lineRule="auto"/>
+              <w:rPr>
+                <w:lang w:val="en-US"/>
+              </w:rPr>
+            </w:pPr>
+            <w:r>
+              <w:rPr>
+                <w:lang w:val="en-US"/>
+              </w:rPr>
+              <w:t>Last Price Tolerance exceeds limit, LMT=$LMT, ORD=$ORD</w:t>
+            </w:r>
+          </w:p>
+        </w:tc>
+      </w:tr>
+      <w:tr>
+        <w:tc>
+          <w:tcPr>
+            <w:tcW w:w="2122" w:type="dxa"/>
+            <w:tcBorders>
+              <w:top w:val="single" w:sz="4" w:space="0" w:color="auto"/>
+              <w:left w:val="single" w:sz="4" w:space="0" w:color="auto"/>
+              <w:bottom w:val="single" w:sz="4" w:space="0" w:color="auto"/>
+              <w:right w:val="single" w:sz="4" w:space="0" w:color="auto"/>
+            </w:tcBorders>
+            <w:hideMark/>
+          </w:tcPr>
+          <w:p>
+            <w:pPr>
+              <w:spacing w:after="160" w:line="278" w:lineRule="auto"/>
+              <w:rPr>
+                <w:lang w:val="en-US"/>
+              </w:rPr>
+            </w:pPr>
+            <w:r>
+              <w:rPr>
+                <w:lang w:val="en-US"/>
+              </w:rPr>
+              <w:t>Exception handling</w:t>
+            </w:r>
+          </w:p>
+        </w:tc>
+        <w:tc>
+          <w:tcPr>
+            <w:tcW w:w="6894" w:type="dxa"/>
+            <w:tcBorders>
+              <w:top w:val="single" w:sz="4" w:space="0" w:color="auto"/>
+              <w:left w:val="single" w:sz="4" w:space="0" w:color="auto"/>
+              <w:bottom w:val="single" w:sz="4" w:space="0" w:color="auto"/>
+              <w:right w:val="single" w:sz="4" w:space="0" w:color="auto"/>
+            </w:tcBorders>
+            <w:hideMark/>
+          </w:tcPr>
+          <w:p>
+            <w:pPr>
+              <w:spacing w:after="160" w:line="278" w:lineRule="auto"/>
+            </w:pPr>
+            <w:r>
+              <w:rPr>
+                <w:lang w:val="en-US"/>
+              </w:rPr>
+              <w:t xml:space="preserve">If Last price is not available, based on </w:t>
+            </w:r>
+            <w:proofErr w:type="spellStart"/>
+            <w:r>
+              <w:t>invalid_last_price_action</w:t>
+            </w:r>
+            <w:proofErr w:type="spellEnd"/>
+          </w:p>
+          <w:p>
+            <w:pPr>
+              <w:spacing w:after="160" w:line="278" w:lineRule="auto"/>
+            </w:pPr>
+            <w:r>
+              <w:t>Config in limitchecker.ini.</w:t>
+            </w:r>
+            <w:r>
+              <w:br/>
+              <w:t xml:space="preserve">If </w:t>
+            </w:r>
+            <w:proofErr w:type="spellStart"/>
+            <w:r>
+              <w:t>invalid_last_price_action</w:t>
+            </w:r>
+            <w:proofErr w:type="spellEnd"/>
+            <w:r>
+              <w:t xml:space="preserve"> = ignore, pass the control with message. “Last price is missing”</w:t>
+            </w:r>
+          </w:p>
+          <w:p>
+            <w:pPr>
+              <w:spacing w:after="160" w:line="278" w:lineRule="auto"/>
+              <w:rPr>
+                <w:lang w:val="en-US"/>
+              </w:rPr>
+            </w:pPr>
+            <w:r>
+              <w:t xml:space="preserve">If </w:t>
+            </w:r>
+            <w:proofErr w:type="spellStart"/>
+            <w:r>
+              <w:t>invalid_last_price_action</w:t>
+            </w:r>
+            <w:proofErr w:type="spellEnd"/>
+            <w:r>
+              <w:t xml:space="preserve"> = reject, reject the control with message. “Last price is missing”</w:t>
+            </w:r>
+          </w:p>
+        </w:tc>
+      </w:tr>
+      <w:tr>
+        <w:tc>
+          <w:tcPr>
+            <w:tcW w:w="2122" w:type="dxa"/>
+            <w:tcBorders>
+              <w:top w:val="single" w:sz="4" w:space="0" w:color="auto"/>
+              <w:left w:val="single" w:sz="4" w:space="0" w:color="auto"/>
+              <w:bottom w:val="single" w:sz="4" w:space="0" w:color="auto"/>
+              <w:right w:val="single" w:sz="4" w:space="0" w:color="auto"/>
+            </w:tcBorders>
+            <w:hideMark/>
+          </w:tcPr>
+          <w:p>
+            <w:pPr>
+              <w:spacing w:after="160" w:line="278" w:lineRule="auto"/>
+              <w:rPr>
+                <w:lang w:val="en-US"/>
+              </w:rPr>
+            </w:pPr>
+            <w:r>
+              <w:rPr>
+                <w:lang w:val="en-US"/>
+              </w:rPr>
+              <w:t>Example1</w:t>
+            </w:r>
+          </w:p>
+        </w:tc>
+        <w:tc>
+          <w:tcPr>
+            <w:tcW w:w="6894" w:type="dxa"/>
+            <w:tcBorders>
+              <w:top w:val="single" w:sz="4" w:space="0" w:color="auto"/>
+              <w:left w:val="single" w:sz="4" w:space="0" w:color="auto"/>
+              <w:bottom w:val="single" w:sz="4" w:space="0" w:color="auto"/>
+              <w:right w:val="single" w:sz="4" w:space="0" w:color="auto"/>
+            </w:tcBorders>
+            <w:hideMark/>
+          </w:tcPr>
+          <w:p>
+            <w:pPr>
+              <w:spacing w:after="160" w:line="278" w:lineRule="auto"/>
+              <w:rPr>
+                <w:lang w:val="en-US"/>
+              </w:rPr>
+            </w:pPr>
+            <w:r>
+              <w:rPr>
+                <w:lang w:val="en-US"/>
+              </w:rPr>
+              <w:t>LMT is 10%</w:t>
+            </w:r>
+            <w:r>
+              <w:rPr>
+                <w:lang w:val="en-US"/>
+              </w:rPr>
+              <w:br/>
+              <w:t>Last price is 100</w:t>
+            </w:r>
+            <w:r>
+              <w:rPr>
+                <w:lang w:val="en-US"/>
+              </w:rPr>
+              <w:br/>
+              <w:t>Order limit price is 90</w:t>
+            </w:r>
+            <w:r>
+              <w:rPr>
+                <w:lang w:val="en-US"/>
+              </w:rPr>
+              <w:br/>
+              <w:t>ORD = abs((100 – 90)/100)*100 = 10%</w:t>
+            </w:r>
+            <w:r>
+              <w:rPr>
+                <w:lang w:val="en-US"/>
+              </w:rPr>
+              <w:br/>
+              <w:t>ORD =&lt; LMT hence order passes</w:t>
+            </w:r>
+          </w:p>
+        </w:tc>
+      </w:tr>
+      <w:tr>
+        <w:tc>
+          <w:tcPr>
+            <w:tcW w:w="2122" w:type="dxa"/>
+            <w:tcBorders>
+              <w:top w:val="single" w:sz="4" w:space="0" w:color="auto"/>
+              <w:left w:val="single" w:sz="4" w:space="0" w:color="auto"/>
+              <w:bottom w:val="single" w:sz="4" w:space="0" w:color="auto"/>
+              <w:right w:val="single" w:sz="4" w:space="0" w:color="auto"/>
+            </w:tcBorders>
+            <w:hideMark/>
+          </w:tcPr>
+          <w:p>
+            <w:pPr>
+              <w:spacing w:after="160" w:line="278" w:lineRule="auto"/>
+              <w:rPr>
+                <w:lang w:val="en-US"/>
+              </w:rPr>
+            </w:pPr>
+            <w:r>
+              <w:rPr>
+                <w:lang w:val="en-US"/>
+              </w:rPr>
+              <w:t>Example2</w:t>
+            </w:r>
+          </w:p>
+        </w:tc>
+        <w:tc>
+          <w:tcPr>
+            <w:tcW w:w="6894" w:type="dxa"/>
+            <w:tcBorders>
+              <w:top w:val="single" w:sz="4" w:space="0" w:color="auto"/>
+              <w:left w:val="single" w:sz="4" w:space="0" w:color="auto"/>
+              <w:bottom w:val="single" w:sz="4" w:space="0" w:color="auto"/>
+              <w:right w:val="single" w:sz="4" w:space="0" w:color="auto"/>
+            </w:tcBorders>
+            <w:hideMark/>
+          </w:tcPr>
+          <w:p>
+            <w:pPr>
+              <w:spacing w:after="160" w:line="278" w:lineRule="auto"/>
+              <w:rPr>
+                <w:lang w:val="en-US"/>
+              </w:rPr>
+            </w:pPr>
+            <w:r>
+              <w:rPr>
+                <w:lang w:val="en-US"/>
+              </w:rPr>
+              <w:t>LMT is 10%</w:t>
+            </w:r>
+            <w:r>
+              <w:rPr>
+                <w:lang w:val="en-US"/>
+              </w:rPr>
+              <w:br/>
+              <w:t>Last price is 100</w:t>
+            </w:r>
+            <w:r>
+              <w:rPr>
+                <w:lang w:val="en-US"/>
+              </w:rPr>
+              <w:br/>
+              <w:t>Order limit price is 111</w:t>
+            </w:r>
+            <w:r>
+              <w:rPr>
+                <w:lang w:val="en-US"/>
+              </w:rPr>
+              <w:br/>
+              <w:t>ORD = abs((100 – 111)/100)*100 = 11%</w:t>
+            </w:r>
+            <w:r>
+              <w:rPr>
+                <w:lang w:val="en-US"/>
+              </w:rPr>
+              <w:br/>
+              <w:t>ORD &gt; LMT hence order is rejected</w:t>
+            </w:r>
+          </w:p>
+        </w:tc>
+      </w:tr>
+      <w:tr>
+        <w:tc>
+          <w:tcPr>
+            <w:tcW w:w="2122" w:type="dxa"/>
+            <w:tcBorders>
+              <w:top w:val="single" w:sz="4" w:space="0" w:color="auto"/>
+              <w:left w:val="single" w:sz="4" w:space="0" w:color="auto"/>
+              <w:bottom w:val="single" w:sz="4" w:space="0" w:color="auto"/>
+              <w:right w:val="single" w:sz="4" w:space="0" w:color="auto"/>
+            </w:tcBorders>
+            <w:hideMark/>
+          </w:tcPr>
+          <w:p>
+            <w:pPr>
+              <w:spacing w:after="160" w:line="278" w:lineRule="auto"/>
+              <w:rPr>
+                <w:lang w:val="en-US"/>
+              </w:rPr>
+            </w:pPr>
+            <w:r>
+              <w:rPr>
+                <w:lang w:val="en-US"/>
+              </w:rPr>
+              <w:lastRenderedPageBreak/>
+              <w:t>Example3</w:t>
+            </w:r>
+          </w:p>
+        </w:tc>
+        <w:tc>
+          <w:tcPr>
+            <w:tcW w:w="6894" w:type="dxa"/>
+            <w:tcBorders>
+              <w:top w:val="single" w:sz="4" w:space="0" w:color="auto"/>
+              <w:left w:val="single" w:sz="4" w:space="0" w:color="auto"/>
+              <w:bottom w:val="single" w:sz="4" w:space="0" w:color="auto"/>
+              <w:right w:val="single" w:sz="4" w:space="0" w:color="auto"/>
+            </w:tcBorders>
+            <w:hideMark/>
+          </w:tcPr>
+          <w:p>
+            <w:pPr>
+              <w:spacing w:after="160" w:line="278" w:lineRule="auto"/>
+              <w:rPr>
+                <w:lang w:val="en-US"/>
+              </w:rPr>
+            </w:pPr>
+            <w:r>
+              <w:rPr>
+                <w:lang w:val="en-US"/>
+              </w:rPr>
+              <w:t>LMT is 10%</w:t>
+            </w:r>
+            <w:r>
+              <w:rPr>
+                <w:lang w:val="en-US"/>
+              </w:rPr>
+              <w:br/>
+              <w:t>Last price is 100</w:t>
+            </w:r>
+            <w:r>
+              <w:rPr>
+                <w:lang w:val="en-US"/>
+              </w:rPr>
+              <w:br/>
+              <w:t>Order is a MKT order having reference price as 95</w:t>
+            </w:r>
+            <w:r>
+              <w:rPr>
+                <w:lang w:val="en-US"/>
+              </w:rPr>
+              <w:br/>
+              <w:t>ORD = abs((100 – 95)/100)*100 = 5%</w:t>
+            </w:r>
+            <w:r>
+              <w:rPr>
+                <w:lang w:val="en-US"/>
+              </w:rPr>
+              <w:br/>
+              <w:t>ORD =&lt; LMT hence order passes</w:t>
+            </w:r>
+          </w:p>
+        </w:tc>
+      </w:tr>
+    </w:tbl>
+    <w:p/>
+    <w:p/>
+    <w:tbl>
+      <w:tblPr>
+        <w:tblStyle w:val="TableGrid"/>
+        <w:tblW w:w="0" w:type="auto"/>
+        <w:tblLook w:val="04A0" w:firstRow="1" w:lastRow="0" w:firstColumn="1" w:lastColumn="0" w:noHBand="0" w:noVBand="1"/>
+      </w:tblPr>
+      <w:tblGrid>
+        <w:gridCol w:w="2122"/>
+        <w:gridCol w:w="6894"/>
+      </w:tblGrid>
+      <w:tr>
+        <w:tc>
+          <w:tcPr>
+            <w:tcW w:w="2122" w:type="dxa"/>
+            <w:tcBorders>
+              <w:top w:val="single" w:sz="4" w:space="0" w:color="auto"/>
+              <w:left w:val="single" w:sz="4" w:space="0" w:color="auto"/>
+              <w:bottom w:val="single" w:sz="4" w:space="0" w:color="auto"/>
+              <w:right w:val="single" w:sz="4" w:space="0" w:color="auto"/>
+            </w:tcBorders>
+            <w:hideMark/>
+          </w:tcPr>
+          <w:p>
+            <w:pPr>
+              <w:spacing w:after="160" w:line="278" w:lineRule="auto"/>
+              <w:rPr>
+                <w:lang w:val="en-US"/>
+              </w:rPr>
+            </w:pPr>
+            <w:r>
+              <w:rPr>
+                <w:lang w:val="en-US"/>
+              </w:rPr>
+              <w:t>Control Name</w:t>
+            </w:r>
+          </w:p>
+        </w:tc>
+        <w:tc>
+          <w:tcPr>
+            <w:tcW w:w="6894" w:type="dxa"/>
+            <w:tcBorders>
+              <w:top w:val="single" w:sz="4" w:space="0" w:color="auto"/>
+              <w:left w:val="single" w:sz="4" w:space="0" w:color="auto"/>
+              <w:bottom w:val="single" w:sz="4" w:space="0" w:color="auto"/>
+              <w:right w:val="single" w:sz="4" w:space="0" w:color="auto"/>
+            </w:tcBorders>
+            <w:hideMark/>
+          </w:tcPr>
+          <w:p>
+            <w:pPr>
+              <w:spacing w:after="160" w:line="278" w:lineRule="auto"/>
+              <w:rPr>
+                <w:lang w:val="en-US"/>
+              </w:rPr>
+            </w:pPr>
+            <w:r>
+              <w:rPr>
+                <w:lang w:val="en-US"/>
+              </w:rPr>
+              <w:t>BBO Price Tolerance (</w:t>
+            </w:r>
+            <w:proofErr w:type="spellStart"/>
+            <w:r>
+              <w:rPr>
+                <w:lang w:val="en-US"/>
+              </w:rPr>
+              <w:t>cpt</w:t>
+            </w:r>
+            <w:proofErr w:type="spellEnd"/>
+            <w:r>
+              <w:rPr>
+                <w:lang w:val="en-US"/>
+              </w:rPr>
+              <w:t>)</w:t>
+            </w:r>
+          </w:p>
+        </w:tc>
+      </w:tr>
+      <w:tr>
+        <w:tc>
+          <w:tcPr>
+            <w:tcW w:w="2122" w:type="dxa"/>
+            <w:tcBorders>
+              <w:top w:val="single" w:sz="4" w:space="0" w:color="auto"/>
+              <w:left w:val="single" w:sz="4" w:space="0" w:color="auto"/>
+              <w:bottom w:val="single" w:sz="4" w:space="0" w:color="auto"/>
+              <w:right w:val="single" w:sz="4" w:space="0" w:color="auto"/>
+            </w:tcBorders>
+            <w:hideMark/>
+          </w:tcPr>
+          <w:p>
+            <w:pPr>
+              <w:spacing w:after="160" w:line="278" w:lineRule="auto"/>
+              <w:rPr>
+                <w:lang w:val="en-US"/>
+              </w:rPr>
+            </w:pPr>
+            <w:r>
+              <w:rPr>
+                <w:lang w:val="en-US"/>
+              </w:rPr>
+              <w:t>Description</w:t>
+            </w:r>
+          </w:p>
+        </w:tc>
+        <w:tc>
+          <w:tcPr>
+            <w:tcW w:w="6894" w:type="dxa"/>
+            <w:tcBorders>
+              <w:top w:val="single" w:sz="4" w:space="0" w:color="auto"/>
+              <w:left w:val="single" w:sz="4" w:space="0" w:color="auto"/>
+              <w:bottom w:val="single" w:sz="4" w:space="0" w:color="auto"/>
+              <w:right w:val="single" w:sz="4" w:space="0" w:color="auto"/>
+            </w:tcBorders>
+            <w:hideMark/>
+          </w:tcPr>
+          <w:p>
+            <w:pPr>
+              <w:spacing w:after="160" w:line="278" w:lineRule="auto"/>
+              <w:rPr>
+                <w:lang w:val="en-US"/>
+              </w:rPr>
+            </w:pPr>
+            <w:r>
+              <w:rPr>
+                <w:lang w:val="en-US"/>
+              </w:rPr>
+              <w:t xml:space="preserve">Allows order price deviation percentage from </w:t>
+            </w:r>
+            <w:proofErr w:type="spellStart"/>
+            <w:r>
+              <w:rPr>
+                <w:lang w:val="en-US"/>
+              </w:rPr>
+              <w:t>BestBid</w:t>
+            </w:r>
+            <w:proofErr w:type="spellEnd"/>
+            <w:r>
+              <w:rPr>
+                <w:lang w:val="en-US"/>
+              </w:rPr>
+              <w:t xml:space="preserve">/Bid (for sell) or </w:t>
+            </w:r>
+            <w:proofErr w:type="spellStart"/>
+            <w:r>
+              <w:rPr>
+                <w:lang w:val="en-US"/>
+              </w:rPr>
+              <w:t>BestOffer</w:t>
+            </w:r>
+            <w:proofErr w:type="spellEnd"/>
+            <w:r>
+              <w:rPr>
+                <w:lang w:val="en-US"/>
+              </w:rPr>
+              <w:t>/Ask (for buy) price till configured limit size</w:t>
+            </w:r>
+          </w:p>
+        </w:tc>
+      </w:tr>
+      <w:tr>
+        <w:tc>
+          <w:tcPr>
+            <w:tcW w:w="2122" w:type="dxa"/>
+            <w:tcBorders>
+              <w:top w:val="single" w:sz="4" w:space="0" w:color="auto"/>
+              <w:left w:val="single" w:sz="4" w:space="0" w:color="auto"/>
+              <w:bottom w:val="single" w:sz="4" w:space="0" w:color="auto"/>
+              <w:right w:val="single" w:sz="4" w:space="0" w:color="auto"/>
+            </w:tcBorders>
+            <w:hideMark/>
+          </w:tcPr>
+          <w:p>
+            <w:pPr>
+              <w:spacing w:after="160" w:line="278" w:lineRule="auto"/>
+              <w:rPr>
+                <w:lang w:val="en-US"/>
+              </w:rPr>
+            </w:pPr>
+            <w:r>
+              <w:rPr>
+                <w:lang w:val="en-US"/>
+              </w:rPr>
+              <w:t>Working</w:t>
+            </w:r>
+          </w:p>
+        </w:tc>
+        <w:tc>
+          <w:tcPr>
+            <w:tcW w:w="6894" w:type="dxa"/>
+            <w:tcBorders>
+              <w:top w:val="single" w:sz="4" w:space="0" w:color="auto"/>
+              <w:left w:val="single" w:sz="4" w:space="0" w:color="auto"/>
+              <w:bottom w:val="single" w:sz="4" w:space="0" w:color="auto"/>
+              <w:right w:val="single" w:sz="4" w:space="0" w:color="auto"/>
+            </w:tcBorders>
+          </w:tcPr>
+          <w:p>
+            <w:pPr>
+              <w:spacing w:after="160" w:line="278" w:lineRule="auto"/>
+              <w:rPr>
+                <w:lang w:val="en-US"/>
+              </w:rPr>
+            </w:pPr>
+            <w:r>
+              <w:rPr>
+                <w:lang w:val="en-US"/>
+              </w:rPr>
+              <w:t>If Limit / LMT is 10, order value are allowed till 10% away from Bid/Ask price on both aggressive and passive side. Order price beyond Limit % will be rejected.</w:t>
+            </w:r>
+          </w:p>
+          <w:p>
+            <w:pPr>
+              <w:spacing w:after="160" w:line="278" w:lineRule="auto"/>
+              <w:rPr>
+                <w:lang w:val="en-US"/>
+              </w:rPr>
+            </w:pPr>
+          </w:p>
+          <w:p>
+            <w:pPr>
+              <w:spacing w:after="160" w:line="278" w:lineRule="auto"/>
+            </w:pPr>
+            <w:r>
+              <w:rPr>
+                <w:lang w:val="en-US"/>
+              </w:rPr>
+              <w:t xml:space="preserve">LMT value should be taken from </w:t>
+            </w:r>
+            <w:proofErr w:type="spellStart"/>
+            <w:r>
+              <w:t>BBOPriceTolerance</w:t>
+            </w:r>
+            <w:proofErr w:type="spellEnd"/>
+          </w:p>
+          <w:p>
+            <w:pPr>
+              <w:spacing w:after="160" w:line="278" w:lineRule="auto"/>
+              <w:rPr>
+                <w:lang w:val="en-US"/>
+              </w:rPr>
+            </w:pPr>
+            <w:r>
+              <w:t>in RMS limits</w:t>
+            </w:r>
+          </w:p>
+          <w:p>
+            <w:pPr>
+              <w:spacing w:after="160" w:line="278" w:lineRule="auto"/>
+              <w:rPr>
+                <w:lang w:val="en-US"/>
+              </w:rPr>
+            </w:pPr>
+          </w:p>
+          <w:p>
+            <w:pPr>
+              <w:spacing w:after="160" w:line="278" w:lineRule="auto"/>
+              <w:rPr>
+                <w:lang w:val="en-US"/>
+              </w:rPr>
+            </w:pPr>
+            <w:r>
+              <w:rPr>
+                <w:lang w:val="en-US"/>
+              </w:rPr>
+              <w:t>BBO for Buy orders  = abs((Ask price - Reference price) / Ask price) *100</w:t>
+            </w:r>
+          </w:p>
+          <w:p>
+            <w:pPr>
+              <w:spacing w:after="160" w:line="278" w:lineRule="auto"/>
+              <w:rPr>
+                <w:lang w:val="en-US"/>
+              </w:rPr>
+            </w:pPr>
+            <w:r>
+              <w:rPr>
+                <w:lang w:val="en-US"/>
+              </w:rPr>
+              <w:t>BBO for Sell orders  = abs((Bid price - Reference price) / Bid price) *100</w:t>
+            </w:r>
+          </w:p>
+          <w:p>
+            <w:pPr>
+              <w:spacing w:after="160" w:line="278" w:lineRule="auto"/>
+              <w:rPr>
+                <w:lang w:val="en-US"/>
+              </w:rPr>
+            </w:pPr>
+          </w:p>
+          <w:p>
+            <w:pPr>
+              <w:spacing w:after="160" w:line="278" w:lineRule="auto"/>
+              <w:rPr>
+                <w:lang w:val="en-US"/>
+              </w:rPr>
+            </w:pPr>
+            <w:r>
+              <w:rPr>
+                <w:lang w:val="en-US"/>
+              </w:rPr>
+              <w:t>Reference price = For Limit order it is Limit price</w:t>
+            </w:r>
+          </w:p>
+          <w:p>
+            <w:pPr>
+              <w:spacing w:after="160" w:line="278" w:lineRule="auto"/>
+              <w:rPr>
+                <w:lang w:val="en-US"/>
+              </w:rPr>
+            </w:pPr>
+            <w:r>
+              <w:rPr>
+                <w:lang w:val="en-US"/>
+              </w:rPr>
+              <w:t xml:space="preserve">For Market orders, it is Bo/Ask for Buy side and Bb/Bid for Sell Side orders, in absence of Ask/Bid prices, it should </w:t>
+            </w:r>
+            <w:proofErr w:type="spellStart"/>
+            <w:r>
+              <w:rPr>
+                <w:lang w:val="en-US"/>
+              </w:rPr>
+              <w:t>fallback</w:t>
+            </w:r>
+            <w:proofErr w:type="spellEnd"/>
+            <w:r>
+              <w:rPr>
+                <w:lang w:val="en-US"/>
+              </w:rPr>
+              <w:t xml:space="preserve"> to last and then fallback to open and should use close price if all other prices are unavailable.</w:t>
+            </w:r>
+          </w:p>
+          <w:p>
+            <w:pPr>
+              <w:spacing w:after="160" w:line="278" w:lineRule="auto"/>
+              <w:rPr>
+                <w:lang w:val="en-US"/>
+              </w:rPr>
+            </w:pPr>
+            <w:r>
+              <w:rPr>
+                <w:lang w:val="en-US"/>
+              </w:rPr>
+              <w:br/>
+              <w:t>ORD is order value, LMT is limit value</w:t>
+            </w:r>
+            <w:r>
+              <w:rPr>
+                <w:lang w:val="en-US"/>
+              </w:rPr>
+              <w:br/>
+              <w:t>Pass: ORD =&lt; LMT</w:t>
+            </w:r>
+          </w:p>
+          <w:p>
+            <w:pPr>
+              <w:spacing w:after="160" w:line="278" w:lineRule="auto"/>
+              <w:rPr>
+                <w:lang w:val="en-US"/>
+              </w:rPr>
+            </w:pPr>
+            <w:r>
+              <w:rPr>
+                <w:lang w:val="en-US"/>
+              </w:rPr>
+              <w:t>Fail: ORD &gt; LMT</w:t>
+            </w:r>
+          </w:p>
+        </w:tc>
+      </w:tr>
+      <w:tr>
+        <w:tc>
+          <w:tcPr>
+            <w:tcW w:w="2122" w:type="dxa"/>
+            <w:tcBorders>
+              <w:top w:val="single" w:sz="4" w:space="0" w:color="auto"/>
+              <w:left w:val="single" w:sz="4" w:space="0" w:color="auto"/>
+              <w:bottom w:val="single" w:sz="4" w:space="0" w:color="auto"/>
+              <w:right w:val="single" w:sz="4" w:space="0" w:color="auto"/>
+            </w:tcBorders>
+            <w:hideMark/>
+          </w:tcPr>
+          <w:p>
+            <w:pPr>
+              <w:spacing w:after="160" w:line="278" w:lineRule="auto"/>
+              <w:rPr>
+                <w:lang w:val="en-US"/>
+              </w:rPr>
+            </w:pPr>
+            <w:r>
+              <w:rPr>
+                <w:lang w:val="en-US"/>
+              </w:rPr>
+              <w:t>Rejection message</w:t>
+            </w:r>
+          </w:p>
+        </w:tc>
+        <w:tc>
+          <w:tcPr>
+            <w:tcW w:w="6894" w:type="dxa"/>
+            <w:tcBorders>
+              <w:top w:val="single" w:sz="4" w:space="0" w:color="auto"/>
+              <w:left w:val="single" w:sz="4" w:space="0" w:color="auto"/>
+              <w:bottom w:val="single" w:sz="4" w:space="0" w:color="auto"/>
+              <w:right w:val="single" w:sz="4" w:space="0" w:color="auto"/>
+            </w:tcBorders>
+            <w:hideMark/>
+          </w:tcPr>
+          <w:p>
+            <w:pPr>
+              <w:spacing w:after="160" w:line="278" w:lineRule="auto"/>
+              <w:rPr>
+                <w:lang w:val="en-US"/>
+              </w:rPr>
+            </w:pPr>
+            <w:r>
+              <w:rPr>
+                <w:lang w:val="en-US"/>
+              </w:rPr>
+              <w:t>BBO Price Tolerance exceeds limit, LMT=$LMT, ORD=$ORD</w:t>
+            </w:r>
+          </w:p>
+        </w:tc>
+      </w:tr>
+      <w:tr>
+        <w:tc>
+          <w:tcPr>
+            <w:tcW w:w="2122" w:type="dxa"/>
+            <w:tcBorders>
+              <w:top w:val="single" w:sz="4" w:space="0" w:color="auto"/>
+              <w:left w:val="single" w:sz="4" w:space="0" w:color="auto"/>
+              <w:bottom w:val="single" w:sz="4" w:space="0" w:color="auto"/>
+              <w:right w:val="single" w:sz="4" w:space="0" w:color="auto"/>
+            </w:tcBorders>
+            <w:hideMark/>
+          </w:tcPr>
+          <w:p>
+            <w:pPr>
+              <w:spacing w:after="160" w:line="278" w:lineRule="auto"/>
+              <w:rPr>
+                <w:lang w:val="en-US"/>
+              </w:rPr>
+            </w:pPr>
+            <w:r>
+              <w:rPr>
+                <w:lang w:val="en-US"/>
+              </w:rPr>
+              <w:lastRenderedPageBreak/>
+              <w:t>Exception handling</w:t>
+            </w:r>
+          </w:p>
+        </w:tc>
+        <w:tc>
+          <w:tcPr>
+            <w:tcW w:w="6894" w:type="dxa"/>
+            <w:tcBorders>
+              <w:top w:val="single" w:sz="4" w:space="0" w:color="auto"/>
+              <w:left w:val="single" w:sz="4" w:space="0" w:color="auto"/>
+              <w:bottom w:val="single" w:sz="4" w:space="0" w:color="auto"/>
+              <w:right w:val="single" w:sz="4" w:space="0" w:color="auto"/>
+            </w:tcBorders>
+            <w:hideMark/>
+          </w:tcPr>
+          <w:p>
+            <w:pPr>
+              <w:spacing w:after="160" w:line="278" w:lineRule="auto"/>
+            </w:pPr>
+            <w:r>
+              <w:rPr>
+                <w:lang w:val="en-US"/>
+              </w:rPr>
+              <w:t xml:space="preserve">If BBO price is not available, based on </w:t>
+            </w:r>
+            <w:proofErr w:type="spellStart"/>
+            <w:r>
+              <w:t>invalid_bbo_price_action</w:t>
+            </w:r>
+            <w:proofErr w:type="spellEnd"/>
+          </w:p>
+          <w:p>
+            <w:pPr>
+              <w:spacing w:after="160" w:line="278" w:lineRule="auto"/>
+            </w:pPr>
+            <w:r>
+              <w:t>Config in limitchecker.ini.</w:t>
+            </w:r>
+            <w:r>
+              <w:br/>
+              <w:t xml:space="preserve">If </w:t>
+            </w:r>
+            <w:proofErr w:type="spellStart"/>
+            <w:r>
+              <w:t>invalid_bbo_price_action</w:t>
+            </w:r>
+            <w:proofErr w:type="spellEnd"/>
+            <w:r>
+              <w:t xml:space="preserve"> = ignore, pass the control with message. “BBO price is missing”</w:t>
+            </w:r>
+          </w:p>
+          <w:p>
+            <w:pPr>
+              <w:spacing w:after="160" w:line="278" w:lineRule="auto"/>
+              <w:rPr>
+                <w:lang w:val="en-US"/>
+              </w:rPr>
+            </w:pPr>
+            <w:r>
+              <w:t xml:space="preserve">If </w:t>
+            </w:r>
+            <w:proofErr w:type="spellStart"/>
+            <w:r>
+              <w:t>invalid_bbo_price_action</w:t>
+            </w:r>
+            <w:proofErr w:type="spellEnd"/>
+            <w:r>
+              <w:t xml:space="preserve"> = reject, reject the control with message. “BBO price is missing”</w:t>
+            </w:r>
+          </w:p>
+        </w:tc>
+      </w:tr>
+      <w:tr>
+        <w:tc>
+          <w:tcPr>
+            <w:tcW w:w="2122" w:type="dxa"/>
+            <w:tcBorders>
+              <w:top w:val="single" w:sz="4" w:space="0" w:color="auto"/>
+              <w:left w:val="single" w:sz="4" w:space="0" w:color="auto"/>
+              <w:bottom w:val="single" w:sz="4" w:space="0" w:color="auto"/>
+              <w:right w:val="single" w:sz="4" w:space="0" w:color="auto"/>
+            </w:tcBorders>
+            <w:hideMark/>
+          </w:tcPr>
+          <w:p>
+            <w:pPr>
+              <w:spacing w:after="160" w:line="278" w:lineRule="auto"/>
+              <w:rPr>
+                <w:lang w:val="en-US"/>
+              </w:rPr>
+            </w:pPr>
+            <w:r>
+              <w:rPr>
+                <w:lang w:val="en-US"/>
+              </w:rPr>
+              <w:t>Example2</w:t>
+            </w:r>
+          </w:p>
+        </w:tc>
+        <w:tc>
+          <w:tcPr>
+            <w:tcW w:w="6894" w:type="dxa"/>
+            <w:tcBorders>
+              <w:top w:val="single" w:sz="4" w:space="0" w:color="auto"/>
+              <w:left w:val="single" w:sz="4" w:space="0" w:color="auto"/>
+              <w:bottom w:val="single" w:sz="4" w:space="0" w:color="auto"/>
+              <w:right w:val="single" w:sz="4" w:space="0" w:color="auto"/>
+            </w:tcBorders>
+            <w:hideMark/>
+          </w:tcPr>
+          <w:p>
+            <w:pPr>
+              <w:spacing w:after="160" w:line="278" w:lineRule="auto"/>
+              <w:rPr>
+                <w:lang w:val="en-US"/>
+              </w:rPr>
+            </w:pPr>
+            <w:r>
+              <w:rPr>
+                <w:lang w:val="en-US"/>
+              </w:rPr>
+              <w:t>LMT is 10%</w:t>
+            </w:r>
+          </w:p>
+          <w:p>
+            <w:pPr>
+              <w:spacing w:after="160" w:line="278" w:lineRule="auto"/>
+              <w:rPr>
+                <w:lang w:val="en-US"/>
+              </w:rPr>
+            </w:pPr>
+            <w:r>
+              <w:rPr>
+                <w:lang w:val="en-US"/>
+              </w:rPr>
+              <w:t>Buy Order</w:t>
+            </w:r>
+            <w:r>
+              <w:rPr>
+                <w:lang w:val="en-US"/>
+              </w:rPr>
+              <w:br/>
+              <w:t>Ask price is 100</w:t>
+            </w:r>
+            <w:r>
+              <w:rPr>
+                <w:lang w:val="en-US"/>
+              </w:rPr>
+              <w:br/>
+              <w:t>Order limit price is 111</w:t>
+            </w:r>
+            <w:r>
+              <w:rPr>
+                <w:lang w:val="en-US"/>
+              </w:rPr>
+              <w:br/>
+              <w:t>ORD = abs((100 – 111)/100)*100 = 11%</w:t>
+            </w:r>
+            <w:r>
+              <w:rPr>
+                <w:lang w:val="en-US"/>
+              </w:rPr>
+              <w:br/>
+              <w:t>ORD &gt; LMT hence order is rejected</w:t>
+            </w:r>
+          </w:p>
+        </w:tc>
+      </w:tr>
+      <w:tr>
+        <w:tc>
+          <w:tcPr>
+            <w:tcW w:w="2122" w:type="dxa"/>
+            <w:tcBorders>
+              <w:top w:val="single" w:sz="4" w:space="0" w:color="auto"/>
+              <w:left w:val="single" w:sz="4" w:space="0" w:color="auto"/>
+              <w:bottom w:val="single" w:sz="4" w:space="0" w:color="auto"/>
+              <w:right w:val="single" w:sz="4" w:space="0" w:color="auto"/>
+            </w:tcBorders>
+            <w:hideMark/>
+          </w:tcPr>
+          <w:p>
+            <w:pPr>
+              <w:spacing w:after="160" w:line="278" w:lineRule="auto"/>
+              <w:rPr>
+                <w:lang w:val="en-US"/>
+              </w:rPr>
+            </w:pPr>
+            <w:r>
+              <w:rPr>
+                <w:lang w:val="en-US"/>
+              </w:rPr>
+              <w:t>Example3</w:t>
+            </w:r>
+          </w:p>
+        </w:tc>
+        <w:tc>
+          <w:tcPr>
+            <w:tcW w:w="6894" w:type="dxa"/>
+            <w:tcBorders>
+              <w:top w:val="single" w:sz="4" w:space="0" w:color="auto"/>
+              <w:left w:val="single" w:sz="4" w:space="0" w:color="auto"/>
+              <w:bottom w:val="single" w:sz="4" w:space="0" w:color="auto"/>
+              <w:right w:val="single" w:sz="4" w:space="0" w:color="auto"/>
+            </w:tcBorders>
+            <w:hideMark/>
+          </w:tcPr>
+          <w:p>
+            <w:pPr>
+              <w:spacing w:after="160" w:line="278" w:lineRule="auto"/>
+              <w:rPr>
+                <w:lang w:val="en-US"/>
+              </w:rPr>
+            </w:pPr>
+            <w:r>
+              <w:rPr>
+                <w:lang w:val="en-US"/>
+              </w:rPr>
+              <w:t>LMT is 10%</w:t>
+            </w:r>
+          </w:p>
+          <w:p>
+            <w:pPr>
+              <w:spacing w:after="160" w:line="278" w:lineRule="auto"/>
+              <w:rPr>
+                <w:lang w:val="en-US"/>
+              </w:rPr>
+            </w:pPr>
+            <w:r>
+              <w:rPr>
+                <w:lang w:val="en-US"/>
+              </w:rPr>
+              <w:t>Buy order</w:t>
+            </w:r>
+            <w:r>
+              <w:rPr>
+                <w:lang w:val="en-US"/>
+              </w:rPr>
+              <w:br/>
+              <w:t>Ask price is 100</w:t>
+            </w:r>
+            <w:r>
+              <w:rPr>
+                <w:lang w:val="en-US"/>
+              </w:rPr>
+              <w:br/>
+              <w:t>Order is a MKT order having reference price as 95</w:t>
+            </w:r>
+            <w:r>
+              <w:rPr>
+                <w:lang w:val="en-US"/>
+              </w:rPr>
+              <w:br/>
+              <w:t>ORD = abs((100 – 95)/100)*100 = 5%</w:t>
+            </w:r>
+            <w:r>
+              <w:rPr>
+                <w:lang w:val="en-US"/>
+              </w:rPr>
+              <w:br/>
+              <w:t>ORD =&lt; LMT hence order passes</w:t>
+            </w:r>
+          </w:p>
+        </w:tc>
+      </w:tr>
+    </w:tbl>
+    <w:p/>
     <w:p/>
     <w:sectPr>
       <w:pgSz w:w="11906" w:h="16838"/>
@@ -3454,7 +5722,6 @@
   <w:style w:type="character" w:default="1" w:styleId="DefaultParagraphFont">
     <w:name w:val="Default Paragraph Font"/>
     <w:uiPriority w:val="1"/>
-    <w:semiHidden/>
     <w:unhideWhenUsed/>
   </w:style>
   <w:style w:type="table" w:default="1" w:styleId="TableNormal">

</xml_diff>

<commit_message>
feat: implement GCE engine, logging, and price caching with a new web-based GUI server
</commit_message>
<xml_diff>
--- a/Requirements/RMS.docx
+++ b/Requirements/RMS.docx
@@ -12,7 +12,21 @@
         <w:rPr>
           <w:lang w:val="en-US"/>
         </w:rPr>
-        <w:t xml:space="preserve">Generate plan for python based RMS (Risk management System) </w:t>
+        <w:t xml:space="preserve">Generate plan for </w:t>
+      </w:r>
+      <w:proofErr w:type="gramStart"/>
+      <w:r>
+        <w:rPr>
+          <w:lang w:val="en-US"/>
+        </w:rPr>
+        <w:t>python based</w:t>
+      </w:r>
+      <w:proofErr w:type="gramEnd"/>
+      <w:r>
+        <w:rPr>
+          <w:lang w:val="en-US"/>
+        </w:rPr>
+        <w:t xml:space="preserve"> RMS (Risk management System) </w:t>
       </w:r>
       <w:r>
         <w:rPr>
@@ -314,7 +328,19 @@
         <w:rPr>
           <w:lang w:val="en-US"/>
         </w:rPr>
-        <w:t xml:space="preserve"> [GCE] [INFO] LMT_CHECK_START</w:t>
+        <w:t xml:space="preserve"> [GCE] </w:t>
+      </w:r>
+      <w:r>
+        <w:rPr>
+          <w:lang w:val="en-US"/>
+        </w:rPr>
+        <w:t xml:space="preserve">[$order-id] </w:t>
+      </w:r>
+      <w:r>
+        <w:rPr>
+          <w:lang w:val="en-US"/>
+        </w:rPr>
+        <w:t>[INFO] LMT_CHECK_START</w:t>
       </w:r>
     </w:p>
     <w:p>
@@ -341,7 +367,65 @@
         <w:rPr>
           <w:lang w:val="en-US"/>
         </w:rPr>
-        <w:t xml:space="preserve"> [GCE] [INFO] LMT_CHECK_NEW or LMT_CHECK_AMEND (NEW for new order and AMEND for Amend order)</w:t>
+        <w:t xml:space="preserve"> [GCE] </w:t>
+      </w:r>
+      <w:r>
+        <w:rPr>
+          <w:lang w:val="en-US"/>
+        </w:rPr>
+        <w:t xml:space="preserve">[$order-id] </w:t>
+      </w:r>
+      <w:r>
+        <w:rPr>
+          <w:lang w:val="en-US"/>
+        </w:rPr>
+        <w:t>[INFO] LMT_CHECK_NEW or LMT_CHECK_AMEND</w:t>
+      </w:r>
+      <w:r>
+        <w:rPr>
+          <w:lang w:val="en-US"/>
+        </w:rPr>
+        <w:t xml:space="preserve"> $side</w:t>
+      </w:r>
+      <w:r>
+        <w:rPr>
+          <w:lang w:val="en-US"/>
+        </w:rPr>
+        <w:t xml:space="preserve"> </w:t>
+      </w:r>
+      <w:r>
+        <w:rPr>
+          <w:lang w:val="en-US"/>
+        </w:rPr>
+        <w:t>$</w:t>
+      </w:r>
+      <w:proofErr w:type="spellStart"/>
+      <w:r>
+        <w:rPr>
+          <w:lang w:val="en-US"/>
+        </w:rPr>
+        <w:t>ric</w:t>
+      </w:r>
+      <w:proofErr w:type="spellEnd"/>
+      <w:r>
+        <w:rPr>
+          <w:lang w:val="en-US"/>
+        </w:rPr>
+        <w:t xml:space="preserve"> $qty@$</w:t>
+      </w:r>
+      <w:proofErr w:type="spellStart"/>
+      <w:r>
+        <w:rPr>
+          <w:lang w:val="en-US"/>
+        </w:rPr>
+        <w:t>ordertype</w:t>
+      </w:r>
+      <w:proofErr w:type="spellEnd"/>
+      <w:r>
+        <w:rPr>
+          <w:lang w:val="en-US"/>
+        </w:rPr>
+        <w:t xml:space="preserve"> $price $currency “PAFTDACXUAT” $Product|$Application|$Flow|$Trader|$Desk|$Account|$Client|$Exchange|$Underlying|$Algo Strategy|$Tif</w:t>
       </w:r>
     </w:p>
     <w:p>
@@ -368,49 +452,21 @@
         <w:rPr>
           <w:lang w:val="en-US"/>
         </w:rPr>
-        <w:t xml:space="preserve"> [GCE] [$</w:t>
-      </w:r>
-      <w:proofErr w:type="spellStart"/>
-      <w:r>
-        <w:rPr>
-          <w:lang w:val="en-US"/>
-        </w:rPr>
-        <w:t>log_level</w:t>
-      </w:r>
-      <w:proofErr w:type="spellEnd"/>
-      <w:r>
-        <w:rPr>
-          <w:lang w:val="en-US"/>
-        </w:rPr>
-        <w:t>] $</w:t>
-      </w:r>
-      <w:proofErr w:type="spellStart"/>
-      <w:r>
-        <w:rPr>
-          <w:lang w:val="en-US"/>
-        </w:rPr>
-        <w:t>Control_Name</w:t>
-      </w:r>
-      <w:proofErr w:type="spellEnd"/>
-      <w:r>
-        <w:rPr>
-          <w:lang w:val="en-US"/>
-        </w:rPr>
-        <w:t xml:space="preserve"> LMT=$limit ORD=$</w:t>
-      </w:r>
-      <w:proofErr w:type="spellStart"/>
-      <w:r>
-        <w:rPr>
-          <w:lang w:val="en-US"/>
-        </w:rPr>
-        <w:t>ord</w:t>
-      </w:r>
-      <w:proofErr w:type="spellEnd"/>
-      <w:r>
-        <w:rPr>
-          <w:lang w:val="en-US"/>
-        </w:rPr>
-        <w:t xml:space="preserve"> (If control passes)</w:t>
+        <w:t xml:space="preserve"> [GCE] [$order-id] [INFO] LMT_MKTDAT $RIC Last=$last, Bid=$bid, </w:t>
+      </w:r>
+      <w:proofErr w:type="gramStart"/>
+      <w:r>
+        <w:rPr>
+          <w:lang w:val="en-US"/>
+        </w:rPr>
+        <w:t>Ask</w:t>
+      </w:r>
+      <w:proofErr w:type="gramEnd"/>
+      <w:r>
+        <w:rPr>
+          <w:lang w:val="en-US"/>
+        </w:rPr>
+        <w:t>=$ask, Open=$open, Close=$close</w:t>
       </w:r>
     </w:p>
     <w:p>
@@ -437,7 +493,19 @@
         <w:rPr>
           <w:lang w:val="en-US"/>
         </w:rPr>
-        <w:t xml:space="preserve"> [GCE] [$</w:t>
+        <w:t xml:space="preserve"> [GCE] </w:t>
+      </w:r>
+      <w:r>
+        <w:rPr>
+          <w:lang w:val="en-US"/>
+        </w:rPr>
+        <w:t xml:space="preserve">[$order-id] </w:t>
+      </w:r>
+      <w:r>
+        <w:rPr>
+          <w:lang w:val="en-US"/>
+        </w:rPr>
+        <w:t>[$</w:t>
       </w:r>
       <w:proofErr w:type="spellStart"/>
       <w:r>
@@ -465,21 +533,21 @@
         <w:rPr>
           <w:lang w:val="en-US"/>
         </w:rPr>
-        <w:t xml:space="preserve"> $</w:t>
+        <w:t xml:space="preserve"> LMT=$limit ORD=$</w:t>
       </w:r>
       <w:proofErr w:type="spellStart"/>
       <w:r>
         <w:rPr>
           <w:lang w:val="en-US"/>
         </w:rPr>
-        <w:t>reject_message</w:t>
+        <w:t>ord</w:t>
       </w:r>
       <w:proofErr w:type="spellEnd"/>
       <w:r>
         <w:rPr>
           <w:lang w:val="en-US"/>
         </w:rPr>
-        <w:t xml:space="preserve"> (If control breaches)</w:t>
+        <w:t xml:space="preserve"> (If control passes)</w:t>
       </w:r>
     </w:p>
     <w:p>
@@ -506,7 +574,19 @@
         <w:rPr>
           <w:lang w:val="en-US"/>
         </w:rPr>
-        <w:t xml:space="preserve"> [GCE] [$</w:t>
+        <w:t xml:space="preserve"> [GCE] </w:t>
+      </w:r>
+      <w:r>
+        <w:rPr>
+          <w:lang w:val="en-US"/>
+        </w:rPr>
+        <w:t xml:space="preserve">[$order-id] </w:t>
+      </w:r>
+      <w:r>
+        <w:rPr>
+          <w:lang w:val="en-US"/>
+        </w:rPr>
+        <w:t>[$</w:t>
       </w:r>
       <w:proofErr w:type="spellStart"/>
       <w:r>
@@ -520,7 +600,35 @@
         <w:rPr>
           <w:lang w:val="en-US"/>
         </w:rPr>
-        <w:t>] n controls validated, x passed, y failed (controls summary)</w:t>
+        <w:t>] $</w:t>
+      </w:r>
+      <w:proofErr w:type="spellStart"/>
+      <w:r>
+        <w:rPr>
+          <w:lang w:val="en-US"/>
+        </w:rPr>
+        <w:t>Control_Name</w:t>
+      </w:r>
+      <w:proofErr w:type="spellEnd"/>
+      <w:r>
+        <w:rPr>
+          <w:lang w:val="en-US"/>
+        </w:rPr>
+        <w:t xml:space="preserve"> $</w:t>
+      </w:r>
+      <w:proofErr w:type="spellStart"/>
+      <w:r>
+        <w:rPr>
+          <w:lang w:val="en-US"/>
+        </w:rPr>
+        <w:t>reject_message</w:t>
+      </w:r>
+      <w:proofErr w:type="spellEnd"/>
+      <w:r>
+        <w:rPr>
+          <w:lang w:val="en-US"/>
+        </w:rPr>
+        <w:t xml:space="preserve"> (If control breaches)</w:t>
       </w:r>
     </w:p>
     <w:p>
@@ -547,49 +655,33 @@
         <w:rPr>
           <w:lang w:val="en-US"/>
         </w:rPr>
-        <w:t xml:space="preserve"> [GCE] [INFO] $</w:t>
+        <w:t xml:space="preserve"> [GCE] </w:t>
+      </w:r>
+      <w:r>
+        <w:rPr>
+          <w:lang w:val="en-US"/>
+        </w:rPr>
+        <w:t xml:space="preserve">[$order-id] </w:t>
+      </w:r>
+      <w:r>
+        <w:rPr>
+          <w:lang w:val="en-US"/>
+        </w:rPr>
+        <w:t>[$</w:t>
       </w:r>
       <w:proofErr w:type="spellStart"/>
       <w:r>
         <w:rPr>
           <w:lang w:val="en-US"/>
         </w:rPr>
-        <w:t>concat</w:t>
+        <w:t>log_level</w:t>
       </w:r>
       <w:proofErr w:type="spellEnd"/>
       <w:r>
         <w:rPr>
           <w:lang w:val="en-US"/>
         </w:rPr>
-        <w:t xml:space="preserve"> of $</w:t>
-      </w:r>
-      <w:proofErr w:type="spellStart"/>
-      <w:r>
-        <w:rPr>
-          <w:lang w:val="en-US"/>
-        </w:rPr>
-        <w:t>reject_message</w:t>
-      </w:r>
-      <w:proofErr w:type="spellEnd"/>
-      <w:r>
-        <w:rPr>
-          <w:lang w:val="en-US"/>
-        </w:rPr>
-        <w:t xml:space="preserve"> (</w:t>
-      </w:r>
-      <w:proofErr w:type="spellStart"/>
-      <w:r>
-        <w:rPr>
-          <w:lang w:val="en-US"/>
-        </w:rPr>
-        <w:t>concat</w:t>
-      </w:r>
-      <w:proofErr w:type="spellEnd"/>
-      <w:r>
-        <w:rPr>
-          <w:lang w:val="en-US"/>
-        </w:rPr>
-        <w:t xml:space="preserve"> of all reject messages by comma)</w:t>
+        <w:t>] n controls validated, x passed, y failed (controls summary)</w:t>
       </w:r>
     </w:p>
     <w:p>
@@ -602,6 +694,7 @@
         <w:rPr>
           <w:lang w:val="en-US"/>
         </w:rPr>
+        <w:lastRenderedPageBreak/>
         <w:t>$</w:t>
       </w:r>
       <w:proofErr w:type="spellStart"/>
@@ -616,7 +709,100 @@
         <w:rPr>
           <w:lang w:val="en-US"/>
         </w:rPr>
-        <w:t xml:space="preserve"> [GCE] [INFO] LMT_CHECK_OVER</w:t>
+        <w:t xml:space="preserve"> [GCE] </w:t>
+      </w:r>
+      <w:r>
+        <w:rPr>
+          <w:lang w:val="en-US"/>
+        </w:rPr>
+        <w:t xml:space="preserve">[$order-id] </w:t>
+      </w:r>
+      <w:r>
+        <w:rPr>
+          <w:lang w:val="en-US"/>
+        </w:rPr>
+        <w:t>[INFO] $</w:t>
+      </w:r>
+      <w:proofErr w:type="spellStart"/>
+      <w:r>
+        <w:rPr>
+          <w:lang w:val="en-US"/>
+        </w:rPr>
+        <w:t>concat</w:t>
+      </w:r>
+      <w:proofErr w:type="spellEnd"/>
+      <w:r>
+        <w:rPr>
+          <w:lang w:val="en-US"/>
+        </w:rPr>
+        <w:t xml:space="preserve"> of $</w:t>
+      </w:r>
+      <w:proofErr w:type="spellStart"/>
+      <w:r>
+        <w:rPr>
+          <w:lang w:val="en-US"/>
+        </w:rPr>
+        <w:t>reject_message</w:t>
+      </w:r>
+      <w:proofErr w:type="spellEnd"/>
+      <w:r>
+        <w:rPr>
+          <w:lang w:val="en-US"/>
+        </w:rPr>
+        <w:t xml:space="preserve"> (</w:t>
+      </w:r>
+      <w:proofErr w:type="spellStart"/>
+      <w:r>
+        <w:rPr>
+          <w:lang w:val="en-US"/>
+        </w:rPr>
+        <w:t>concat</w:t>
+      </w:r>
+      <w:proofErr w:type="spellEnd"/>
+      <w:r>
+        <w:rPr>
+          <w:lang w:val="en-US"/>
+        </w:rPr>
+        <w:t xml:space="preserve"> of all reject messages by comma)</w:t>
+      </w:r>
+    </w:p>
+    <w:p>
+      <w:pPr>
+        <w:rPr>
+          <w:lang w:val="en-US"/>
+        </w:rPr>
+      </w:pPr>
+      <w:r>
+        <w:rPr>
+          <w:lang w:val="en-US"/>
+        </w:rPr>
+        <w:t>$</w:t>
+      </w:r>
+      <w:proofErr w:type="spellStart"/>
+      <w:r>
+        <w:rPr>
+          <w:lang w:val="en-US"/>
+        </w:rPr>
+        <w:t>date_$timestamp</w:t>
+      </w:r>
+      <w:proofErr w:type="spellEnd"/>
+      <w:r>
+        <w:rPr>
+          <w:lang w:val="en-US"/>
+        </w:rPr>
+        <w:t xml:space="preserve"> [GCE] </w:t>
+      </w:r>
+      <w:r>
+        <w:rPr>
+          <w:lang w:val="en-US"/>
+        </w:rPr>
+        <w:t xml:space="preserve">[$order-id] </w:t>
+      </w:r>
+      <w:r>
+        <w:rPr>
+          <w:lang w:val="en-US"/>
+        </w:rPr>
+        <w:t>[INFO] LMT_CHECK_OVER</w:t>
       </w:r>
       <w:r>
         <w:rPr>
@@ -650,7 +836,6 @@
         <w:rPr>
           <w:lang w:val="en-US"/>
         </w:rPr>
-        <w:lastRenderedPageBreak/>
         <w:t>$date = YYYY-MM-DD</w:t>
       </w:r>
     </w:p>
@@ -664,7 +849,21 @@
         <w:rPr>
           <w:lang w:val="en-US"/>
         </w:rPr>
-        <w:t>$timestamp = HH:MM:SS.123456789 (time in nano seconds)</w:t>
+        <w:t>$timestamp = HH:</w:t>
+      </w:r>
+      <w:proofErr w:type="gramStart"/>
+      <w:r>
+        <w:rPr>
+          <w:lang w:val="en-US"/>
+        </w:rPr>
+        <w:t>MM:SS.</w:t>
+      </w:r>
+      <w:proofErr w:type="gramEnd"/>
+      <w:r>
+        <w:rPr>
+          <w:lang w:val="en-US"/>
+        </w:rPr>
+        <w:t>123456789 (time in nano seconds)</w:t>
       </w:r>
     </w:p>
     <w:p>
@@ -858,7 +1057,21 @@
         <w:rPr>
           <w:lang w:val="en-US"/>
         </w:rPr>
-        <w:t xml:space="preserve"> = time taken to do limit checking  (End of limit checking - Start of limit checking)</w:t>
+        <w:t xml:space="preserve"> = time taken to do limit </w:t>
+      </w:r>
+      <w:proofErr w:type="gramStart"/>
+      <w:r>
+        <w:rPr>
+          <w:lang w:val="en-US"/>
+        </w:rPr>
+        <w:t>checking  (</w:t>
+      </w:r>
+      <w:proofErr w:type="gramEnd"/>
+      <w:r>
+        <w:rPr>
+          <w:lang w:val="en-US"/>
+        </w:rPr>
+        <w:t>End of limit checking - Start of limit checking)</w:t>
       </w:r>
     </w:p>
     <w:p>
@@ -959,6 +1172,7 @@
         </w:rPr>
       </w:pPr>
       <w:proofErr w:type="spellStart"/>
+      <w:proofErr w:type="gramStart"/>
       <w:r>
         <w:rPr>
           <w:lang w:val="en-US"/>
@@ -970,7 +1184,14 @@
         <w:rPr>
           <w:lang w:val="en-US"/>
         </w:rPr>
-        <w:t xml:space="preserve">  (implemented)</w:t>
+        <w:t xml:space="preserve">  (</w:t>
+      </w:r>
+      <w:proofErr w:type="gramEnd"/>
+      <w:r>
+        <w:rPr>
+          <w:lang w:val="en-US"/>
+        </w:rPr>
+        <w:t>implemented)</w:t>
       </w:r>
     </w:p>
     <w:p>
@@ -985,6 +1206,7 @@
         </w:rPr>
       </w:pPr>
       <w:proofErr w:type="spellStart"/>
+      <w:proofErr w:type="gramStart"/>
       <w:r>
         <w:rPr>
           <w:lang w:val="en-US"/>
@@ -996,7 +1218,14 @@
         <w:rPr>
           <w:lang w:val="en-US"/>
         </w:rPr>
-        <w:t xml:space="preserve">  (implemented)</w:t>
+        <w:t xml:space="preserve">  (</w:t>
+      </w:r>
+      <w:proofErr w:type="gramEnd"/>
+      <w:r>
+        <w:rPr>
+          <w:lang w:val="en-US"/>
+        </w:rPr>
+        <w:t>implemented)</w:t>
       </w:r>
     </w:p>
     <w:p>
@@ -1204,6 +1433,7 @@
         <w:rPr>
           <w:lang w:val="en-US"/>
         </w:rPr>
+        <w:lastRenderedPageBreak/>
         <w:t>MaxDailyNetValue</w:t>
       </w:r>
       <w:proofErr w:type="spellEnd"/>
@@ -1303,7 +1533,6 @@
         <w:rPr>
           <w:lang w:val="en-US"/>
         </w:rPr>
-        <w:lastRenderedPageBreak/>
         <w:t>Non position checks</w:t>
       </w:r>
     </w:p>
@@ -1729,13 +1958,7 @@
               <w:rPr>
                 <w:lang w:val="en-US"/>
               </w:rPr>
-              <w:t>LMT should be taken from</w:t>
-            </w:r>
-            <w:r>
-              <w:rPr>
-                <w:lang w:val="en-US"/>
-              </w:rPr>
-              <w:t xml:space="preserve"> </w:t>
+              <w:t xml:space="preserve">LMT should be taken from </w:t>
             </w:r>
             <w:proofErr w:type="spellStart"/>
             <w:r>
@@ -1975,7 +2198,21 @@
               <w:rPr>
                 <w:lang w:val="en-US"/>
               </w:rPr>
-              <w:t>, order value are allowed till 1000</w:t>
+              <w:t xml:space="preserve">, order value </w:t>
+            </w:r>
+            <w:proofErr w:type="gramStart"/>
+            <w:r>
+              <w:rPr>
+                <w:lang w:val="en-US"/>
+              </w:rPr>
+              <w:t>are</w:t>
+            </w:r>
+            <w:proofErr w:type="gramEnd"/>
+            <w:r>
+              <w:rPr>
+                <w:lang w:val="en-US"/>
+              </w:rPr>
+              <w:t xml:space="preserve"> allowed till 1000</w:t>
             </w:r>
             <w:r>
               <w:rPr>
@@ -2014,6 +2251,7 @@
               <w:rPr>
                 <w:lang w:val="en-US"/>
               </w:rPr>
+              <w:lastRenderedPageBreak/>
               <w:t xml:space="preserve">LMT should be taken from </w:t>
             </w:r>
             <w:proofErr w:type="spellStart"/>
@@ -2112,7 +2350,6 @@
               <w:rPr>
                 <w:lang w:val="en-US"/>
               </w:rPr>
-              <w:lastRenderedPageBreak/>
               <w:t xml:space="preserve">For Market orders, it is Bo/Ask for Buy side and Bb/Bid for Sell Side orders, in absence of Ask/Bid prices, it should </w:t>
             </w:r>
             <w:proofErr w:type="spellStart"/>
@@ -2700,11 +2937,33 @@
                 <w:lang w:val="en-US"/>
               </w:rPr>
             </w:pPr>
-            <w:r>
-              <w:rPr>
-                <w:lang w:val="en-US"/>
-              </w:rPr>
-              <w:t>CPT  = abs((Close price - Reference price) / Close price) *100</w:t>
+            <w:proofErr w:type="gramStart"/>
+            <w:r>
+              <w:rPr>
+                <w:lang w:val="en-US"/>
+              </w:rPr>
+              <w:t>CPT  =</w:t>
+            </w:r>
+            <w:proofErr w:type="gramEnd"/>
+            <w:r>
+              <w:rPr>
+                <w:lang w:val="en-US"/>
+              </w:rPr>
+              <w:t xml:space="preserve"> </w:t>
+            </w:r>
+            <w:proofErr w:type="gramStart"/>
+            <w:r>
+              <w:rPr>
+                <w:lang w:val="en-US"/>
+              </w:rPr>
+              <w:t>abs(</w:t>
+            </w:r>
+            <w:proofErr w:type="gramEnd"/>
+            <w:r>
+              <w:rPr>
+                <w:lang w:val="en-US"/>
+              </w:rPr>
+              <w:t>(Close price - Reference price) / Close price) *100</w:t>
             </w:r>
           </w:p>
           <w:p>
@@ -2746,21 +3005,27 @@
               <w:rPr>
                 <w:lang w:val="en-US"/>
               </w:rPr>
-              <w:t xml:space="preserve"> to last and then fallback to open and should use close price if all other prices are unavailable.</w:t>
-            </w:r>
-          </w:p>
-          <w:p>
-            <w:pPr>
-              <w:spacing w:after="160" w:line="278" w:lineRule="auto"/>
-              <w:rPr>
-                <w:lang w:val="en-US"/>
-              </w:rPr>
-            </w:pPr>
+              <w:t xml:space="preserve"> to last and </w:t>
+            </w:r>
             <w:r>
               <w:rPr>
                 <w:lang w:val="en-US"/>
               </w:rPr>
               <w:lastRenderedPageBreak/>
+              <w:t>then fallback to open and should use close price if all other prices are unavailable.</w:t>
+            </w:r>
+          </w:p>
+          <w:p>
+            <w:pPr>
+              <w:spacing w:after="160" w:line="278" w:lineRule="auto"/>
+              <w:rPr>
+                <w:lang w:val="en-US"/>
+              </w:rPr>
+            </w:pPr>
+            <w:r>
+              <w:rPr>
+                <w:lang w:val="en-US"/>
+              </w:rPr>
               <w:br/>
               <w:t>ORD is order value, LMT is limit value</w:t>
             </w:r>
@@ -3005,7 +3270,35 @@
                 <w:lang w:val="en-US"/>
               </w:rPr>
               <w:br/>
-              <w:t>ORD = abs((100 – 90)/100)*100 = 10%</w:t>
+              <w:t xml:space="preserve">ORD = </w:t>
+            </w:r>
+            <w:proofErr w:type="gramStart"/>
+            <w:r>
+              <w:rPr>
+                <w:lang w:val="en-US"/>
+              </w:rPr>
+              <w:t>abs(</w:t>
+            </w:r>
+            <w:proofErr w:type="gramEnd"/>
+            <w:r>
+              <w:rPr>
+                <w:lang w:val="en-US"/>
+              </w:rPr>
+              <w:t>(100 – 90)/</w:t>
+            </w:r>
+            <w:proofErr w:type="gramStart"/>
+            <w:r>
+              <w:rPr>
+                <w:lang w:val="en-US"/>
+              </w:rPr>
+              <w:t>100)*</w:t>
+            </w:r>
+            <w:proofErr w:type="gramEnd"/>
+            <w:r>
+              <w:rPr>
+                <w:lang w:val="en-US"/>
+              </w:rPr>
+              <w:t>100 = 10%</w:t>
             </w:r>
             <w:r>
               <w:rPr>
@@ -3087,7 +3380,35 @@
                 <w:lang w:val="en-US"/>
               </w:rPr>
               <w:br/>
-              <w:t>ORD = abs((100 – 111)/100)*100 = 11%</w:t>
+              <w:t xml:space="preserve">ORD = </w:t>
+            </w:r>
+            <w:proofErr w:type="gramStart"/>
+            <w:r>
+              <w:rPr>
+                <w:lang w:val="en-US"/>
+              </w:rPr>
+              <w:t>abs(</w:t>
+            </w:r>
+            <w:proofErr w:type="gramEnd"/>
+            <w:r>
+              <w:rPr>
+                <w:lang w:val="en-US"/>
+              </w:rPr>
+              <w:t>(100 – 111)/</w:t>
+            </w:r>
+            <w:proofErr w:type="gramStart"/>
+            <w:r>
+              <w:rPr>
+                <w:lang w:val="en-US"/>
+              </w:rPr>
+              <w:t>100)*</w:t>
+            </w:r>
+            <w:proofErr w:type="gramEnd"/>
+            <w:r>
+              <w:rPr>
+                <w:lang w:val="en-US"/>
+              </w:rPr>
+              <w:t>100 = 11%</w:t>
             </w:r>
             <w:r>
               <w:rPr>
@@ -3162,14 +3483,56 @@
                 <w:lang w:val="en-US"/>
               </w:rPr>
               <w:br/>
-              <w:t>Order is a MKT order having reference price as 95</w:t>
+              <w:t xml:space="preserve">Order is </w:t>
+            </w:r>
+            <w:proofErr w:type="gramStart"/>
+            <w:r>
+              <w:rPr>
+                <w:lang w:val="en-US"/>
+              </w:rPr>
+              <w:t>a</w:t>
+            </w:r>
+            <w:proofErr w:type="gramEnd"/>
+            <w:r>
+              <w:rPr>
+                <w:lang w:val="en-US"/>
+              </w:rPr>
+              <w:t xml:space="preserve"> MKT order having reference price as 95</w:t>
             </w:r>
             <w:r>
               <w:rPr>
                 <w:lang w:val="en-US"/>
               </w:rPr>
               <w:br/>
-              <w:t>ORD = abs((100 – 95)/100)*100 = 5%</w:t>
+              <w:t xml:space="preserve">ORD = </w:t>
+            </w:r>
+            <w:proofErr w:type="gramStart"/>
+            <w:r>
+              <w:rPr>
+                <w:lang w:val="en-US"/>
+              </w:rPr>
+              <w:t>abs(</w:t>
+            </w:r>
+            <w:proofErr w:type="gramEnd"/>
+            <w:r>
+              <w:rPr>
+                <w:lang w:val="en-US"/>
+              </w:rPr>
+              <w:t>(100 – 95)/</w:t>
+            </w:r>
+            <w:proofErr w:type="gramStart"/>
+            <w:r>
+              <w:rPr>
+                <w:lang w:val="en-US"/>
+              </w:rPr>
+              <w:t>100)*</w:t>
+            </w:r>
+            <w:proofErr w:type="gramEnd"/>
+            <w:r>
+              <w:rPr>
+                <w:lang w:val="en-US"/>
+              </w:rPr>
+              <w:t>100 = 5%</w:t>
             </w:r>
             <w:r>
               <w:rPr>
@@ -3339,6 +3702,7 @@
               <w:rPr>
                 <w:lang w:val="en-US"/>
               </w:rPr>
+              <w:lastRenderedPageBreak/>
               <w:t>Working</w:t>
             </w:r>
           </w:p>
@@ -3364,7 +3728,21 @@
               <w:rPr>
                 <w:lang w:val="en-US"/>
               </w:rPr>
-              <w:t>If Limit / LMT is 10, order value are allowed till 10% away from Last price on both aggressive and passive side. Order price beyond Limit % will be rejected.</w:t>
+              <w:t xml:space="preserve">If Limit / LMT is 10, order value </w:t>
+            </w:r>
+            <w:proofErr w:type="gramStart"/>
+            <w:r>
+              <w:rPr>
+                <w:lang w:val="en-US"/>
+              </w:rPr>
+              <w:t>are</w:t>
+            </w:r>
+            <w:proofErr w:type="gramEnd"/>
+            <w:r>
+              <w:rPr>
+                <w:lang w:val="en-US"/>
+              </w:rPr>
+              <w:t xml:space="preserve"> allowed till 10% away from Last price on both aggressive and passive side. Order price beyond Limit % will be rejected.</w:t>
             </w:r>
           </w:p>
           <w:p>
@@ -3410,11 +3788,33 @@
                 <w:lang w:val="en-US"/>
               </w:rPr>
             </w:pPr>
-            <w:r>
-              <w:rPr>
-                <w:lang w:val="en-US"/>
-              </w:rPr>
-              <w:t>LPT  = abs((Last price - Reference price) / Last price) *100</w:t>
+            <w:proofErr w:type="gramStart"/>
+            <w:r>
+              <w:rPr>
+                <w:lang w:val="en-US"/>
+              </w:rPr>
+              <w:t>LPT  =</w:t>
+            </w:r>
+            <w:proofErr w:type="gramEnd"/>
+            <w:r>
+              <w:rPr>
+                <w:lang w:val="en-US"/>
+              </w:rPr>
+              <w:t xml:space="preserve"> </w:t>
+            </w:r>
+            <w:proofErr w:type="gramStart"/>
+            <w:r>
+              <w:rPr>
+                <w:lang w:val="en-US"/>
+              </w:rPr>
+              <w:t>abs(</w:t>
+            </w:r>
+            <w:proofErr w:type="gramEnd"/>
+            <w:r>
+              <w:rPr>
+                <w:lang w:val="en-US"/>
+              </w:rPr>
+              <w:t>(Last price - Reference price) / Last price) *100</w:t>
             </w:r>
           </w:p>
           <w:p>
@@ -3520,7 +3920,6 @@
               <w:rPr>
                 <w:lang w:val="en-US"/>
               </w:rPr>
-              <w:lastRenderedPageBreak/>
               <w:t>Config</w:t>
             </w:r>
           </w:p>
@@ -3792,7 +4191,35 @@
                 <w:lang w:val="en-US"/>
               </w:rPr>
               <w:br/>
-              <w:t>ORD = abs((100 – 90)/100)*100 = 10%</w:t>
+              <w:t xml:space="preserve">ORD = </w:t>
+            </w:r>
+            <w:proofErr w:type="gramStart"/>
+            <w:r>
+              <w:rPr>
+                <w:lang w:val="en-US"/>
+              </w:rPr>
+              <w:t>abs(</w:t>
+            </w:r>
+            <w:proofErr w:type="gramEnd"/>
+            <w:r>
+              <w:rPr>
+                <w:lang w:val="en-US"/>
+              </w:rPr>
+              <w:t>(100 – 90)/</w:t>
+            </w:r>
+            <w:proofErr w:type="gramStart"/>
+            <w:r>
+              <w:rPr>
+                <w:lang w:val="en-US"/>
+              </w:rPr>
+              <w:t>100)*</w:t>
+            </w:r>
+            <w:proofErr w:type="gramEnd"/>
+            <w:r>
+              <w:rPr>
+                <w:lang w:val="en-US"/>
+              </w:rPr>
+              <w:t>100 = 10%</w:t>
             </w:r>
             <w:r>
               <w:rPr>
@@ -3874,7 +4301,41 @@
                 <w:lang w:val="en-US"/>
               </w:rPr>
               <w:br/>
-              <w:t>ORD = abs((100 – 111)/100)*100 = 11%</w:t>
+            </w:r>
+            <w:r>
+              <w:rPr>
+                <w:lang w:val="en-US"/>
+              </w:rPr>
+              <w:lastRenderedPageBreak/>
+              <w:t xml:space="preserve">ORD = </w:t>
+            </w:r>
+            <w:proofErr w:type="gramStart"/>
+            <w:r>
+              <w:rPr>
+                <w:lang w:val="en-US"/>
+              </w:rPr>
+              <w:t>abs(</w:t>
+            </w:r>
+            <w:proofErr w:type="gramEnd"/>
+            <w:r>
+              <w:rPr>
+                <w:lang w:val="en-US"/>
+              </w:rPr>
+              <w:t>(100 – 111)/</w:t>
+            </w:r>
+            <w:proofErr w:type="gramStart"/>
+            <w:r>
+              <w:rPr>
+                <w:lang w:val="en-US"/>
+              </w:rPr>
+              <w:t>100)*</w:t>
+            </w:r>
+            <w:proofErr w:type="gramEnd"/>
+            <w:r>
+              <w:rPr>
+                <w:lang w:val="en-US"/>
+              </w:rPr>
+              <w:t>100 = 11%</w:t>
             </w:r>
             <w:r>
               <w:rPr>
@@ -3950,14 +4411,56 @@
                 <w:lang w:val="en-US"/>
               </w:rPr>
               <w:br/>
-              <w:t>Order is a MKT order having reference price as 95</w:t>
+              <w:t xml:space="preserve">Order is </w:t>
+            </w:r>
+            <w:proofErr w:type="gramStart"/>
+            <w:r>
+              <w:rPr>
+                <w:lang w:val="en-US"/>
+              </w:rPr>
+              <w:t>a</w:t>
+            </w:r>
+            <w:proofErr w:type="gramEnd"/>
+            <w:r>
+              <w:rPr>
+                <w:lang w:val="en-US"/>
+              </w:rPr>
+              <w:t xml:space="preserve"> MKT order having reference price as 95</w:t>
             </w:r>
             <w:r>
               <w:rPr>
                 <w:lang w:val="en-US"/>
               </w:rPr>
               <w:br/>
-              <w:t>ORD = abs((100 – 95)/100)*100 = 5%</w:t>
+              <w:t xml:space="preserve">ORD = </w:t>
+            </w:r>
+            <w:proofErr w:type="gramStart"/>
+            <w:r>
+              <w:rPr>
+                <w:lang w:val="en-US"/>
+              </w:rPr>
+              <w:t>abs(</w:t>
+            </w:r>
+            <w:proofErr w:type="gramEnd"/>
+            <w:r>
+              <w:rPr>
+                <w:lang w:val="en-US"/>
+              </w:rPr>
+              <w:t>(100 – 95)/</w:t>
+            </w:r>
+            <w:proofErr w:type="gramStart"/>
+            <w:r>
+              <w:rPr>
+                <w:lang w:val="en-US"/>
+              </w:rPr>
+              <w:t>100)*</w:t>
+            </w:r>
+            <w:proofErr w:type="gramEnd"/>
+            <w:r>
+              <w:rPr>
+                <w:lang w:val="en-US"/>
+              </w:rPr>
+              <w:t>100 = 5%</w:t>
             </w:r>
             <w:r>
               <w:rPr>
@@ -4180,7 +4683,21 @@
               <w:rPr>
                 <w:lang w:val="en-US"/>
               </w:rPr>
-              <w:t>If Limit / LMT is 10, order value are allowed till 10% away from Bid/Ask price on both aggressive and passive side. Order price beyond Limit % will be rejected.</w:t>
+              <w:t xml:space="preserve">If Limit / LMT is 10, order value </w:t>
+            </w:r>
+            <w:proofErr w:type="gramStart"/>
+            <w:r>
+              <w:rPr>
+                <w:lang w:val="en-US"/>
+              </w:rPr>
+              <w:t>are</w:t>
+            </w:r>
+            <w:proofErr w:type="gramEnd"/>
+            <w:r>
+              <w:rPr>
+                <w:lang w:val="en-US"/>
+              </w:rPr>
+              <w:t xml:space="preserve"> allowed till 10% away from Bid/Ask price on both aggressive and passive side. Order price beyond Limit % will be rejected.</w:t>
             </w:r>
           </w:p>
           <w:p>
@@ -4237,21 +4754,77 @@
               <w:rPr>
                 <w:lang w:val="en-US"/>
               </w:rPr>
-              <w:t>BBO for Buy orders  = abs((Ask price - Reference price) / Ask price) *100</w:t>
-            </w:r>
-          </w:p>
-          <w:p>
-            <w:pPr>
-              <w:spacing w:after="160" w:line="278" w:lineRule="auto"/>
-              <w:rPr>
-                <w:lang w:val="en-US"/>
-              </w:rPr>
-            </w:pPr>
-            <w:r>
-              <w:rPr>
-                <w:lang w:val="en-US"/>
-              </w:rPr>
-              <w:t>BBO for Sell orders  = abs((Bid price - Reference price) / Bid price) *100</w:t>
+              <w:t xml:space="preserve">BBO for Buy </w:t>
+            </w:r>
+            <w:proofErr w:type="gramStart"/>
+            <w:r>
+              <w:rPr>
+                <w:lang w:val="en-US"/>
+              </w:rPr>
+              <w:t>orders  =</w:t>
+            </w:r>
+            <w:proofErr w:type="gramEnd"/>
+            <w:r>
+              <w:rPr>
+                <w:lang w:val="en-US"/>
+              </w:rPr>
+              <w:t xml:space="preserve"> </w:t>
+            </w:r>
+            <w:proofErr w:type="gramStart"/>
+            <w:r>
+              <w:rPr>
+                <w:lang w:val="en-US"/>
+              </w:rPr>
+              <w:t>abs(</w:t>
+            </w:r>
+            <w:proofErr w:type="gramEnd"/>
+            <w:r>
+              <w:rPr>
+                <w:lang w:val="en-US"/>
+              </w:rPr>
+              <w:t>(Ask price - Reference price) / Ask price) *100</w:t>
+            </w:r>
+          </w:p>
+          <w:p>
+            <w:pPr>
+              <w:spacing w:after="160" w:line="278" w:lineRule="auto"/>
+              <w:rPr>
+                <w:lang w:val="en-US"/>
+              </w:rPr>
+            </w:pPr>
+            <w:r>
+              <w:rPr>
+                <w:lang w:val="en-US"/>
+              </w:rPr>
+              <w:t xml:space="preserve">BBO for Sell </w:t>
+            </w:r>
+            <w:proofErr w:type="gramStart"/>
+            <w:r>
+              <w:rPr>
+                <w:lang w:val="en-US"/>
+              </w:rPr>
+              <w:t>orders  =</w:t>
+            </w:r>
+            <w:proofErr w:type="gramEnd"/>
+            <w:r>
+              <w:rPr>
+                <w:lang w:val="en-US"/>
+              </w:rPr>
+              <w:t xml:space="preserve"> </w:t>
+            </w:r>
+            <w:proofErr w:type="gramStart"/>
+            <w:r>
+              <w:rPr>
+                <w:lang w:val="en-US"/>
+              </w:rPr>
+              <w:t>abs(</w:t>
+            </w:r>
+            <w:proofErr w:type="gramEnd"/>
+            <w:r>
+              <w:rPr>
+                <w:lang w:val="en-US"/>
+              </w:rPr>
+              <w:t>(Bid price - Reference price) / Bid price) *100</w:t>
             </w:r>
           </w:p>
           <w:p>
@@ -4337,6 +4910,7 @@
               <w:rPr>
                 <w:lang w:val="en-US"/>
               </w:rPr>
+              <w:lastRenderedPageBreak/>
               <w:t>Fail: ORD &gt; LMT</w:t>
             </w:r>
           </w:p>
@@ -4365,6 +4939,7 @@
               <w:rPr>
                 <w:lang w:val="en-US"/>
               </w:rPr>
+              <w:lastRenderedPageBreak/>
               <w:t>Rejection message</w:t>
             </w:r>
           </w:p>
@@ -4419,7 +4994,6 @@
               <w:rPr>
                 <w:lang w:val="en-US"/>
               </w:rPr>
-              <w:lastRenderedPageBreak/>
               <w:t>Exception handling</w:t>
             </w:r>
           </w:p>
@@ -4576,7 +5150,35 @@
                 <w:lang w:val="en-US"/>
               </w:rPr>
               <w:br/>
-              <w:t>ORD = abs((100 – 111)/100)*100 = 11%</w:t>
+              <w:t xml:space="preserve">ORD = </w:t>
+            </w:r>
+            <w:proofErr w:type="gramStart"/>
+            <w:r>
+              <w:rPr>
+                <w:lang w:val="en-US"/>
+              </w:rPr>
+              <w:t>abs(</w:t>
+            </w:r>
+            <w:proofErr w:type="gramEnd"/>
+            <w:r>
+              <w:rPr>
+                <w:lang w:val="en-US"/>
+              </w:rPr>
+              <w:t>(100 – 111)/</w:t>
+            </w:r>
+            <w:proofErr w:type="gramStart"/>
+            <w:r>
+              <w:rPr>
+                <w:lang w:val="en-US"/>
+              </w:rPr>
+              <w:t>100)*</w:t>
+            </w:r>
+            <w:proofErr w:type="gramEnd"/>
+            <w:r>
+              <w:rPr>
+                <w:lang w:val="en-US"/>
+              </w:rPr>
+              <w:t>100 = 11%</w:t>
             </w:r>
             <w:r>
               <w:rPr>
@@ -4665,14 +5267,56 @@
                 <w:lang w:val="en-US"/>
               </w:rPr>
               <w:br/>
-              <w:t>Order is a MKT order having reference price as 95</w:t>
+              <w:t xml:space="preserve">Order is </w:t>
+            </w:r>
+            <w:proofErr w:type="gramStart"/>
+            <w:r>
+              <w:rPr>
+                <w:lang w:val="en-US"/>
+              </w:rPr>
+              <w:t>a</w:t>
+            </w:r>
+            <w:proofErr w:type="gramEnd"/>
+            <w:r>
+              <w:rPr>
+                <w:lang w:val="en-US"/>
+              </w:rPr>
+              <w:t xml:space="preserve"> MKT order having reference price as 95</w:t>
             </w:r>
             <w:r>
               <w:rPr>
                 <w:lang w:val="en-US"/>
               </w:rPr>
               <w:br/>
-              <w:t>ORD = abs((100 – 95)/100)*100 = 5%</w:t>
+              <w:t xml:space="preserve">ORD = </w:t>
+            </w:r>
+            <w:proofErr w:type="gramStart"/>
+            <w:r>
+              <w:rPr>
+                <w:lang w:val="en-US"/>
+              </w:rPr>
+              <w:t>abs(</w:t>
+            </w:r>
+            <w:proofErr w:type="gramEnd"/>
+            <w:r>
+              <w:rPr>
+                <w:lang w:val="en-US"/>
+              </w:rPr>
+              <w:t>(100 – 95)/</w:t>
+            </w:r>
+            <w:proofErr w:type="gramStart"/>
+            <w:r>
+              <w:rPr>
+                <w:lang w:val="en-US"/>
+              </w:rPr>
+              <w:t>100)*</w:t>
+            </w:r>
+            <w:proofErr w:type="gramEnd"/>
+            <w:r>
+              <w:rPr>
+                <w:lang w:val="en-US"/>
+              </w:rPr>
+              <w:t>100 = 5%</w:t>
             </w:r>
             <w:r>
               <w:rPr>
@@ -5722,6 +6366,7 @@
   <w:style w:type="character" w:default="1" w:styleId="DefaultParagraphFont">
     <w:name w:val="Default Paragraph Font"/>
     <w:uiPriority w:val="1"/>
+    <w:semiHidden/>
     <w:unhideWhenUsed/>
   </w:style>
   <w:style w:type="table" w:default="1" w:styleId="TableNormal">

</xml_diff>

<commit_message>
Fix position cache and all cache files
</commit_message>
<xml_diff>
--- a/Requirements/RMS.docx
+++ b/Requirements/RMS.docx
@@ -12,21 +12,7 @@
         <w:rPr>
           <w:lang w:val="en-US"/>
         </w:rPr>
-        <w:t xml:space="preserve">Generate plan for </w:t>
-      </w:r>
-      <w:proofErr w:type="gramStart"/>
-      <w:r>
-        <w:rPr>
-          <w:lang w:val="en-US"/>
-        </w:rPr>
-        <w:t>python based</w:t>
-      </w:r>
-      <w:proofErr w:type="gramEnd"/>
-      <w:r>
-        <w:rPr>
-          <w:lang w:val="en-US"/>
-        </w:rPr>
-        <w:t xml:space="preserve"> RMS (Risk management System) </w:t>
+        <w:t xml:space="preserve">Generate plan for python based RMS (Risk management System) </w:t>
       </w:r>
       <w:r>
         <w:rPr>
@@ -108,21 +94,7 @@
         <w:rPr>
           <w:lang w:val="en-US"/>
         </w:rPr>
-        <w:t xml:space="preserve">Create a </w:t>
-      </w:r>
-      <w:proofErr w:type="spellStart"/>
-      <w:r>
-        <w:rPr>
-          <w:lang w:val="en-US"/>
-        </w:rPr>
-        <w:t>InstrumentCache</w:t>
-      </w:r>
-      <w:proofErr w:type="spellEnd"/>
-      <w:r>
-        <w:rPr>
-          <w:lang w:val="en-US"/>
-        </w:rPr>
-        <w:t xml:space="preserve"> (based on csv files loaded in a folder containing Instrument static data</w:t>
+        <w:t>Create a InstrumentCache (based on csv files loaded in a folder containing Instrument static data</w:t>
       </w:r>
       <w:r>
         <w:rPr>
@@ -154,11 +126,9 @@
         </w:rPr>
         <w:t xml:space="preserve">Gets prices for all instruments loaded in Instrument cache through python module </w:t>
       </w:r>
-      <w:proofErr w:type="spellStart"/>
       <w:r>
         <w:t>yfinance</w:t>
       </w:r>
-      <w:proofErr w:type="spellEnd"/>
     </w:p>
     <w:p>
       <w:pPr>
@@ -248,21 +218,7 @@
         <w:rPr>
           <w:lang w:val="en-US"/>
         </w:rPr>
-        <w:t xml:space="preserve">Create a utility to update prices in </w:t>
-      </w:r>
-      <w:proofErr w:type="spellStart"/>
-      <w:r>
-        <w:rPr>
-          <w:lang w:val="en-US"/>
-        </w:rPr>
-        <w:t>pricecache</w:t>
-      </w:r>
-      <w:proofErr w:type="spellEnd"/>
-      <w:r>
-        <w:rPr>
-          <w:lang w:val="en-US"/>
-        </w:rPr>
-        <w:t xml:space="preserve"> (should be allowed to update any/all prices)</w:t>
+        <w:t>Create a utility to update prices in pricecache (should be allowed to update any/all prices)</w:t>
       </w:r>
     </w:p>
     <w:p>
@@ -314,21 +270,7 @@
         <w:rPr>
           <w:lang w:val="en-US"/>
         </w:rPr>
-        <w:t>$</w:t>
-      </w:r>
-      <w:proofErr w:type="spellStart"/>
-      <w:r>
-        <w:rPr>
-          <w:lang w:val="en-US"/>
-        </w:rPr>
-        <w:t>date_$timestamp</w:t>
-      </w:r>
-      <w:proofErr w:type="spellEnd"/>
-      <w:r>
-        <w:rPr>
-          <w:lang w:val="en-US"/>
-        </w:rPr>
-        <w:t xml:space="preserve"> [GCE] </w:t>
+        <w:t xml:space="preserve">$date_$timestamp [GCE] </w:t>
       </w:r>
       <w:r>
         <w:rPr>
@@ -353,21 +295,7 @@
         <w:rPr>
           <w:lang w:val="en-US"/>
         </w:rPr>
-        <w:t>$</w:t>
-      </w:r>
-      <w:proofErr w:type="spellStart"/>
-      <w:r>
-        <w:rPr>
-          <w:lang w:val="en-US"/>
-        </w:rPr>
-        <w:t>date_$timestamp</w:t>
-      </w:r>
-      <w:proofErr w:type="spellEnd"/>
-      <w:r>
-        <w:rPr>
-          <w:lang w:val="en-US"/>
-        </w:rPr>
-        <w:t xml:space="preserve"> [GCE] </w:t>
+        <w:t xml:space="preserve">$date_$timestamp [GCE] </w:t>
       </w:r>
       <w:r>
         <w:rPr>
@@ -397,35 +325,7 @@
         <w:rPr>
           <w:lang w:val="en-US"/>
         </w:rPr>
-        <w:t>$</w:t>
-      </w:r>
-      <w:proofErr w:type="spellStart"/>
-      <w:r>
-        <w:rPr>
-          <w:lang w:val="en-US"/>
-        </w:rPr>
-        <w:t>ric</w:t>
-      </w:r>
-      <w:proofErr w:type="spellEnd"/>
-      <w:r>
-        <w:rPr>
-          <w:lang w:val="en-US"/>
-        </w:rPr>
-        <w:t xml:space="preserve"> $qty@$</w:t>
-      </w:r>
-      <w:proofErr w:type="spellStart"/>
-      <w:r>
-        <w:rPr>
-          <w:lang w:val="en-US"/>
-        </w:rPr>
-        <w:t>ordertype</w:t>
-      </w:r>
-      <w:proofErr w:type="spellEnd"/>
-      <w:r>
-        <w:rPr>
-          <w:lang w:val="en-US"/>
-        </w:rPr>
-        <w:t xml:space="preserve"> $price $currency “PAFTDACXUAT” $Product|$Application|$Flow|$Trader|$Desk|$Account|$Client|$Exchange|$Underlying|$Algo Strategy|$Tif</w:t>
+        <w:t>$ric $qty@$ordertype $price $currency “PAFTDACXUAT” $Product|$Application|$Flow|$Trader|$Desk|$Account|$Client|$Exchange|$Underlying|$Algo Strategy|$Tif</w:t>
       </w:r>
     </w:p>
     <w:p>
@@ -438,35 +338,7 @@
         <w:rPr>
           <w:lang w:val="en-US"/>
         </w:rPr>
-        <w:t>$</w:t>
-      </w:r>
-      <w:proofErr w:type="spellStart"/>
-      <w:r>
-        <w:rPr>
-          <w:lang w:val="en-US"/>
-        </w:rPr>
-        <w:t>date_$timestamp</w:t>
-      </w:r>
-      <w:proofErr w:type="spellEnd"/>
-      <w:r>
-        <w:rPr>
-          <w:lang w:val="en-US"/>
-        </w:rPr>
-        <w:t xml:space="preserve"> [GCE] [$order-id] [INFO] LMT_MKTDAT $RIC Last=$last, Bid=$bid, </w:t>
-      </w:r>
-      <w:proofErr w:type="gramStart"/>
-      <w:r>
-        <w:rPr>
-          <w:lang w:val="en-US"/>
-        </w:rPr>
-        <w:t>Ask</w:t>
-      </w:r>
-      <w:proofErr w:type="gramEnd"/>
-      <w:r>
-        <w:rPr>
-          <w:lang w:val="en-US"/>
-        </w:rPr>
-        <w:t>=$ask, Open=$open, Close=$close</w:t>
+        <w:t>$date_$timestamp [GCE] [$order-id] [INFO] LMT_MKTDAT $RIC Last=$last, Bid=$bid, Ask=$ask, Open=$open, Close=$close</w:t>
       </w:r>
     </w:p>
     <w:p>
@@ -479,21 +351,7 @@
         <w:rPr>
           <w:lang w:val="en-US"/>
         </w:rPr>
-        <w:t>$</w:t>
-      </w:r>
-      <w:proofErr w:type="spellStart"/>
-      <w:r>
-        <w:rPr>
-          <w:lang w:val="en-US"/>
-        </w:rPr>
-        <w:t>date_$timestamp</w:t>
-      </w:r>
-      <w:proofErr w:type="spellEnd"/>
-      <w:r>
-        <w:rPr>
-          <w:lang w:val="en-US"/>
-        </w:rPr>
-        <w:t xml:space="preserve"> [GCE] </w:t>
+        <w:t xml:space="preserve">$date_$timestamp [GCE] </w:t>
       </w:r>
       <w:r>
         <w:rPr>
@@ -505,49 +363,7 @@
         <w:rPr>
           <w:lang w:val="en-US"/>
         </w:rPr>
-        <w:t>[$</w:t>
-      </w:r>
-      <w:proofErr w:type="spellStart"/>
-      <w:r>
-        <w:rPr>
-          <w:lang w:val="en-US"/>
-        </w:rPr>
-        <w:t>log_level</w:t>
-      </w:r>
-      <w:proofErr w:type="spellEnd"/>
-      <w:r>
-        <w:rPr>
-          <w:lang w:val="en-US"/>
-        </w:rPr>
-        <w:t>] $</w:t>
-      </w:r>
-      <w:proofErr w:type="spellStart"/>
-      <w:r>
-        <w:rPr>
-          <w:lang w:val="en-US"/>
-        </w:rPr>
-        <w:t>Control_Name</w:t>
-      </w:r>
-      <w:proofErr w:type="spellEnd"/>
-      <w:r>
-        <w:rPr>
-          <w:lang w:val="en-US"/>
-        </w:rPr>
-        <w:t xml:space="preserve"> LMT=$limit ORD=$</w:t>
-      </w:r>
-      <w:proofErr w:type="spellStart"/>
-      <w:r>
-        <w:rPr>
-          <w:lang w:val="en-US"/>
-        </w:rPr>
-        <w:t>ord</w:t>
-      </w:r>
-      <w:proofErr w:type="spellEnd"/>
-      <w:r>
-        <w:rPr>
-          <w:lang w:val="en-US"/>
-        </w:rPr>
-        <w:t xml:space="preserve"> (If control passes)</w:t>
+        <w:t>[$log_level] $Control_Name LMT=$limit ORD=$ord (If control passes)</w:t>
       </w:r>
     </w:p>
     <w:p>
@@ -560,21 +376,7 @@
         <w:rPr>
           <w:lang w:val="en-US"/>
         </w:rPr>
-        <w:t>$</w:t>
-      </w:r>
-      <w:proofErr w:type="spellStart"/>
-      <w:r>
-        <w:rPr>
-          <w:lang w:val="en-US"/>
-        </w:rPr>
-        <w:t>date_$timestamp</w:t>
-      </w:r>
-      <w:proofErr w:type="spellEnd"/>
-      <w:r>
-        <w:rPr>
-          <w:lang w:val="en-US"/>
-        </w:rPr>
-        <w:t xml:space="preserve"> [GCE] </w:t>
+        <w:t xml:space="preserve">$date_$timestamp [GCE] </w:t>
       </w:r>
       <w:r>
         <w:rPr>
@@ -586,49 +388,7 @@
         <w:rPr>
           <w:lang w:val="en-US"/>
         </w:rPr>
-        <w:t>[$</w:t>
-      </w:r>
-      <w:proofErr w:type="spellStart"/>
-      <w:r>
-        <w:rPr>
-          <w:lang w:val="en-US"/>
-        </w:rPr>
-        <w:t>log_level</w:t>
-      </w:r>
-      <w:proofErr w:type="spellEnd"/>
-      <w:r>
-        <w:rPr>
-          <w:lang w:val="en-US"/>
-        </w:rPr>
-        <w:t>] $</w:t>
-      </w:r>
-      <w:proofErr w:type="spellStart"/>
-      <w:r>
-        <w:rPr>
-          <w:lang w:val="en-US"/>
-        </w:rPr>
-        <w:t>Control_Name</w:t>
-      </w:r>
-      <w:proofErr w:type="spellEnd"/>
-      <w:r>
-        <w:rPr>
-          <w:lang w:val="en-US"/>
-        </w:rPr>
-        <w:t xml:space="preserve"> $</w:t>
-      </w:r>
-      <w:proofErr w:type="spellStart"/>
-      <w:r>
-        <w:rPr>
-          <w:lang w:val="en-US"/>
-        </w:rPr>
-        <w:t>reject_message</w:t>
-      </w:r>
-      <w:proofErr w:type="spellEnd"/>
-      <w:r>
-        <w:rPr>
-          <w:lang w:val="en-US"/>
-        </w:rPr>
-        <w:t xml:space="preserve"> (If control breaches)</w:t>
+        <w:t>[$log_level] $Control_Name $reject_message (If control breaches)</w:t>
       </w:r>
     </w:p>
     <w:p>
@@ -641,21 +401,7 @@
         <w:rPr>
           <w:lang w:val="en-US"/>
         </w:rPr>
-        <w:t>$</w:t>
-      </w:r>
-      <w:proofErr w:type="spellStart"/>
-      <w:r>
-        <w:rPr>
-          <w:lang w:val="en-US"/>
-        </w:rPr>
-        <w:t>date_$timestamp</w:t>
-      </w:r>
-      <w:proofErr w:type="spellEnd"/>
-      <w:r>
-        <w:rPr>
-          <w:lang w:val="en-US"/>
-        </w:rPr>
-        <w:t xml:space="preserve"> [GCE] </w:t>
+        <w:t xml:space="preserve">$date_$timestamp [GCE] </w:t>
       </w:r>
       <w:r>
         <w:rPr>
@@ -667,21 +413,7 @@
         <w:rPr>
           <w:lang w:val="en-US"/>
         </w:rPr>
-        <w:t>[$</w:t>
-      </w:r>
-      <w:proofErr w:type="spellStart"/>
-      <w:r>
-        <w:rPr>
-          <w:lang w:val="en-US"/>
-        </w:rPr>
-        <w:t>log_level</w:t>
-      </w:r>
-      <w:proofErr w:type="spellEnd"/>
-      <w:r>
-        <w:rPr>
-          <w:lang w:val="en-US"/>
-        </w:rPr>
-        <w:t>] n controls validated, x passed, y failed (controls summary)</w:t>
+        <w:t>[$log_level] n controls validated, x passed, y failed (controls summary)</w:t>
       </w:r>
     </w:p>
     <w:p>
@@ -695,21 +427,7 @@
           <w:lang w:val="en-US"/>
         </w:rPr>
         <w:lastRenderedPageBreak/>
-        <w:t>$</w:t>
-      </w:r>
-      <w:proofErr w:type="spellStart"/>
-      <w:r>
-        <w:rPr>
-          <w:lang w:val="en-US"/>
-        </w:rPr>
-        <w:t>date_$timestamp</w:t>
-      </w:r>
-      <w:proofErr w:type="spellEnd"/>
-      <w:r>
-        <w:rPr>
-          <w:lang w:val="en-US"/>
-        </w:rPr>
-        <w:t xml:space="preserve"> [GCE] </w:t>
+        <w:t xml:space="preserve">$date_$timestamp [GCE] </w:t>
       </w:r>
       <w:r>
         <w:rPr>
@@ -721,49 +439,7 @@
         <w:rPr>
           <w:lang w:val="en-US"/>
         </w:rPr>
-        <w:t>[INFO] $</w:t>
-      </w:r>
-      <w:proofErr w:type="spellStart"/>
-      <w:r>
-        <w:rPr>
-          <w:lang w:val="en-US"/>
-        </w:rPr>
-        <w:t>concat</w:t>
-      </w:r>
-      <w:proofErr w:type="spellEnd"/>
-      <w:r>
-        <w:rPr>
-          <w:lang w:val="en-US"/>
-        </w:rPr>
-        <w:t xml:space="preserve"> of $</w:t>
-      </w:r>
-      <w:proofErr w:type="spellStart"/>
-      <w:r>
-        <w:rPr>
-          <w:lang w:val="en-US"/>
-        </w:rPr>
-        <w:t>reject_message</w:t>
-      </w:r>
-      <w:proofErr w:type="spellEnd"/>
-      <w:r>
-        <w:rPr>
-          <w:lang w:val="en-US"/>
-        </w:rPr>
-        <w:t xml:space="preserve"> (</w:t>
-      </w:r>
-      <w:proofErr w:type="spellStart"/>
-      <w:r>
-        <w:rPr>
-          <w:lang w:val="en-US"/>
-        </w:rPr>
-        <w:t>concat</w:t>
-      </w:r>
-      <w:proofErr w:type="spellEnd"/>
-      <w:r>
-        <w:rPr>
-          <w:lang w:val="en-US"/>
-        </w:rPr>
-        <w:t xml:space="preserve"> of all reject messages by comma)</w:t>
+        <w:t>[INFO] $concat of $reject_message (concat of all reject messages by comma)</w:t>
       </w:r>
     </w:p>
     <w:p>
@@ -776,21 +452,7 @@
         <w:rPr>
           <w:lang w:val="en-US"/>
         </w:rPr>
-        <w:t>$</w:t>
-      </w:r>
-      <w:proofErr w:type="spellStart"/>
-      <w:r>
-        <w:rPr>
-          <w:lang w:val="en-US"/>
-        </w:rPr>
-        <w:t>date_$timestamp</w:t>
-      </w:r>
-      <w:proofErr w:type="spellEnd"/>
-      <w:r>
-        <w:rPr>
-          <w:lang w:val="en-US"/>
-        </w:rPr>
-        <w:t xml:space="preserve"> [GCE] </w:t>
+        <w:t xml:space="preserve">$date_$timestamp [GCE] </w:t>
       </w:r>
       <w:r>
         <w:rPr>
@@ -808,16 +470,8 @@
         <w:rPr>
           <w:lang w:val="en-US"/>
         </w:rPr>
-        <w:t xml:space="preserve"> in $</w:t>
-      </w:r>
-      <w:proofErr w:type="spellStart"/>
-      <w:r>
-        <w:rPr>
-          <w:lang w:val="en-US"/>
-        </w:rPr>
-        <w:t>limit_time</w:t>
-      </w:r>
-      <w:proofErr w:type="spellEnd"/>
+        <w:t xml:space="preserve"> in $limit_time</w:t>
+      </w:r>
     </w:p>
     <w:p>
       <w:pPr>
@@ -849,21 +503,7 @@
         <w:rPr>
           <w:lang w:val="en-US"/>
         </w:rPr>
-        <w:t>$timestamp = HH:</w:t>
-      </w:r>
-      <w:proofErr w:type="gramStart"/>
-      <w:r>
-        <w:rPr>
-          <w:lang w:val="en-US"/>
-        </w:rPr>
-        <w:t>MM:SS.</w:t>
-      </w:r>
-      <w:proofErr w:type="gramEnd"/>
-      <w:r>
-        <w:rPr>
-          <w:lang w:val="en-US"/>
-        </w:rPr>
-        <w:t>123456789 (time in nano seconds)</w:t>
+        <w:t>$timestamp = HH:MM:SS.123456789 (time in nano seconds)</w:t>
       </w:r>
     </w:p>
     <w:p>
@@ -876,21 +516,7 @@
         <w:rPr>
           <w:lang w:val="en-US"/>
         </w:rPr>
-        <w:t>$</w:t>
-      </w:r>
-      <w:proofErr w:type="spellStart"/>
-      <w:r>
-        <w:rPr>
-          <w:lang w:val="en-US"/>
-        </w:rPr>
-        <w:t>log_level</w:t>
-      </w:r>
-      <w:proofErr w:type="spellEnd"/>
-      <w:r>
-        <w:rPr>
-          <w:lang w:val="en-US"/>
-        </w:rPr>
-        <w:t xml:space="preserve"> = INFO for information</w:t>
+        <w:t>$log_level = INFO for information</w:t>
       </w:r>
     </w:p>
     <w:p>
@@ -963,21 +589,7 @@
         <w:rPr>
           <w:lang w:val="en-US"/>
         </w:rPr>
-        <w:t>$</w:t>
-      </w:r>
-      <w:proofErr w:type="spellStart"/>
-      <w:r>
-        <w:rPr>
-          <w:lang w:val="en-US"/>
-        </w:rPr>
-        <w:t>Control_Name</w:t>
-      </w:r>
-      <w:proofErr w:type="spellEnd"/>
-      <w:r>
-        <w:rPr>
-          <w:lang w:val="en-US"/>
-        </w:rPr>
-        <w:t xml:space="preserve"> = Control Name</w:t>
+        <w:t>$Control_Name = Control Name</w:t>
       </w:r>
     </w:p>
     <w:p>
@@ -1016,21 +628,7 @@
         <w:rPr>
           <w:lang w:val="en-US"/>
         </w:rPr>
-        <w:t>$</w:t>
-      </w:r>
-      <w:proofErr w:type="spellStart"/>
-      <w:r>
-        <w:rPr>
-          <w:lang w:val="en-US"/>
-        </w:rPr>
-        <w:t>reject_message</w:t>
-      </w:r>
-      <w:proofErr w:type="spellEnd"/>
-      <w:r>
-        <w:rPr>
-          <w:lang w:val="en-US"/>
-        </w:rPr>
-        <w:t xml:space="preserve"> = Rejection message</w:t>
+        <w:t>$reject_message = Rejection message</w:t>
       </w:r>
     </w:p>
     <w:p>
@@ -1043,35 +641,7 @@
         <w:rPr>
           <w:lang w:val="en-US"/>
         </w:rPr>
-        <w:t>$</w:t>
-      </w:r>
-      <w:proofErr w:type="spellStart"/>
-      <w:r>
-        <w:rPr>
-          <w:lang w:val="en-US"/>
-        </w:rPr>
-        <w:t>limit_time</w:t>
-      </w:r>
-      <w:proofErr w:type="spellEnd"/>
-      <w:r>
-        <w:rPr>
-          <w:lang w:val="en-US"/>
-        </w:rPr>
-        <w:t xml:space="preserve"> = time taken to do limit </w:t>
-      </w:r>
-      <w:proofErr w:type="gramStart"/>
-      <w:r>
-        <w:rPr>
-          <w:lang w:val="en-US"/>
-        </w:rPr>
-        <w:t>checking  (</w:t>
-      </w:r>
-      <w:proofErr w:type="gramEnd"/>
-      <w:r>
-        <w:rPr>
-          <w:lang w:val="en-US"/>
-        </w:rPr>
-        <w:t>End of limit checking - Start of limit checking)</w:t>
+        <w:t>$limit_time = time taken to do limit checking  (End of limit checking - Start of limit checking)</w:t>
       </w:r>
     </w:p>
     <w:p>
@@ -1145,14 +715,12 @@
           <w:lang w:val="en-US"/>
         </w:rPr>
       </w:pPr>
-      <w:proofErr w:type="spellStart"/>
       <w:r>
         <w:rPr>
           <w:lang w:val="en-US"/>
         </w:rPr>
         <w:t>MaxOrderSize</w:t>
       </w:r>
-      <w:proofErr w:type="spellEnd"/>
       <w:r>
         <w:rPr>
           <w:lang w:val="en-US"/>
@@ -1171,27 +739,17 @@
           <w:lang w:val="en-US"/>
         </w:rPr>
       </w:pPr>
-      <w:proofErr w:type="spellStart"/>
-      <w:proofErr w:type="gramStart"/>
       <w:r>
         <w:rPr>
           <w:lang w:val="en-US"/>
         </w:rPr>
         <w:t>MaxOrderPrice</w:t>
       </w:r>
-      <w:proofErr w:type="spellEnd"/>
-      <w:r>
-        <w:rPr>
-          <w:lang w:val="en-US"/>
-        </w:rPr>
-        <w:t xml:space="preserve">  (</w:t>
-      </w:r>
-      <w:proofErr w:type="gramEnd"/>
-      <w:r>
-        <w:rPr>
-          <w:lang w:val="en-US"/>
-        </w:rPr>
-        <w:t>implemented)</w:t>
+      <w:r>
+        <w:rPr>
+          <w:lang w:val="en-US"/>
+        </w:rPr>
+        <w:t xml:space="preserve">  (implemented)</w:t>
       </w:r>
     </w:p>
     <w:p>
@@ -1205,27 +763,17 @@
           <w:lang w:val="en-US"/>
         </w:rPr>
       </w:pPr>
-      <w:proofErr w:type="spellStart"/>
-      <w:proofErr w:type="gramStart"/>
       <w:r>
         <w:rPr>
           <w:lang w:val="en-US"/>
         </w:rPr>
         <w:t>MaxOrderValue</w:t>
       </w:r>
-      <w:proofErr w:type="spellEnd"/>
-      <w:r>
-        <w:rPr>
-          <w:lang w:val="en-US"/>
-        </w:rPr>
-        <w:t xml:space="preserve">  (</w:t>
-      </w:r>
-      <w:proofErr w:type="gramEnd"/>
-      <w:r>
-        <w:rPr>
-          <w:lang w:val="en-US"/>
-        </w:rPr>
-        <w:t>implemented)</w:t>
+      <w:r>
+        <w:rPr>
+          <w:lang w:val="en-US"/>
+        </w:rPr>
+        <w:t xml:space="preserve">  (implemented)</w:t>
       </w:r>
     </w:p>
     <w:p>
@@ -1239,14 +787,12 @@
           <w:lang w:val="en-US"/>
         </w:rPr>
       </w:pPr>
-      <w:proofErr w:type="spellStart"/>
       <w:r>
         <w:rPr>
           <w:lang w:val="en-US"/>
         </w:rPr>
         <w:t>MaxOrderADV</w:t>
       </w:r>
-      <w:proofErr w:type="spellEnd"/>
     </w:p>
     <w:p>
       <w:pPr>
@@ -1277,14 +823,12 @@
           <w:lang w:val="en-US"/>
         </w:rPr>
       </w:pPr>
-      <w:proofErr w:type="spellStart"/>
       <w:r>
         <w:rPr>
           <w:lang w:val="en-US"/>
         </w:rPr>
         <w:t>ClosePriceTolerance</w:t>
       </w:r>
-      <w:proofErr w:type="spellEnd"/>
     </w:p>
     <w:p>
       <w:pPr>
@@ -1297,14 +841,12 @@
           <w:lang w:val="en-US"/>
         </w:rPr>
       </w:pPr>
-      <w:proofErr w:type="spellStart"/>
       <w:r>
         <w:rPr>
           <w:lang w:val="en-US"/>
         </w:rPr>
         <w:t>LastPriceTolerance</w:t>
       </w:r>
-      <w:proofErr w:type="spellEnd"/>
     </w:p>
     <w:p>
       <w:pPr>
@@ -1317,14 +859,12 @@
           <w:lang w:val="en-US"/>
         </w:rPr>
       </w:pPr>
-      <w:proofErr w:type="spellStart"/>
       <w:r>
         <w:rPr>
           <w:lang w:val="en-US"/>
         </w:rPr>
         <w:t>BBOTolerance</w:t>
       </w:r>
-      <w:proofErr w:type="spellEnd"/>
     </w:p>
     <w:p>
       <w:pPr>
@@ -1337,14 +877,12 @@
           <w:lang w:val="en-US"/>
         </w:rPr>
       </w:pPr>
-      <w:proofErr w:type="spellStart"/>
       <w:r>
         <w:rPr>
           <w:lang w:val="en-US"/>
         </w:rPr>
         <w:t>MarketDepthCheck</w:t>
       </w:r>
-      <w:proofErr w:type="spellEnd"/>
     </w:p>
     <w:p>
       <w:pPr>
@@ -1388,14 +926,12 @@
           <w:lang w:val="en-US"/>
         </w:rPr>
       </w:pPr>
-      <w:proofErr w:type="spellStart"/>
       <w:r>
         <w:rPr>
           <w:lang w:val="en-US"/>
         </w:rPr>
         <w:t>MaxDailyVolume</w:t>
       </w:r>
-      <w:proofErr w:type="spellEnd"/>
     </w:p>
     <w:p>
       <w:pPr>
@@ -1408,14 +944,12 @@
           <w:lang w:val="en-US"/>
         </w:rPr>
       </w:pPr>
-      <w:proofErr w:type="spellStart"/>
       <w:r>
         <w:rPr>
           <w:lang w:val="en-US"/>
         </w:rPr>
         <w:t>MaxDailyValue</w:t>
       </w:r>
-      <w:proofErr w:type="spellEnd"/>
     </w:p>
     <w:p>
       <w:pPr>
@@ -1428,7 +962,6 @@
           <w:lang w:val="en-US"/>
         </w:rPr>
       </w:pPr>
-      <w:proofErr w:type="spellStart"/>
       <w:r>
         <w:rPr>
           <w:lang w:val="en-US"/>
@@ -1436,7 +969,6 @@
         <w:lastRenderedPageBreak/>
         <w:t>MaxDailyNetValue</w:t>
       </w:r>
-      <w:proofErr w:type="spellEnd"/>
     </w:p>
     <w:p>
       <w:pPr>
@@ -1449,14 +981,12 @@
           <w:lang w:val="en-US"/>
         </w:rPr>
       </w:pPr>
-      <w:proofErr w:type="spellStart"/>
       <w:r>
         <w:rPr>
           <w:lang w:val="en-US"/>
         </w:rPr>
         <w:t>MaxDailyTurnover</w:t>
       </w:r>
-      <w:proofErr w:type="spellEnd"/>
     </w:p>
     <w:p>
       <w:pPr>
@@ -1469,14 +999,12 @@
           <w:lang w:val="en-US"/>
         </w:rPr>
       </w:pPr>
-      <w:proofErr w:type="spellStart"/>
       <w:r>
         <w:rPr>
           <w:lang w:val="en-US"/>
         </w:rPr>
         <w:t>MaxDailyExposure</w:t>
       </w:r>
-      <w:proofErr w:type="spellEnd"/>
     </w:p>
     <w:p>
       <w:pPr>
@@ -1489,14 +1017,12 @@
           <w:lang w:val="en-US"/>
         </w:rPr>
       </w:pPr>
-      <w:proofErr w:type="spellStart"/>
       <w:r>
         <w:rPr>
           <w:lang w:val="en-US"/>
         </w:rPr>
         <w:t>MaxDailyOpenValue</w:t>
       </w:r>
-      <w:proofErr w:type="spellEnd"/>
     </w:p>
     <w:p>
       <w:pPr>
@@ -1509,14 +1035,12 @@
           <w:lang w:val="en-US"/>
         </w:rPr>
       </w:pPr>
-      <w:proofErr w:type="spellStart"/>
       <w:r>
         <w:rPr>
           <w:lang w:val="en-US"/>
         </w:rPr>
         <w:t>MaxDailyActiveOrders</w:t>
       </w:r>
-      <w:proofErr w:type="spellEnd"/>
     </w:p>
     <w:p>
       <w:pPr>
@@ -1547,14 +1071,12 @@
           <w:lang w:val="en-US"/>
         </w:rPr>
       </w:pPr>
-      <w:proofErr w:type="spellStart"/>
       <w:r>
         <w:rPr>
           <w:lang w:val="en-US"/>
         </w:rPr>
         <w:t>DuplicateOrders</w:t>
       </w:r>
-      <w:proofErr w:type="spellEnd"/>
     </w:p>
     <w:p>
       <w:pPr>
@@ -1567,14 +1089,12 @@
           <w:lang w:val="en-US"/>
         </w:rPr>
       </w:pPr>
-      <w:proofErr w:type="spellStart"/>
       <w:r>
         <w:rPr>
           <w:lang w:val="en-US"/>
         </w:rPr>
         <w:t>BurstOrders</w:t>
       </w:r>
-      <w:proofErr w:type="spellEnd"/>
     </w:p>
     <w:p>
       <w:pPr>
@@ -1731,11 +1251,9 @@
               <w:br/>
               <w:t xml:space="preserve">LMT should be taken from </w:t>
             </w:r>
-            <w:proofErr w:type="spellStart"/>
             <w:r>
               <w:t>MaxOrderSize</w:t>
             </w:r>
-            <w:proofErr w:type="spellEnd"/>
             <w:r>
               <w:rPr>
                 <w:lang w:val="en-US"/>
@@ -1960,11 +1478,9 @@
               </w:rPr>
               <w:t xml:space="preserve">LMT should be taken from </w:t>
             </w:r>
-            <w:proofErr w:type="spellStart"/>
             <w:r>
               <w:t>MaxOrderPrice</w:t>
             </w:r>
-            <w:proofErr w:type="spellEnd"/>
             <w:r>
               <w:rPr>
                 <w:lang w:val="en-US"/>
@@ -2198,21 +1714,7 @@
               <w:rPr>
                 <w:lang w:val="en-US"/>
               </w:rPr>
-              <w:t xml:space="preserve">, order value </w:t>
-            </w:r>
-            <w:proofErr w:type="gramStart"/>
-            <w:r>
-              <w:rPr>
-                <w:lang w:val="en-US"/>
-              </w:rPr>
-              <w:t>are</w:t>
-            </w:r>
-            <w:proofErr w:type="gramEnd"/>
-            <w:r>
-              <w:rPr>
-                <w:lang w:val="en-US"/>
-              </w:rPr>
-              <w:t xml:space="preserve"> allowed till 1000</w:t>
+              <w:t>, order value are allowed till 1000</w:t>
             </w:r>
             <w:r>
               <w:rPr>
@@ -2254,11 +1756,9 @@
               <w:lastRenderedPageBreak/>
               <w:t xml:space="preserve">LMT should be taken from </w:t>
             </w:r>
-            <w:proofErr w:type="spellStart"/>
             <w:r>
               <w:t>MaxOrderValue</w:t>
             </w:r>
-            <w:proofErr w:type="spellEnd"/>
             <w:r>
               <w:t xml:space="preserve"> </w:t>
             </w:r>
@@ -2304,21 +1804,7 @@
               <w:rPr>
                 <w:lang w:val="en-US"/>
               </w:rPr>
-              <w:t xml:space="preserve"> * </w:t>
-            </w:r>
-            <w:proofErr w:type="spellStart"/>
-            <w:r>
-              <w:rPr>
-                <w:lang w:val="en-US"/>
-              </w:rPr>
-              <w:t>xr</w:t>
-            </w:r>
-            <w:proofErr w:type="spellEnd"/>
-            <w:r>
-              <w:rPr>
-                <w:lang w:val="en-US"/>
-              </w:rPr>
-              <w:t xml:space="preserve"> rate (FX rate to be used if Order Currency is different from Limit currency)</w:t>
+              <w:t xml:space="preserve"> * xr rate (FX rate to be used if Order Currency is different from Limit currency)</w:t>
             </w:r>
           </w:p>
           <w:p>
@@ -2350,21 +1836,7 @@
               <w:rPr>
                 <w:lang w:val="en-US"/>
               </w:rPr>
-              <w:t xml:space="preserve">For Market orders, it is Bo/Ask for Buy side and Bb/Bid for Sell Side orders, in absence of Ask/Bid prices, it should </w:t>
-            </w:r>
-            <w:proofErr w:type="spellStart"/>
-            <w:r>
-              <w:rPr>
-                <w:lang w:val="en-US"/>
-              </w:rPr>
-              <w:t>fallback</w:t>
-            </w:r>
-            <w:proofErr w:type="spellEnd"/>
-            <w:r>
-              <w:rPr>
-                <w:lang w:val="en-US"/>
-              </w:rPr>
-              <w:t xml:space="preserve"> to last and then fallback to open and should use close price if all other prices are unavailable.</w:t>
+              <w:t>For Market orders, it is Bo/Ask for Buy side and Bb/Bid for Sell Side orders, in absence of Ask/Bid prices, it should fallback to last and then fallback to open and should use close price if all other prices are unavailable.</w:t>
             </w:r>
           </w:p>
           <w:p>
@@ -2518,49 +1990,7 @@
               <w:rPr>
                 <w:lang w:val="en-US"/>
               </w:rPr>
-              <w:t xml:space="preserve">If </w:t>
-            </w:r>
-            <w:proofErr w:type="spellStart"/>
-            <w:r>
-              <w:rPr>
-                <w:lang w:val="en-US"/>
-              </w:rPr>
-              <w:t>xr</w:t>
-            </w:r>
-            <w:proofErr w:type="spellEnd"/>
-            <w:r>
-              <w:rPr>
-                <w:lang w:val="en-US"/>
-              </w:rPr>
-              <w:t xml:space="preserve"> rate is 0.13 (to be get from </w:t>
-            </w:r>
-            <w:proofErr w:type="spellStart"/>
-            <w:r>
-              <w:rPr>
-                <w:lang w:val="en-US"/>
-              </w:rPr>
-              <w:t>yfinance</w:t>
-            </w:r>
-            <w:proofErr w:type="spellEnd"/>
-            <w:r>
-              <w:rPr>
-                <w:lang w:val="en-US"/>
-              </w:rPr>
-              <w:t xml:space="preserve"> as HKD=X as ticker to get </w:t>
-            </w:r>
-            <w:proofErr w:type="spellStart"/>
-            <w:r>
-              <w:rPr>
-                <w:lang w:val="en-US"/>
-              </w:rPr>
-              <w:t>fx</w:t>
-            </w:r>
-            <w:proofErr w:type="spellEnd"/>
-            <w:r>
-              <w:rPr>
-                <w:lang w:val="en-US"/>
-              </w:rPr>
-              <w:t xml:space="preserve"> price)</w:t>
+              <w:t>If xr rate is 0.13 (to be get from yfinance as HKD=X as ticker to get fx price)</w:t>
             </w:r>
           </w:p>
           <w:p>
@@ -2637,49 +2067,7 @@
               <w:rPr>
                 <w:lang w:val="en-US"/>
               </w:rPr>
-              <w:t xml:space="preserve">If </w:t>
-            </w:r>
-            <w:proofErr w:type="spellStart"/>
-            <w:r>
-              <w:rPr>
-                <w:lang w:val="en-US"/>
-              </w:rPr>
-              <w:t>xr</w:t>
-            </w:r>
-            <w:proofErr w:type="spellEnd"/>
-            <w:r>
-              <w:rPr>
-                <w:lang w:val="en-US"/>
-              </w:rPr>
-              <w:t xml:space="preserve"> rate is 0.13 (to be get from </w:t>
-            </w:r>
-            <w:proofErr w:type="spellStart"/>
-            <w:r>
-              <w:rPr>
-                <w:lang w:val="en-US"/>
-              </w:rPr>
-              <w:t>yfinance</w:t>
-            </w:r>
-            <w:proofErr w:type="spellEnd"/>
-            <w:r>
-              <w:rPr>
-                <w:lang w:val="en-US"/>
-              </w:rPr>
-              <w:t xml:space="preserve"> as HKD=X as ticker to get </w:t>
-            </w:r>
-            <w:proofErr w:type="spellStart"/>
-            <w:r>
-              <w:rPr>
-                <w:lang w:val="en-US"/>
-              </w:rPr>
-              <w:t>fx</w:t>
-            </w:r>
-            <w:proofErr w:type="spellEnd"/>
-            <w:r>
-              <w:rPr>
-                <w:lang w:val="en-US"/>
-              </w:rPr>
-              <w:t xml:space="preserve"> price)</w:t>
+              <w:t>If xr rate is 0.13 (to be get from yfinance as HKD=X as ticker to get fx price)</w:t>
             </w:r>
           </w:p>
           <w:p>
@@ -2771,21 +2159,7 @@
               <w:rPr>
                 <w:lang w:val="en-US"/>
               </w:rPr>
-              <w:t>Close Price Tolerance (</w:t>
-            </w:r>
-            <w:proofErr w:type="spellStart"/>
-            <w:r>
-              <w:rPr>
-                <w:lang w:val="en-US"/>
-              </w:rPr>
-              <w:t>cpt</w:t>
-            </w:r>
-            <w:proofErr w:type="spellEnd"/>
-            <w:r>
-              <w:rPr>
-                <w:lang w:val="en-US"/>
-              </w:rPr>
-              <w:t>)</w:t>
+              <w:t>Close Price Tolerance (cpt)</w:t>
             </w:r>
           </w:p>
         </w:tc>
@@ -2915,55 +2289,28 @@
               </w:rPr>
               <w:t xml:space="preserve">LMT value should be taken from </w:t>
             </w:r>
-            <w:proofErr w:type="spellStart"/>
-            <w:r>
-              <w:t>ClosePriceTolerance</w:t>
-            </w:r>
-            <w:proofErr w:type="spellEnd"/>
-            <w:r>
-              <w:t xml:space="preserve"> in RMS limits</w:t>
-            </w:r>
-            <w:r>
-              <w:rPr>
-                <w:lang w:val="en-US"/>
-              </w:rPr>
-              <w:br/>
-            </w:r>
-          </w:p>
-          <w:p>
-            <w:pPr>
-              <w:spacing w:after="160" w:line="278" w:lineRule="auto"/>
-              <w:rPr>
-                <w:lang w:val="en-US"/>
-              </w:rPr>
-            </w:pPr>
-            <w:proofErr w:type="gramStart"/>
-            <w:r>
-              <w:rPr>
-                <w:lang w:val="en-US"/>
-              </w:rPr>
-              <w:t>CPT  =</w:t>
-            </w:r>
-            <w:proofErr w:type="gramEnd"/>
-            <w:r>
-              <w:rPr>
-                <w:lang w:val="en-US"/>
-              </w:rPr>
-              <w:t xml:space="preserve"> </w:t>
-            </w:r>
-            <w:proofErr w:type="gramStart"/>
-            <w:r>
-              <w:rPr>
-                <w:lang w:val="en-US"/>
-              </w:rPr>
-              <w:t>abs(</w:t>
-            </w:r>
-            <w:proofErr w:type="gramEnd"/>
-            <w:r>
-              <w:rPr>
-                <w:lang w:val="en-US"/>
-              </w:rPr>
-              <w:t>(Close price - Reference price) / Close price) *100</w:t>
+            <w:r>
+              <w:t>ClosePriceTolerance in RMS limits</w:t>
+            </w:r>
+            <w:r>
+              <w:rPr>
+                <w:lang w:val="en-US"/>
+              </w:rPr>
+              <w:br/>
+            </w:r>
+          </w:p>
+          <w:p>
+            <w:pPr>
+              <w:spacing w:after="160" w:line="278" w:lineRule="auto"/>
+              <w:rPr>
+                <w:lang w:val="en-US"/>
+              </w:rPr>
+            </w:pPr>
+            <w:r>
+              <w:rPr>
+                <w:lang w:val="en-US"/>
+              </w:rPr>
+              <w:t>CPT  = abs((Close price - Reference price) / Close price) *100</w:t>
             </w:r>
           </w:p>
           <w:p>
@@ -2991,21 +2338,7 @@
               <w:rPr>
                 <w:lang w:val="en-US"/>
               </w:rPr>
-              <w:t xml:space="preserve">For Market orders, it is Bo/Ask for Buy side and Bb/Bid for Sell Side orders, in absence of Ask/Bid prices, it should </w:t>
-            </w:r>
-            <w:proofErr w:type="spellStart"/>
-            <w:r>
-              <w:rPr>
-                <w:lang w:val="en-US"/>
-              </w:rPr>
-              <w:t>fallback</w:t>
-            </w:r>
-            <w:proofErr w:type="spellEnd"/>
-            <w:r>
-              <w:rPr>
-                <w:lang w:val="en-US"/>
-              </w:rPr>
-              <w:t xml:space="preserve"> to last and </w:t>
+              <w:t xml:space="preserve">For Market orders, it is Bo/Ask for Buy side and Bb/Bid for Sell Side orders, in absence of Ask/Bid prices, it should fallback to last and </w:t>
             </w:r>
             <w:r>
               <w:rPr>
@@ -3156,11 +2489,9 @@
               </w:rPr>
               <w:t xml:space="preserve">If Close price is not available, based on </w:t>
             </w:r>
-            <w:proofErr w:type="spellStart"/>
             <w:r>
               <w:t>invalid_close_price_action</w:t>
             </w:r>
-            <w:proofErr w:type="spellEnd"/>
           </w:p>
           <w:p>
             <w:pPr>
@@ -3171,31 +2502,15 @@
             </w:r>
             <w:r>
               <w:br/>
-              <w:t xml:space="preserve">If </w:t>
-            </w:r>
-            <w:proofErr w:type="spellStart"/>
-            <w:r>
-              <w:t>invalid_close_price_action</w:t>
-            </w:r>
-            <w:proofErr w:type="spellEnd"/>
-            <w:r>
-              <w:t xml:space="preserve"> = ignore, pass the control with message. “Close price is missing”</w:t>
-            </w:r>
-          </w:p>
-          <w:p>
-            <w:pPr>
-              <w:spacing w:after="160" w:line="278" w:lineRule="auto"/>
-            </w:pPr>
-            <w:r>
-              <w:t xml:space="preserve">If </w:t>
-            </w:r>
-            <w:proofErr w:type="spellStart"/>
-            <w:r>
-              <w:t>invalid_close_price_action</w:t>
-            </w:r>
-            <w:proofErr w:type="spellEnd"/>
-            <w:r>
-              <w:t xml:space="preserve"> = reject, reject the control with message. “Close price is missing”</w:t>
+              <w:t>If invalid_close_price_action = ignore, pass the control with message. “Close price is missing”</w:t>
+            </w:r>
+          </w:p>
+          <w:p>
+            <w:pPr>
+              <w:spacing w:after="160" w:line="278" w:lineRule="auto"/>
+            </w:pPr>
+            <w:r>
+              <w:t>If invalid_close_price_action = reject, reject the control with message. “Close price is missing”</w:t>
             </w:r>
           </w:p>
         </w:tc>
@@ -3270,35 +2585,7 @@
                 <w:lang w:val="en-US"/>
               </w:rPr>
               <w:br/>
-              <w:t xml:space="preserve">ORD = </w:t>
-            </w:r>
-            <w:proofErr w:type="gramStart"/>
-            <w:r>
-              <w:rPr>
-                <w:lang w:val="en-US"/>
-              </w:rPr>
-              <w:t>abs(</w:t>
-            </w:r>
-            <w:proofErr w:type="gramEnd"/>
-            <w:r>
-              <w:rPr>
-                <w:lang w:val="en-US"/>
-              </w:rPr>
-              <w:t>(100 – 90)/</w:t>
-            </w:r>
-            <w:proofErr w:type="gramStart"/>
-            <w:r>
-              <w:rPr>
-                <w:lang w:val="en-US"/>
-              </w:rPr>
-              <w:t>100)*</w:t>
-            </w:r>
-            <w:proofErr w:type="gramEnd"/>
-            <w:r>
-              <w:rPr>
-                <w:lang w:val="en-US"/>
-              </w:rPr>
-              <w:t>100 = 10%</w:t>
+              <w:t>ORD = abs((100 – 90)/100)*100 = 10%</w:t>
             </w:r>
             <w:r>
               <w:rPr>
@@ -3380,35 +2667,7 @@
                 <w:lang w:val="en-US"/>
               </w:rPr>
               <w:br/>
-              <w:t xml:space="preserve">ORD = </w:t>
-            </w:r>
-            <w:proofErr w:type="gramStart"/>
-            <w:r>
-              <w:rPr>
-                <w:lang w:val="en-US"/>
-              </w:rPr>
-              <w:t>abs(</w:t>
-            </w:r>
-            <w:proofErr w:type="gramEnd"/>
-            <w:r>
-              <w:rPr>
-                <w:lang w:val="en-US"/>
-              </w:rPr>
-              <w:t>(100 – 111)/</w:t>
-            </w:r>
-            <w:proofErr w:type="gramStart"/>
-            <w:r>
-              <w:rPr>
-                <w:lang w:val="en-US"/>
-              </w:rPr>
-              <w:t>100)*</w:t>
-            </w:r>
-            <w:proofErr w:type="gramEnd"/>
-            <w:r>
-              <w:rPr>
-                <w:lang w:val="en-US"/>
-              </w:rPr>
-              <w:t>100 = 11%</w:t>
+              <w:t>ORD = abs((100 – 111)/100)*100 = 11%</w:t>
             </w:r>
             <w:r>
               <w:rPr>
@@ -3483,56 +2742,14 @@
                 <w:lang w:val="en-US"/>
               </w:rPr>
               <w:br/>
-              <w:t xml:space="preserve">Order is </w:t>
-            </w:r>
-            <w:proofErr w:type="gramStart"/>
-            <w:r>
-              <w:rPr>
-                <w:lang w:val="en-US"/>
-              </w:rPr>
-              <w:t>a</w:t>
-            </w:r>
-            <w:proofErr w:type="gramEnd"/>
-            <w:r>
-              <w:rPr>
-                <w:lang w:val="en-US"/>
-              </w:rPr>
-              <w:t xml:space="preserve"> MKT order having reference price as 95</w:t>
-            </w:r>
-            <w:r>
-              <w:rPr>
-                <w:lang w:val="en-US"/>
-              </w:rPr>
-              <w:br/>
-              <w:t xml:space="preserve">ORD = </w:t>
-            </w:r>
-            <w:proofErr w:type="gramStart"/>
-            <w:r>
-              <w:rPr>
-                <w:lang w:val="en-US"/>
-              </w:rPr>
-              <w:t>abs(</w:t>
-            </w:r>
-            <w:proofErr w:type="gramEnd"/>
-            <w:r>
-              <w:rPr>
-                <w:lang w:val="en-US"/>
-              </w:rPr>
-              <w:t>(100 – 95)/</w:t>
-            </w:r>
-            <w:proofErr w:type="gramStart"/>
-            <w:r>
-              <w:rPr>
-                <w:lang w:val="en-US"/>
-              </w:rPr>
-              <w:t>100)*</w:t>
-            </w:r>
-            <w:proofErr w:type="gramEnd"/>
-            <w:r>
-              <w:rPr>
-                <w:lang w:val="en-US"/>
-              </w:rPr>
-              <w:t>100 = 5%</w:t>
+              <w:t>Order is a MKT order having reference price as 95</w:t>
+            </w:r>
+            <w:r>
+              <w:rPr>
+                <w:lang w:val="en-US"/>
+              </w:rPr>
+              <w:br/>
+              <w:t>ORD = abs((100 – 95)/100)*100 = 5%</w:t>
             </w:r>
             <w:r>
               <w:rPr>
@@ -3606,21 +2823,7 @@
               <w:rPr>
                 <w:lang w:val="en-US"/>
               </w:rPr>
-              <w:t>Last Price Tolerance (</w:t>
-            </w:r>
-            <w:proofErr w:type="spellStart"/>
-            <w:r>
-              <w:rPr>
-                <w:lang w:val="en-US"/>
-              </w:rPr>
-              <w:t>lpt</w:t>
-            </w:r>
-            <w:proofErr w:type="spellEnd"/>
-            <w:r>
-              <w:rPr>
-                <w:lang w:val="en-US"/>
-              </w:rPr>
-              <w:t>)</w:t>
+              <w:t>Last Price Tolerance (lpt)</w:t>
             </w:r>
           </w:p>
         </w:tc>
@@ -3728,21 +2931,7 @@
               <w:rPr>
                 <w:lang w:val="en-US"/>
               </w:rPr>
-              <w:t xml:space="preserve">If Limit / LMT is 10, order value </w:t>
-            </w:r>
-            <w:proofErr w:type="gramStart"/>
-            <w:r>
-              <w:rPr>
-                <w:lang w:val="en-US"/>
-              </w:rPr>
-              <w:t>are</w:t>
-            </w:r>
-            <w:proofErr w:type="gramEnd"/>
-            <w:r>
-              <w:rPr>
-                <w:lang w:val="en-US"/>
-              </w:rPr>
-              <w:t xml:space="preserve"> allowed till 10% away from Last price on both aggressive and passive side. Order price beyond Limit % will be rejected.</w:t>
+              <w:t>If Limit / LMT is 10, order value are allowed till 10% away from Last price on both aggressive and passive side. Order price beyond Limit % will be rejected.</w:t>
             </w:r>
           </w:p>
           <w:p>
@@ -3766,55 +2955,28 @@
               </w:rPr>
               <w:t>LMT value should be taken from Last</w:t>
             </w:r>
-            <w:proofErr w:type="spellStart"/>
-            <w:r>
-              <w:t>PriceTolerance</w:t>
-            </w:r>
-            <w:proofErr w:type="spellEnd"/>
-            <w:r>
-              <w:t xml:space="preserve"> in RMS limits</w:t>
-            </w:r>
-            <w:r>
-              <w:rPr>
-                <w:lang w:val="en-US"/>
-              </w:rPr>
-              <w:br/>
-            </w:r>
-          </w:p>
-          <w:p>
-            <w:pPr>
-              <w:spacing w:after="160" w:line="278" w:lineRule="auto"/>
-              <w:rPr>
-                <w:lang w:val="en-US"/>
-              </w:rPr>
-            </w:pPr>
-            <w:proofErr w:type="gramStart"/>
-            <w:r>
-              <w:rPr>
-                <w:lang w:val="en-US"/>
-              </w:rPr>
-              <w:t>LPT  =</w:t>
-            </w:r>
-            <w:proofErr w:type="gramEnd"/>
-            <w:r>
-              <w:rPr>
-                <w:lang w:val="en-US"/>
-              </w:rPr>
-              <w:t xml:space="preserve"> </w:t>
-            </w:r>
-            <w:proofErr w:type="gramStart"/>
-            <w:r>
-              <w:rPr>
-                <w:lang w:val="en-US"/>
-              </w:rPr>
-              <w:t>abs(</w:t>
-            </w:r>
-            <w:proofErr w:type="gramEnd"/>
-            <w:r>
-              <w:rPr>
-                <w:lang w:val="en-US"/>
-              </w:rPr>
-              <w:t>(Last price - Reference price) / Last price) *100</w:t>
+            <w:r>
+              <w:t>PriceTolerance in RMS limits</w:t>
+            </w:r>
+            <w:r>
+              <w:rPr>
+                <w:lang w:val="en-US"/>
+              </w:rPr>
+              <w:br/>
+            </w:r>
+          </w:p>
+          <w:p>
+            <w:pPr>
+              <w:spacing w:after="160" w:line="278" w:lineRule="auto"/>
+              <w:rPr>
+                <w:lang w:val="en-US"/>
+              </w:rPr>
+            </w:pPr>
+            <w:r>
+              <w:rPr>
+                <w:lang w:val="en-US"/>
+              </w:rPr>
+              <w:t>LPT  = abs((Last price - Reference price) / Last price) *100</w:t>
             </w:r>
           </w:p>
           <w:p>
@@ -3842,21 +3004,7 @@
               <w:rPr>
                 <w:lang w:val="en-US"/>
               </w:rPr>
-              <w:t xml:space="preserve">For Market orders, it is Bo/Ask for Buy side and Bb/Bid for Sell Side orders, in absence of Ask/Bid prices, it should </w:t>
-            </w:r>
-            <w:proofErr w:type="spellStart"/>
-            <w:r>
-              <w:rPr>
-                <w:lang w:val="en-US"/>
-              </w:rPr>
-              <w:t>fallback</w:t>
-            </w:r>
-            <w:proofErr w:type="spellEnd"/>
-            <w:r>
-              <w:rPr>
-                <w:lang w:val="en-US"/>
-              </w:rPr>
-              <w:t xml:space="preserve"> to last and then fallback to open and should use close price if all other prices are unavailable.</w:t>
+              <w:t>For Market orders, it is Bo/Ask for Buy side and Bb/Bid for Sell Side orders, in absence of Ask/Bid prices, it should fallback to last and then fallback to open and should use close price if all other prices are unavailable.</w:t>
             </w:r>
           </w:p>
           <w:p>
@@ -3953,21 +3101,7 @@
                 <w:lang w:val="en-US"/>
               </w:rPr>
               <w:br/>
-              <w:t xml:space="preserve">Based on the above config, last price can be </w:t>
-            </w:r>
-            <w:proofErr w:type="spellStart"/>
-            <w:r>
-              <w:rPr>
-                <w:lang w:val="en-US"/>
-              </w:rPr>
-              <w:t>overrriden</w:t>
-            </w:r>
-            <w:proofErr w:type="spellEnd"/>
-            <w:r>
-              <w:rPr>
-                <w:lang w:val="en-US"/>
-              </w:rPr>
-              <w:t xml:space="preserve"> with the configured price</w:t>
+              <w:t>Based on the above config, last price can be overrriden with the configured price</w:t>
             </w:r>
           </w:p>
         </w:tc>
@@ -4074,11 +3208,9 @@
               </w:rPr>
               <w:t xml:space="preserve">If Last price is not available, based on </w:t>
             </w:r>
-            <w:proofErr w:type="spellStart"/>
             <w:r>
               <w:t>invalid_last_price_action</w:t>
             </w:r>
-            <w:proofErr w:type="spellEnd"/>
           </w:p>
           <w:p>
             <w:pPr>
@@ -4089,34 +3221,18 @@
             </w:r>
             <w:r>
               <w:br/>
-              <w:t xml:space="preserve">If </w:t>
-            </w:r>
-            <w:proofErr w:type="spellStart"/>
-            <w:r>
-              <w:t>invalid_last_price_action</w:t>
-            </w:r>
-            <w:proofErr w:type="spellEnd"/>
-            <w:r>
-              <w:t xml:space="preserve"> = ignore, pass the control with message. “Last price is missing”</w:t>
-            </w:r>
-          </w:p>
-          <w:p>
-            <w:pPr>
-              <w:spacing w:after="160" w:line="278" w:lineRule="auto"/>
-              <w:rPr>
-                <w:lang w:val="en-US"/>
-              </w:rPr>
-            </w:pPr>
-            <w:r>
-              <w:t xml:space="preserve">If </w:t>
-            </w:r>
-            <w:proofErr w:type="spellStart"/>
-            <w:r>
-              <w:t>invalid_last_price_action</w:t>
-            </w:r>
-            <w:proofErr w:type="spellEnd"/>
-            <w:r>
-              <w:t xml:space="preserve"> = reject, reject the control with message. “Last price is missing”</w:t>
+              <w:t>If invalid_last_price_action = ignore, pass the control with message. “Last price is missing”</w:t>
+            </w:r>
+          </w:p>
+          <w:p>
+            <w:pPr>
+              <w:spacing w:after="160" w:line="278" w:lineRule="auto"/>
+              <w:rPr>
+                <w:lang w:val="en-US"/>
+              </w:rPr>
+            </w:pPr>
+            <w:r>
+              <w:t>If invalid_last_price_action = reject, reject the control with message. “Last price is missing”</w:t>
             </w:r>
           </w:p>
         </w:tc>
@@ -4191,35 +3307,7 @@
                 <w:lang w:val="en-US"/>
               </w:rPr>
               <w:br/>
-              <w:t xml:space="preserve">ORD = </w:t>
-            </w:r>
-            <w:proofErr w:type="gramStart"/>
-            <w:r>
-              <w:rPr>
-                <w:lang w:val="en-US"/>
-              </w:rPr>
-              <w:t>abs(</w:t>
-            </w:r>
-            <w:proofErr w:type="gramEnd"/>
-            <w:r>
-              <w:rPr>
-                <w:lang w:val="en-US"/>
-              </w:rPr>
-              <w:t>(100 – 90)/</w:t>
-            </w:r>
-            <w:proofErr w:type="gramStart"/>
-            <w:r>
-              <w:rPr>
-                <w:lang w:val="en-US"/>
-              </w:rPr>
-              <w:t>100)*</w:t>
-            </w:r>
-            <w:proofErr w:type="gramEnd"/>
-            <w:r>
-              <w:rPr>
-                <w:lang w:val="en-US"/>
-              </w:rPr>
-              <w:t>100 = 10%</w:t>
+              <w:t>ORD = abs((100 – 90)/100)*100 = 10%</w:t>
             </w:r>
             <w:r>
               <w:rPr>
@@ -4307,35 +3395,7 @@
                 <w:lang w:val="en-US"/>
               </w:rPr>
               <w:lastRenderedPageBreak/>
-              <w:t xml:space="preserve">ORD = </w:t>
-            </w:r>
-            <w:proofErr w:type="gramStart"/>
-            <w:r>
-              <w:rPr>
-                <w:lang w:val="en-US"/>
-              </w:rPr>
-              <w:t>abs(</w:t>
-            </w:r>
-            <w:proofErr w:type="gramEnd"/>
-            <w:r>
-              <w:rPr>
-                <w:lang w:val="en-US"/>
-              </w:rPr>
-              <w:t>(100 – 111)/</w:t>
-            </w:r>
-            <w:proofErr w:type="gramStart"/>
-            <w:r>
-              <w:rPr>
-                <w:lang w:val="en-US"/>
-              </w:rPr>
-              <w:t>100)*</w:t>
-            </w:r>
-            <w:proofErr w:type="gramEnd"/>
-            <w:r>
-              <w:rPr>
-                <w:lang w:val="en-US"/>
-              </w:rPr>
-              <w:t>100 = 11%</w:t>
+              <w:t>ORD = abs((100 – 111)/100)*100 = 11%</w:t>
             </w:r>
             <w:r>
               <w:rPr>
@@ -4411,56 +3471,14 @@
                 <w:lang w:val="en-US"/>
               </w:rPr>
               <w:br/>
-              <w:t xml:space="preserve">Order is </w:t>
-            </w:r>
-            <w:proofErr w:type="gramStart"/>
-            <w:r>
-              <w:rPr>
-                <w:lang w:val="en-US"/>
-              </w:rPr>
-              <w:t>a</w:t>
-            </w:r>
-            <w:proofErr w:type="gramEnd"/>
-            <w:r>
-              <w:rPr>
-                <w:lang w:val="en-US"/>
-              </w:rPr>
-              <w:t xml:space="preserve"> MKT order having reference price as 95</w:t>
-            </w:r>
-            <w:r>
-              <w:rPr>
-                <w:lang w:val="en-US"/>
-              </w:rPr>
-              <w:br/>
-              <w:t xml:space="preserve">ORD = </w:t>
-            </w:r>
-            <w:proofErr w:type="gramStart"/>
-            <w:r>
-              <w:rPr>
-                <w:lang w:val="en-US"/>
-              </w:rPr>
-              <w:t>abs(</w:t>
-            </w:r>
-            <w:proofErr w:type="gramEnd"/>
-            <w:r>
-              <w:rPr>
-                <w:lang w:val="en-US"/>
-              </w:rPr>
-              <w:t>(100 – 95)/</w:t>
-            </w:r>
-            <w:proofErr w:type="gramStart"/>
-            <w:r>
-              <w:rPr>
-                <w:lang w:val="en-US"/>
-              </w:rPr>
-              <w:t>100)*</w:t>
-            </w:r>
-            <w:proofErr w:type="gramEnd"/>
-            <w:r>
-              <w:rPr>
-                <w:lang w:val="en-US"/>
-              </w:rPr>
-              <w:t>100 = 5%</w:t>
+              <w:t>Order is a MKT order having reference price as 95</w:t>
+            </w:r>
+            <w:r>
+              <w:rPr>
+                <w:lang w:val="en-US"/>
+              </w:rPr>
+              <w:br/>
+              <w:t>ORD = abs((100 – 95)/100)*100 = 5%</w:t>
             </w:r>
             <w:r>
               <w:rPr>
@@ -4536,7 +3554,6 @@
               </w:rPr>
               <w:t>BBO Price Tolerance (</w:t>
             </w:r>
-            <w:proofErr w:type="spellStart"/>
             <w:r>
               <w:rPr>
                 <w:lang w:val="en-US"/>
@@ -4547,14 +3564,7 @@
               <w:rPr>
                 <w:lang w:val="en-US"/>
               </w:rPr>
-              <w:t>pt</w:t>
-            </w:r>
-            <w:proofErr w:type="spellEnd"/>
-            <w:r>
-              <w:rPr>
-                <w:lang w:val="en-US"/>
-              </w:rPr>
-              <w:t>)</w:t>
+              <w:t>pt)</w:t>
             </w:r>
           </w:p>
         </w:tc>
@@ -4608,35 +3618,7 @@
               <w:rPr>
                 <w:lang w:val="en-US"/>
               </w:rPr>
-              <w:t xml:space="preserve">Allows order price deviation percentage from </w:t>
-            </w:r>
-            <w:proofErr w:type="spellStart"/>
-            <w:r>
-              <w:rPr>
-                <w:lang w:val="en-US"/>
-              </w:rPr>
-              <w:t>BestBid</w:t>
-            </w:r>
-            <w:proofErr w:type="spellEnd"/>
-            <w:r>
-              <w:rPr>
-                <w:lang w:val="en-US"/>
-              </w:rPr>
-              <w:t xml:space="preserve">/Bid (for sell) or </w:t>
-            </w:r>
-            <w:proofErr w:type="spellStart"/>
-            <w:r>
-              <w:rPr>
-                <w:lang w:val="en-US"/>
-              </w:rPr>
-              <w:t>BestOffer</w:t>
-            </w:r>
-            <w:proofErr w:type="spellEnd"/>
-            <w:r>
-              <w:rPr>
-                <w:lang w:val="en-US"/>
-              </w:rPr>
-              <w:t>/Ask (for buy) price till configured limit size</w:t>
+              <w:t>Allows order price deviation percentage from BestBid/Bid (for sell) or BestOffer/Ask (for buy) price till configured limit size</w:t>
             </w:r>
           </w:p>
         </w:tc>
@@ -4689,21 +3671,7 @@
               <w:rPr>
                 <w:lang w:val="en-US"/>
               </w:rPr>
-              <w:t xml:space="preserve">If Limit / LMT is 10, order value </w:t>
-            </w:r>
-            <w:proofErr w:type="gramStart"/>
-            <w:r>
-              <w:rPr>
-                <w:lang w:val="en-US"/>
-              </w:rPr>
-              <w:t>are</w:t>
-            </w:r>
-            <w:proofErr w:type="gramEnd"/>
-            <w:r>
-              <w:rPr>
-                <w:lang w:val="en-US"/>
-              </w:rPr>
-              <w:t xml:space="preserve"> allowed till 10% away from Bid/Ask price on both aggressive and passive side. Order price beyond Limit % will be rejected.</w:t>
+              <w:t>If Limit / LMT is 10, order value are allowed till 10% away from Bid/Ask price on both aggressive and passive side. Order price beyond Limit % will be rejected.</w:t>
             </w:r>
           </w:p>
           <w:p>
@@ -4724,11 +3692,9 @@
               </w:rPr>
               <w:t xml:space="preserve">LMT value should be taken from </w:t>
             </w:r>
-            <w:proofErr w:type="spellStart"/>
             <w:r>
               <w:t>BBOPriceTolerance</w:t>
             </w:r>
-            <w:proofErr w:type="spellEnd"/>
           </w:p>
           <w:p>
             <w:pPr>
@@ -4760,77 +3726,21 @@
               <w:rPr>
                 <w:lang w:val="en-US"/>
               </w:rPr>
-              <w:t xml:space="preserve">BBO for Buy </w:t>
-            </w:r>
-            <w:proofErr w:type="gramStart"/>
-            <w:r>
-              <w:rPr>
-                <w:lang w:val="en-US"/>
-              </w:rPr>
-              <w:t>orders  =</w:t>
-            </w:r>
-            <w:proofErr w:type="gramEnd"/>
-            <w:r>
-              <w:rPr>
-                <w:lang w:val="en-US"/>
-              </w:rPr>
-              <w:t xml:space="preserve"> </w:t>
-            </w:r>
-            <w:proofErr w:type="gramStart"/>
-            <w:r>
-              <w:rPr>
-                <w:lang w:val="en-US"/>
-              </w:rPr>
-              <w:t>abs(</w:t>
-            </w:r>
-            <w:proofErr w:type="gramEnd"/>
-            <w:r>
-              <w:rPr>
-                <w:lang w:val="en-US"/>
-              </w:rPr>
-              <w:t>(Ask price - Reference price) / Ask price) *100</w:t>
-            </w:r>
-          </w:p>
-          <w:p>
-            <w:pPr>
-              <w:spacing w:after="160" w:line="278" w:lineRule="auto"/>
-              <w:rPr>
-                <w:lang w:val="en-US"/>
-              </w:rPr>
-            </w:pPr>
-            <w:r>
-              <w:rPr>
-                <w:lang w:val="en-US"/>
-              </w:rPr>
-              <w:t xml:space="preserve">BBO for Sell </w:t>
-            </w:r>
-            <w:proofErr w:type="gramStart"/>
-            <w:r>
-              <w:rPr>
-                <w:lang w:val="en-US"/>
-              </w:rPr>
-              <w:t>orders  =</w:t>
-            </w:r>
-            <w:proofErr w:type="gramEnd"/>
-            <w:r>
-              <w:rPr>
-                <w:lang w:val="en-US"/>
-              </w:rPr>
-              <w:t xml:space="preserve"> </w:t>
-            </w:r>
-            <w:proofErr w:type="gramStart"/>
-            <w:r>
-              <w:rPr>
-                <w:lang w:val="en-US"/>
-              </w:rPr>
-              <w:t>abs(</w:t>
-            </w:r>
-            <w:proofErr w:type="gramEnd"/>
-            <w:r>
-              <w:rPr>
-                <w:lang w:val="en-US"/>
-              </w:rPr>
-              <w:t>(Bid price - Reference price) / Bid price) *100</w:t>
+              <w:t>BBO for Buy orders  = abs((Ask price - Reference price) / Ask price) *100</w:t>
+            </w:r>
+          </w:p>
+          <w:p>
+            <w:pPr>
+              <w:spacing w:after="160" w:line="278" w:lineRule="auto"/>
+              <w:rPr>
+                <w:lang w:val="en-US"/>
+              </w:rPr>
+            </w:pPr>
+            <w:r>
+              <w:rPr>
+                <w:lang w:val="en-US"/>
+              </w:rPr>
+              <w:t>BBO for Sell orders  = abs((Bid price - Reference price) / Bid price) *100</w:t>
             </w:r>
           </w:p>
           <w:p>
@@ -4866,21 +3776,7 @@
               <w:rPr>
                 <w:lang w:val="en-US"/>
               </w:rPr>
-              <w:t xml:space="preserve">For Market orders, it is Bo/Ask for Buy side and Bb/Bid for Sell Side orders, in absence of Ask/Bid prices, it should </w:t>
-            </w:r>
-            <w:proofErr w:type="spellStart"/>
-            <w:r>
-              <w:rPr>
-                <w:lang w:val="en-US"/>
-              </w:rPr>
-              <w:t>fallback</w:t>
-            </w:r>
-            <w:proofErr w:type="spellEnd"/>
-            <w:r>
-              <w:rPr>
-                <w:lang w:val="en-US"/>
-              </w:rPr>
-              <w:t xml:space="preserve"> to last and then fallback to open and should use close price if all other prices are unavailable.</w:t>
+              <w:t>For Market orders, it is Bo/Ask for Buy side and Bb/Bid for Sell Side orders, in absence of Ask/Bid prices, it should fallback to last and then fallback to open and should use close price if all other prices are unavailable.</w:t>
             </w:r>
           </w:p>
           <w:p>
@@ -5025,11 +3921,9 @@
               </w:rPr>
               <w:t xml:space="preserve">If BBO price is not available, based on </w:t>
             </w:r>
-            <w:proofErr w:type="spellStart"/>
             <w:r>
               <w:t>invalid_bbo_price_action</w:t>
             </w:r>
-            <w:proofErr w:type="spellEnd"/>
           </w:p>
           <w:p>
             <w:pPr>
@@ -5040,34 +3934,18 @@
             </w:r>
             <w:r>
               <w:br/>
-              <w:t xml:space="preserve">If </w:t>
-            </w:r>
-            <w:proofErr w:type="spellStart"/>
-            <w:r>
-              <w:t>invalid_bbo_price_action</w:t>
-            </w:r>
-            <w:proofErr w:type="spellEnd"/>
-            <w:r>
-              <w:t xml:space="preserve"> = ignore, pass the control with message. “BBO price is missing”</w:t>
-            </w:r>
-          </w:p>
-          <w:p>
-            <w:pPr>
-              <w:spacing w:after="160" w:line="278" w:lineRule="auto"/>
-              <w:rPr>
-                <w:lang w:val="en-US"/>
-              </w:rPr>
-            </w:pPr>
-            <w:r>
-              <w:t xml:space="preserve">If </w:t>
-            </w:r>
-            <w:proofErr w:type="spellStart"/>
-            <w:r>
-              <w:t>invalid_bbo_price_action</w:t>
-            </w:r>
-            <w:proofErr w:type="spellEnd"/>
-            <w:r>
-              <w:t xml:space="preserve"> = reject, reject the control with message. “BBO price is missing”</w:t>
+              <w:t>If invalid_bbo_price_action = ignore, pass the control with message. “BBO price is missing”</w:t>
+            </w:r>
+          </w:p>
+          <w:p>
+            <w:pPr>
+              <w:spacing w:after="160" w:line="278" w:lineRule="auto"/>
+              <w:rPr>
+                <w:lang w:val="en-US"/>
+              </w:rPr>
+            </w:pPr>
+            <w:r>
+              <w:t>If invalid_bbo_price_action = reject, reject the control with message. “BBO price is missing”</w:t>
             </w:r>
           </w:p>
         </w:tc>
@@ -5095,7 +3973,13 @@
               <w:rPr>
                 <w:lang w:val="en-US"/>
               </w:rPr>
-              <w:t>Example2</w:t>
+              <w:t>Example</w:t>
+            </w:r>
+            <w:r>
+              <w:rPr>
+                <w:lang w:val="en-US"/>
+              </w:rPr>
+              <w:t>1</w:t>
             </w:r>
           </w:p>
         </w:tc>
@@ -5156,35 +4040,7 @@
                 <w:lang w:val="en-US"/>
               </w:rPr>
               <w:br/>
-              <w:t xml:space="preserve">ORD = </w:t>
-            </w:r>
-            <w:proofErr w:type="gramStart"/>
-            <w:r>
-              <w:rPr>
-                <w:lang w:val="en-US"/>
-              </w:rPr>
-              <w:t>abs(</w:t>
-            </w:r>
-            <w:proofErr w:type="gramEnd"/>
-            <w:r>
-              <w:rPr>
-                <w:lang w:val="en-US"/>
-              </w:rPr>
-              <w:t>(100 – 111)/</w:t>
-            </w:r>
-            <w:proofErr w:type="gramStart"/>
-            <w:r>
-              <w:rPr>
-                <w:lang w:val="en-US"/>
-              </w:rPr>
-              <w:t>100)*</w:t>
-            </w:r>
-            <w:proofErr w:type="gramEnd"/>
-            <w:r>
-              <w:rPr>
-                <w:lang w:val="en-US"/>
-              </w:rPr>
-              <w:t>100 = 11%</w:t>
+              <w:t>ORD = abs((100 – 111)/100)*100 = 11%</w:t>
             </w:r>
             <w:r>
               <w:rPr>
@@ -5219,7 +4075,13 @@
               <w:rPr>
                 <w:lang w:val="en-US"/>
               </w:rPr>
-              <w:t>Example3</w:t>
+              <w:t>Example</w:t>
+            </w:r>
+            <w:r>
+              <w:rPr>
+                <w:lang w:val="en-US"/>
+              </w:rPr>
+              <w:t>2</w:t>
             </w:r>
           </w:p>
         </w:tc>
@@ -5273,56 +4135,14 @@
                 <w:lang w:val="en-US"/>
               </w:rPr>
               <w:br/>
-              <w:t xml:space="preserve">Order is </w:t>
-            </w:r>
-            <w:proofErr w:type="gramStart"/>
-            <w:r>
-              <w:rPr>
-                <w:lang w:val="en-US"/>
-              </w:rPr>
-              <w:t>a</w:t>
-            </w:r>
-            <w:proofErr w:type="gramEnd"/>
-            <w:r>
-              <w:rPr>
-                <w:lang w:val="en-US"/>
-              </w:rPr>
-              <w:t xml:space="preserve"> MKT order having reference price as 95</w:t>
-            </w:r>
-            <w:r>
-              <w:rPr>
-                <w:lang w:val="en-US"/>
-              </w:rPr>
-              <w:br/>
-              <w:t xml:space="preserve">ORD = </w:t>
-            </w:r>
-            <w:proofErr w:type="gramStart"/>
-            <w:r>
-              <w:rPr>
-                <w:lang w:val="en-US"/>
-              </w:rPr>
-              <w:t>abs(</w:t>
-            </w:r>
-            <w:proofErr w:type="gramEnd"/>
-            <w:r>
-              <w:rPr>
-                <w:lang w:val="en-US"/>
-              </w:rPr>
-              <w:t>(100 – 95)/</w:t>
-            </w:r>
-            <w:proofErr w:type="gramStart"/>
-            <w:r>
-              <w:rPr>
-                <w:lang w:val="en-US"/>
-              </w:rPr>
-              <w:t>100)*</w:t>
-            </w:r>
-            <w:proofErr w:type="gramEnd"/>
-            <w:r>
-              <w:rPr>
-                <w:lang w:val="en-US"/>
-              </w:rPr>
-              <w:t>100 = 5%</w:t>
+              <w:t>Order is a MKT order having reference price as 95</w:t>
+            </w:r>
+            <w:r>
+              <w:rPr>
+                <w:lang w:val="en-US"/>
+              </w:rPr>
+              <w:br/>
+              <w:t>ORD = abs((100 – 95)/100)*100 = 5%</w:t>
             </w:r>
             <w:r>
               <w:rPr>
@@ -5336,6 +4156,836 @@
       </w:tr>
     </w:tbl>
     <w:p/>
+    <w:tbl>
+      <w:tblPr>
+        <w:tblStyle w:val="TableGrid"/>
+        <w:tblW w:w="0" w:type="auto"/>
+        <w:tblLook w:val="04A0" w:firstRow="1" w:lastRow="0" w:firstColumn="1" w:lastColumn="0" w:noHBand="0" w:noVBand="1"/>
+      </w:tblPr>
+      <w:tblGrid>
+        <w:gridCol w:w="2122"/>
+        <w:gridCol w:w="6894"/>
+      </w:tblGrid>
+      <w:tr>
+        <w:tc>
+          <w:tcPr>
+            <w:tcW w:w="2122" w:type="dxa"/>
+            <w:tcBorders>
+              <w:top w:val="single" w:sz="4" w:space="0" w:color="auto"/>
+              <w:left w:val="single" w:sz="4" w:space="0" w:color="auto"/>
+              <w:bottom w:val="single" w:sz="4" w:space="0" w:color="auto"/>
+              <w:right w:val="single" w:sz="4" w:space="0" w:color="auto"/>
+            </w:tcBorders>
+            <w:hideMark/>
+          </w:tcPr>
+          <w:p>
+            <w:pPr>
+              <w:spacing w:after="160" w:line="278" w:lineRule="auto"/>
+              <w:rPr>
+                <w:lang w:val="en-US"/>
+              </w:rPr>
+            </w:pPr>
+            <w:r>
+              <w:rPr>
+                <w:lang w:val="en-US"/>
+              </w:rPr>
+              <w:t>Control Name</w:t>
+            </w:r>
+          </w:p>
+        </w:tc>
+        <w:tc>
+          <w:tcPr>
+            <w:tcW w:w="6894" w:type="dxa"/>
+            <w:tcBorders>
+              <w:top w:val="single" w:sz="4" w:space="0" w:color="auto"/>
+              <w:left w:val="single" w:sz="4" w:space="0" w:color="auto"/>
+              <w:bottom w:val="single" w:sz="4" w:space="0" w:color="auto"/>
+              <w:right w:val="single" w:sz="4" w:space="0" w:color="auto"/>
+            </w:tcBorders>
+            <w:hideMark/>
+          </w:tcPr>
+          <w:p>
+            <w:pPr>
+              <w:spacing w:after="160" w:line="278" w:lineRule="auto"/>
+              <w:rPr>
+                <w:lang w:val="en-US"/>
+              </w:rPr>
+            </w:pPr>
+            <w:r>
+              <w:t xml:space="preserve">Max Daily Turnover </w:t>
+            </w:r>
+            <w:r>
+              <w:rPr>
+                <w:lang w:val="en-US"/>
+              </w:rPr>
+              <w:t>(</w:t>
+            </w:r>
+            <w:r>
+              <w:t>mdt</w:t>
+            </w:r>
+            <w:r>
+              <w:rPr>
+                <w:lang w:val="en-US"/>
+              </w:rPr>
+              <w:t>)</w:t>
+            </w:r>
+          </w:p>
+        </w:tc>
+      </w:tr>
+      <w:tr>
+        <w:tc>
+          <w:tcPr>
+            <w:tcW w:w="2122" w:type="dxa"/>
+            <w:tcBorders>
+              <w:top w:val="single" w:sz="4" w:space="0" w:color="auto"/>
+              <w:left w:val="single" w:sz="4" w:space="0" w:color="auto"/>
+              <w:bottom w:val="single" w:sz="4" w:space="0" w:color="auto"/>
+              <w:right w:val="single" w:sz="4" w:space="0" w:color="auto"/>
+            </w:tcBorders>
+            <w:hideMark/>
+          </w:tcPr>
+          <w:p>
+            <w:pPr>
+              <w:spacing w:after="160" w:line="278" w:lineRule="auto"/>
+              <w:rPr>
+                <w:lang w:val="en-US"/>
+              </w:rPr>
+            </w:pPr>
+            <w:r>
+              <w:rPr>
+                <w:lang w:val="en-US"/>
+              </w:rPr>
+              <w:t>Description</w:t>
+            </w:r>
+          </w:p>
+        </w:tc>
+        <w:tc>
+          <w:tcPr>
+            <w:tcW w:w="6894" w:type="dxa"/>
+            <w:tcBorders>
+              <w:top w:val="single" w:sz="4" w:space="0" w:color="auto"/>
+              <w:left w:val="single" w:sz="4" w:space="0" w:color="auto"/>
+              <w:bottom w:val="single" w:sz="4" w:space="0" w:color="auto"/>
+              <w:right w:val="single" w:sz="4" w:space="0" w:color="auto"/>
+            </w:tcBorders>
+            <w:hideMark/>
+          </w:tcPr>
+          <w:p>
+            <w:pPr>
+              <w:spacing w:after="160" w:line="278" w:lineRule="auto"/>
+              <w:rPr>
+                <w:lang w:val="en-US"/>
+              </w:rPr>
+            </w:pPr>
+            <w:r>
+              <w:t>Restricts the accumulated gross daily trading consideration (total value of all executed Buys and Sells plus the incoming order) across the trading day from exceeding the configured limit threshold</w:t>
+            </w:r>
+          </w:p>
+        </w:tc>
+      </w:tr>
+      <w:tr>
+        <w:tc>
+          <w:tcPr>
+            <w:tcW w:w="2122" w:type="dxa"/>
+            <w:tcBorders>
+              <w:top w:val="single" w:sz="4" w:space="0" w:color="auto"/>
+              <w:left w:val="single" w:sz="4" w:space="0" w:color="auto"/>
+              <w:bottom w:val="single" w:sz="4" w:space="0" w:color="auto"/>
+              <w:right w:val="single" w:sz="4" w:space="0" w:color="auto"/>
+            </w:tcBorders>
+            <w:hideMark/>
+          </w:tcPr>
+          <w:p>
+            <w:pPr>
+              <w:spacing w:after="160" w:line="278" w:lineRule="auto"/>
+              <w:rPr>
+                <w:lang w:val="en-US"/>
+              </w:rPr>
+            </w:pPr>
+            <w:r>
+              <w:rPr>
+                <w:lang w:val="en-US"/>
+              </w:rPr>
+              <w:t>Working</w:t>
+            </w:r>
+          </w:p>
+        </w:tc>
+        <w:tc>
+          <w:tcPr>
+            <w:tcW w:w="6894" w:type="dxa"/>
+            <w:tcBorders>
+              <w:top w:val="single" w:sz="4" w:space="0" w:color="auto"/>
+              <w:left w:val="single" w:sz="4" w:space="0" w:color="auto"/>
+              <w:bottom w:val="single" w:sz="4" w:space="0" w:color="auto"/>
+              <w:right w:val="single" w:sz="4" w:space="0" w:color="auto"/>
+            </w:tcBorders>
+          </w:tcPr>
+          <w:p>
+            <w:pPr>
+              <w:spacing w:after="160" w:line="278" w:lineRule="auto"/>
+            </w:pPr>
+            <w:r>
+              <w:t>1. If Limit / LMT is configured in RMS limits under "MaxDailyTurnover", the gross accumulated daily trading value (turnover) for the given scope (Trader, Account, Desk, Client, Symbol, etc.) is monitored in real-time.</w:t>
+            </w:r>
+          </w:p>
+          <w:p>
+            <w:pPr>
+              <w:spacing w:after="160" w:line="278" w:lineRule="auto"/>
+            </w:pPr>
+            <w:r>
+              <w:t>2. Any incoming order whose inclusion causes the projected total daily turnover to exceed LMT will be rejected.</w:t>
+            </w:r>
+          </w:p>
+          <w:p>
+            <w:pPr>
+              <w:spacing w:after="160" w:line="278" w:lineRule="auto"/>
+            </w:pPr>
+            <w:r>
+              <w:t>3. If LMT is 0, the control is considered disabled for that rule.</w:t>
+            </w:r>
+          </w:p>
+          <w:p>
+            <w:pPr>
+              <w:spacing w:after="160" w:line="278" w:lineRule="auto"/>
+            </w:pPr>
+            <w:r>
+              <w:lastRenderedPageBreak/>
+              <w:t>4. Turnover is calculated on a GROSS basis (both Buy and Sell considerations add positively to turnover, without netting):</w:t>
+            </w:r>
+          </w:p>
+          <w:p>
+            <w:pPr>
+              <w:spacing w:after="160" w:line="278" w:lineRule="auto"/>
+            </w:pPr>
+            <w:r>
+              <w:t xml:space="preserve">   Current Accumulated Turnover = sum(Executed / Active Buy Order Considerations) + sum(Executed / Active Sell Order Considerations)</w:t>
+            </w:r>
+          </w:p>
+          <w:p>
+            <w:pPr>
+              <w:spacing w:after="160" w:line="278" w:lineRule="auto"/>
+            </w:pPr>
+            <w:r>
+              <w:t xml:space="preserve">   Incoming Order Consideration = Order Quantity * Reference Price * FX Rate (if Order Currency differs from Limit Currency)</w:t>
+            </w:r>
+          </w:p>
+          <w:p>
+            <w:pPr>
+              <w:spacing w:before="80" w:after="80"/>
+            </w:pPr>
+            <w:r>
+              <w:t xml:space="preserve">   Projected Daily Turnover (ORD) = Current Accumulated Turnover + Incoming Order Consideration</w:t>
+            </w:r>
+            <w:r>
+              <w:br/>
+            </w:r>
+            <w:r>
+              <w:br/>
+            </w:r>
+            <w:r>
+              <w:rPr>
+                <w:rFonts w:ascii="Arial" w:hAnsi="Arial"/>
+                <w:b/>
+                <w:color w:val="003366"/>
+                <w:sz w:val="22"/>
+              </w:rPr>
+              <w:t>Reference Price Calculation</w:t>
+            </w:r>
+            <w:r>
+              <w:rPr>
+                <w:rFonts w:ascii="Arial" w:hAnsi="Arial"/>
+                <w:b/>
+                <w:color w:val="003366"/>
+                <w:sz w:val="22"/>
+              </w:rPr>
+              <w:br/>
+            </w:r>
+            <w:r>
+              <w:rPr>
+                <w:rFonts w:ascii="Arial" w:hAnsi="Arial"/>
+                <w:sz w:val="21"/>
+              </w:rPr>
+              <w:t>• For Limit Orders: Limit Price.</w:t>
+            </w:r>
+            <w:r>
+              <w:rPr>
+                <w:rFonts w:ascii="Arial" w:hAnsi="Arial"/>
+                <w:sz w:val="21"/>
+              </w:rPr>
+              <w:br/>
+              <w:t>• For Market Orders: Best Offer (Ask) for Buy orders; Best Bid (Bid) for Sell orders.</w:t>
+            </w:r>
+            <w:r>
+              <w:rPr>
+                <w:rFonts w:ascii="Arial" w:hAnsi="Arial"/>
+                <w:sz w:val="21"/>
+              </w:rPr>
+              <w:br/>
+              <w:t xml:space="preserve">  In absence of Ask/Bid prices, fallback to Last Price -&gt; Open Price -&gt; Close Price.</w:t>
+            </w:r>
+          </w:p>
+          <w:p>
+            <w:pPr>
+              <w:spacing w:before="80" w:after="80"/>
+            </w:pPr>
+            <w:r>
+              <w:rPr>
+                <w:rFonts w:ascii="Arial" w:hAnsi="Arial"/>
+                <w:b/>
+                <w:color w:val="003366"/>
+                <w:sz w:val="22"/>
+              </w:rPr>
+              <w:t>Currency &amp; FX Handling</w:t>
+            </w:r>
+            <w:r>
+              <w:rPr>
+                <w:rFonts w:ascii="Arial" w:hAnsi="Arial"/>
+                <w:b/>
+                <w:color w:val="003366"/>
+                <w:sz w:val="22"/>
+              </w:rPr>
+              <w:br/>
+            </w:r>
+            <w:r>
+              <w:rPr>
+                <w:rFonts w:ascii="Arial" w:hAnsi="Arial"/>
+                <w:sz w:val="21"/>
+              </w:rPr>
+              <w:t>If the Order Currency is different from the Limit Currency, the Incoming Order Consideration and accumulated order values are converted to the Limit Currency using the live FX rate from PXFeeder/PriceCache (e.g., HKD=X, USDHKD=X).</w:t>
+            </w:r>
+          </w:p>
+          <w:p>
+            <w:pPr>
+              <w:spacing w:after="160" w:line="278" w:lineRule="auto"/>
+            </w:pPr>
+          </w:p>
+          <w:p>
+            <w:pPr>
+              <w:spacing w:after="160" w:line="278" w:lineRule="auto"/>
+            </w:pPr>
+            <w:r>
+              <w:t>Evaluation:</w:t>
+            </w:r>
+          </w:p>
+          <w:p>
+            <w:pPr>
+              <w:spacing w:after="160" w:line="278" w:lineRule="auto"/>
+            </w:pPr>
+            <w:r>
+              <w:t xml:space="preserve">   Pass: ORD &lt;= LMT</w:t>
+            </w:r>
+          </w:p>
+          <w:p>
+            <w:pPr>
+              <w:spacing w:after="160" w:line="278" w:lineRule="auto"/>
+              <w:rPr>
+                <w:lang w:val="en-US"/>
+              </w:rPr>
+            </w:pPr>
+            <w:r>
+              <w:t xml:space="preserve">   Fail: ORD &gt; LMT</w:t>
+            </w:r>
+          </w:p>
+        </w:tc>
+      </w:tr>
+      <w:tr>
+        <w:tc>
+          <w:tcPr>
+            <w:tcW w:w="2122" w:type="dxa"/>
+            <w:tcBorders>
+              <w:top w:val="single" w:sz="4" w:space="0" w:color="auto"/>
+              <w:left w:val="single" w:sz="4" w:space="0" w:color="auto"/>
+              <w:bottom w:val="single" w:sz="4" w:space="0" w:color="auto"/>
+              <w:right w:val="single" w:sz="4" w:space="0" w:color="auto"/>
+            </w:tcBorders>
+            <w:hideMark/>
+          </w:tcPr>
+          <w:p>
+            <w:pPr>
+              <w:spacing w:after="160" w:line="278" w:lineRule="auto"/>
+              <w:rPr>
+                <w:lang w:val="en-US"/>
+              </w:rPr>
+            </w:pPr>
+            <w:r>
+              <w:rPr>
+                <w:lang w:val="en-US"/>
+              </w:rPr>
+              <w:lastRenderedPageBreak/>
+              <w:t>Rejection message</w:t>
+            </w:r>
+          </w:p>
+        </w:tc>
+        <w:tc>
+          <w:tcPr>
+            <w:tcW w:w="6894" w:type="dxa"/>
+            <w:tcBorders>
+              <w:top w:val="single" w:sz="4" w:space="0" w:color="auto"/>
+              <w:left w:val="single" w:sz="4" w:space="0" w:color="auto"/>
+              <w:bottom w:val="single" w:sz="4" w:space="0" w:color="auto"/>
+              <w:right w:val="single" w:sz="4" w:space="0" w:color="auto"/>
+            </w:tcBorders>
+            <w:hideMark/>
+          </w:tcPr>
+          <w:p>
+            <w:pPr>
+              <w:spacing w:before="80" w:after="80"/>
+              <w:rPr>
+                <w:lang w:val="en-US"/>
+              </w:rPr>
+            </w:pPr>
+            <w:r>
+              <w:rPr>
+                <w:rFonts w:ascii="Arial" w:hAnsi="Arial"/>
+                <w:sz w:val="21"/>
+              </w:rPr>
+              <w:t>Max Daily Turnover exceeds limit, LMT=$LMT, ORD=$ORD</w:t>
+            </w:r>
+          </w:p>
+        </w:tc>
+      </w:tr>
+      <w:tr>
+        <w:tc>
+          <w:tcPr>
+            <w:tcW w:w="2122" w:type="dxa"/>
+            <w:tcBorders>
+              <w:top w:val="single" w:sz="4" w:space="0" w:color="auto"/>
+              <w:left w:val="single" w:sz="4" w:space="0" w:color="auto"/>
+              <w:bottom w:val="single" w:sz="4" w:space="0" w:color="auto"/>
+              <w:right w:val="single" w:sz="4" w:space="0" w:color="auto"/>
+            </w:tcBorders>
+            <w:hideMark/>
+          </w:tcPr>
+          <w:p>
+            <w:pPr>
+              <w:spacing w:after="160" w:line="278" w:lineRule="auto"/>
+              <w:rPr>
+                <w:lang w:val="en-US"/>
+              </w:rPr>
+            </w:pPr>
+            <w:r>
+              <w:rPr>
+                <w:lang w:val="en-US"/>
+              </w:rPr>
+              <w:t>Exception handling</w:t>
+            </w:r>
+          </w:p>
+        </w:tc>
+        <w:tc>
+          <w:tcPr>
+            <w:tcW w:w="6894" w:type="dxa"/>
+            <w:tcBorders>
+              <w:top w:val="single" w:sz="4" w:space="0" w:color="auto"/>
+              <w:left w:val="single" w:sz="4" w:space="0" w:color="auto"/>
+              <w:bottom w:val="single" w:sz="4" w:space="0" w:color="auto"/>
+              <w:right w:val="single" w:sz="4" w:space="0" w:color="auto"/>
+            </w:tcBorders>
+            <w:hideMark/>
+          </w:tcPr>
+          <w:p>
+            <w:pPr>
+              <w:spacing w:after="160" w:line="278" w:lineRule="auto"/>
+              <w:rPr>
+                <w:lang w:val="en-US"/>
+              </w:rPr>
+            </w:pPr>
+            <w:r>
+              <w:rPr>
+                <w:rFonts w:ascii="Arial" w:hAnsi="Arial"/>
+                <w:sz w:val="21"/>
+              </w:rPr>
+              <w:t>• If market data price is missing for Market orders, fallback hierarchy is applied (Ask/Bid -&gt; Last -&gt; Open -&gt; Close).</w:t>
+            </w:r>
+            <w:r>
+              <w:rPr>
+                <w:rFonts w:ascii="Arial" w:hAnsi="Arial"/>
+                <w:sz w:val="21"/>
+              </w:rPr>
+              <w:br/>
+              <w:t>• If accumulated position/order cache is empty or starting fresh for the day, Current Accumulated Turnover starts at 0.0.</w:t>
+            </w:r>
+            <w:r>
+              <w:rPr>
+                <w:rFonts w:ascii="Arial" w:hAnsi="Arial"/>
+                <w:sz w:val="21"/>
+              </w:rPr>
+              <w:br/>
+              <w:t>• If FX rate is missing for cross-currency orders, fallback to 1.0 and log a warning.</w:t>
+            </w:r>
+          </w:p>
+        </w:tc>
+      </w:tr>
+      <w:tr>
+        <w:tc>
+          <w:tcPr>
+            <w:tcW w:w="2122" w:type="dxa"/>
+            <w:tcBorders>
+              <w:top w:val="single" w:sz="4" w:space="0" w:color="auto"/>
+              <w:left w:val="single" w:sz="4" w:space="0" w:color="auto"/>
+              <w:bottom w:val="single" w:sz="4" w:space="0" w:color="auto"/>
+              <w:right w:val="single" w:sz="4" w:space="0" w:color="auto"/>
+            </w:tcBorders>
+          </w:tcPr>
+          <w:p>
+            <w:pPr>
+              <w:spacing w:after="160" w:line="278" w:lineRule="auto"/>
+            </w:pPr>
+            <w:r>
+              <w:rPr>
+                <w:sz w:val="22"/>
+              </w:rPr>
+              <w:t>Example 1</w:t>
+            </w:r>
+            <w:r>
+              <w:rPr>
+                <w:rFonts w:ascii="Arial" w:hAnsi="Arial"/>
+                <w:b/>
+                <w:color w:val="003366"/>
+                <w:sz w:val="22"/>
+              </w:rPr>
+              <w:t xml:space="preserve"> </w:t>
+            </w:r>
+            <w:r>
+              <w:rPr>
+                <w:rFonts w:ascii="Arial" w:hAnsi="Arial"/>
+                <w:b/>
+                <w:color w:val="003366"/>
+              </w:rPr>
+              <w:br/>
+            </w:r>
+            <w:r>
+              <w:rPr>
+                <w:rFonts w:ascii="Arial" w:hAnsi="Arial"/>
+                <w:b/>
+                <w:color w:val="003366"/>
+                <w:sz w:val="22"/>
+              </w:rPr>
+              <w:t>(Normal Pass)</w:t>
+            </w:r>
+          </w:p>
+        </w:tc>
+        <w:tc>
+          <w:tcPr>
+            <w:tcW w:w="6894" w:type="dxa"/>
+            <w:tcBorders>
+              <w:top w:val="single" w:sz="4" w:space="0" w:color="auto"/>
+              <w:left w:val="single" w:sz="4" w:space="0" w:color="auto"/>
+              <w:bottom w:val="single" w:sz="4" w:space="0" w:color="auto"/>
+              <w:right w:val="single" w:sz="4" w:space="0" w:color="auto"/>
+            </w:tcBorders>
+          </w:tcPr>
+          <w:p>
+            <w:pPr>
+              <w:spacing w:before="80" w:after="80"/>
+            </w:pPr>
+            <w:r>
+              <w:rPr>
+                <w:rFonts w:ascii="Arial" w:hAnsi="Arial"/>
+                <w:sz w:val="21"/>
+              </w:rPr>
+              <w:t>LMT is 1,000,000 HKD</w:t>
+            </w:r>
+            <w:r>
+              <w:rPr>
+                <w:rFonts w:ascii="Arial" w:hAnsi="Arial"/>
+                <w:sz w:val="21"/>
+              </w:rPr>
+              <w:br/>
+              <w:t>Current Accumulated Gross Turnover = 600,000 HKD (400,000 HKD Buys + 200,000 HKD Sells)</w:t>
+            </w:r>
+            <w:r>
+              <w:rPr>
+                <w:rFonts w:ascii="Arial" w:hAnsi="Arial"/>
+                <w:sz w:val="21"/>
+              </w:rPr>
+              <w:br/>
+              <w:t>Incoming Order: BUY 1,000 shares of 0700.HK @ 300 HKD (Value = 300,000 HKD)</w:t>
+            </w:r>
+            <w:r>
+              <w:rPr>
+                <w:rFonts w:ascii="Arial" w:hAnsi="Arial"/>
+                <w:sz w:val="21"/>
+              </w:rPr>
+              <w:br/>
+              <w:t>ORD = 600,000 + 300,000 = 900,000 HKD</w:t>
+            </w:r>
+            <w:r>
+              <w:rPr>
+                <w:rFonts w:ascii="Arial" w:hAnsi="Arial"/>
+                <w:sz w:val="21"/>
+              </w:rPr>
+              <w:br/>
+              <w:t>ORD (900,000) &lt;= LMT (1,000,000) -&gt; Order PASSES</w:t>
+            </w:r>
+          </w:p>
+          <w:p>
+            <w:pPr>
+              <w:spacing w:before="80" w:after="80"/>
+              <w:rPr>
+                <w:rFonts w:ascii="Arial" w:hAnsi="Arial"/>
+                <w:sz w:val="21"/>
+              </w:rPr>
+            </w:pPr>
+          </w:p>
+        </w:tc>
+      </w:tr>
+      <w:tr>
+        <w:tc>
+          <w:tcPr>
+            <w:tcW w:w="2122" w:type="dxa"/>
+            <w:tcBorders>
+              <w:top w:val="single" w:sz="4" w:space="0" w:color="auto"/>
+              <w:left w:val="single" w:sz="4" w:space="0" w:color="auto"/>
+              <w:bottom w:val="single" w:sz="4" w:space="0" w:color="auto"/>
+              <w:right w:val="single" w:sz="4" w:space="0" w:color="auto"/>
+            </w:tcBorders>
+            <w:hideMark/>
+          </w:tcPr>
+          <w:p>
+            <w:pPr>
+              <w:spacing w:after="160" w:line="278" w:lineRule="auto"/>
+              <w:rPr>
+                <w:lang w:val="en-US"/>
+              </w:rPr>
+            </w:pPr>
+            <w:r>
+              <w:rPr>
+                <w:lang w:val="en-US"/>
+              </w:rPr>
+              <w:t>Example2</w:t>
+            </w:r>
+            <w:r>
+              <w:br/>
+            </w:r>
+            <w:r>
+              <w:rPr>
+                <w:rFonts w:ascii="Arial" w:hAnsi="Arial"/>
+                <w:b/>
+                <w:color w:val="003366"/>
+                <w:sz w:val="22"/>
+              </w:rPr>
+              <w:t xml:space="preserve">(Breach &amp; </w:t>
+            </w:r>
+            <w:r>
+              <w:rPr>
+                <w:rFonts w:ascii="Arial" w:hAnsi="Arial"/>
+                <w:b/>
+                <w:color w:val="003366"/>
+                <w:sz w:val="22"/>
+              </w:rPr>
+              <w:lastRenderedPageBreak/>
+              <w:t>Rejection on Sell Order)</w:t>
+            </w:r>
+          </w:p>
+        </w:tc>
+        <w:tc>
+          <w:tcPr>
+            <w:tcW w:w="6894" w:type="dxa"/>
+            <w:tcBorders>
+              <w:top w:val="single" w:sz="4" w:space="0" w:color="auto"/>
+              <w:left w:val="single" w:sz="4" w:space="0" w:color="auto"/>
+              <w:bottom w:val="single" w:sz="4" w:space="0" w:color="auto"/>
+              <w:right w:val="single" w:sz="4" w:space="0" w:color="auto"/>
+            </w:tcBorders>
+            <w:hideMark/>
+          </w:tcPr>
+          <w:p>
+            <w:pPr>
+              <w:spacing w:before="80" w:after="80"/>
+            </w:pPr>
+            <w:r>
+              <w:rPr>
+                <w:rFonts w:ascii="Arial" w:hAnsi="Arial"/>
+                <w:sz w:val="21"/>
+              </w:rPr>
+              <w:lastRenderedPageBreak/>
+              <w:t>LMT is 1,000,000 HKD</w:t>
+            </w:r>
+            <w:r>
+              <w:rPr>
+                <w:rFonts w:ascii="Arial" w:hAnsi="Arial"/>
+                <w:sz w:val="21"/>
+              </w:rPr>
+              <w:br/>
+              <w:t>Current Accumulated Gross Turnover = 800,000 HKD</w:t>
+            </w:r>
+            <w:r>
+              <w:rPr>
+                <w:rFonts w:ascii="Arial" w:hAnsi="Arial"/>
+                <w:sz w:val="21"/>
+              </w:rPr>
+              <w:br/>
+              <w:t>Incoming Order: SELL 1,000 shares of 0005.HK @ 300 HKD (Value = 300,000 HKD)</w:t>
+            </w:r>
+            <w:r>
+              <w:rPr>
+                <w:rFonts w:ascii="Arial" w:hAnsi="Arial"/>
+                <w:sz w:val="21"/>
+              </w:rPr>
+              <w:br/>
+            </w:r>
+            <w:r>
+              <w:rPr>
+                <w:rFonts w:ascii="Arial" w:hAnsi="Arial"/>
+                <w:sz w:val="21"/>
+              </w:rPr>
+              <w:lastRenderedPageBreak/>
+              <w:t>ORD = 800,000 + 300,000 = 1,100,000 HKD</w:t>
+            </w:r>
+            <w:r>
+              <w:rPr>
+                <w:rFonts w:ascii="Arial" w:hAnsi="Arial"/>
+                <w:sz w:val="21"/>
+              </w:rPr>
+              <w:br/>
+              <w:t>ORD (1,100,000) &gt; LMT (1,000,000) -&gt; Order FAILS with rejection message:</w:t>
+            </w:r>
+            <w:r>
+              <w:rPr>
+                <w:rFonts w:ascii="Arial" w:hAnsi="Arial"/>
+                <w:sz w:val="21"/>
+              </w:rPr>
+              <w:br/>
+              <w:t>"Max Daily Turnover exceeds limit, LMT=1000000.0, ORD=1100000.0"</w:t>
+            </w:r>
+          </w:p>
+          <w:p>
+            <w:pPr>
+              <w:spacing w:after="160" w:line="278" w:lineRule="auto"/>
+              <w:rPr>
+                <w:lang w:val="en-US"/>
+              </w:rPr>
+            </w:pPr>
+          </w:p>
+        </w:tc>
+      </w:tr>
+      <w:tr>
+        <w:tc>
+          <w:tcPr>
+            <w:tcW w:w="2122" w:type="dxa"/>
+            <w:tcBorders>
+              <w:top w:val="single" w:sz="4" w:space="0" w:color="auto"/>
+              <w:left w:val="single" w:sz="4" w:space="0" w:color="auto"/>
+              <w:bottom w:val="single" w:sz="4" w:space="0" w:color="auto"/>
+              <w:right w:val="single" w:sz="4" w:space="0" w:color="auto"/>
+            </w:tcBorders>
+            <w:hideMark/>
+          </w:tcPr>
+          <w:p>
+            <w:pPr>
+              <w:spacing w:after="160" w:line="278" w:lineRule="auto"/>
+              <w:rPr>
+                <w:lang w:val="en-US"/>
+              </w:rPr>
+            </w:pPr>
+            <w:r>
+              <w:rPr>
+                <w:lang w:val="en-US"/>
+              </w:rPr>
+              <w:lastRenderedPageBreak/>
+              <w:t>Example3</w:t>
+            </w:r>
+            <w:r>
+              <w:br/>
+            </w:r>
+            <w:r>
+              <w:rPr>
+                <w:rFonts w:ascii="Arial" w:hAnsi="Arial"/>
+                <w:b/>
+                <w:color w:val="003366"/>
+                <w:sz w:val="22"/>
+              </w:rPr>
+              <w:t>(Multi-Currency with FX Conversion)</w:t>
+            </w:r>
+          </w:p>
+        </w:tc>
+        <w:tc>
+          <w:tcPr>
+            <w:tcW w:w="6894" w:type="dxa"/>
+            <w:tcBorders>
+              <w:top w:val="single" w:sz="4" w:space="0" w:color="auto"/>
+              <w:left w:val="single" w:sz="4" w:space="0" w:color="auto"/>
+              <w:bottom w:val="single" w:sz="4" w:space="0" w:color="auto"/>
+              <w:right w:val="single" w:sz="4" w:space="0" w:color="auto"/>
+            </w:tcBorders>
+            <w:hideMark/>
+          </w:tcPr>
+          <w:p>
+            <w:pPr>
+              <w:spacing w:before="80" w:after="80"/>
+              <w:rPr>
+                <w:rFonts w:ascii="Arial" w:hAnsi="Arial"/>
+                <w:sz w:val="21"/>
+                <w:lang w:val="en-US"/>
+              </w:rPr>
+            </w:pPr>
+            <w:r>
+              <w:rPr>
+                <w:rFonts w:ascii="Arial" w:hAnsi="Arial"/>
+                <w:sz w:val="21"/>
+              </w:rPr>
+              <w:t>LMT is 200,000 USD</w:t>
+            </w:r>
+            <w:r>
+              <w:rPr>
+                <w:rFonts w:ascii="Arial" w:hAnsi="Arial"/>
+                <w:sz w:val="21"/>
+              </w:rPr>
+              <w:br/>
+              <w:t>Current Accumulated Gross Turnover = 100,000 USD</w:t>
+            </w:r>
+            <w:r>
+              <w:rPr>
+                <w:rFonts w:ascii="Arial" w:hAnsi="Arial"/>
+                <w:sz w:val="21"/>
+              </w:rPr>
+              <w:br/>
+              <w:t>Incoming Order: BUY 10,000 shares of 0002.HK @ 100 HKD (Value = 1,000,000 HKD)</w:t>
+            </w:r>
+            <w:r>
+              <w:rPr>
+                <w:rFonts w:ascii="Arial" w:hAnsi="Arial"/>
+                <w:sz w:val="21"/>
+              </w:rPr>
+              <w:br/>
+              <w:t>FX Rate (HKD to USD) = 0.128</w:t>
+            </w:r>
+            <w:r>
+              <w:rPr>
+                <w:rFonts w:ascii="Arial" w:hAnsi="Arial"/>
+                <w:sz w:val="21"/>
+              </w:rPr>
+              <w:br/>
+              <w:t>Incoming Order Consideration in Limit Currency = 1,000,000 * 0.128 = 128,000 USD</w:t>
+            </w:r>
+            <w:r>
+              <w:rPr>
+                <w:rFonts w:ascii="Arial" w:hAnsi="Arial"/>
+                <w:sz w:val="21"/>
+              </w:rPr>
+              <w:br/>
+              <w:t>ORD = 100,000 + 128,000 = 228,000 USD</w:t>
+            </w:r>
+            <w:r>
+              <w:rPr>
+                <w:rFonts w:ascii="Arial" w:hAnsi="Arial"/>
+                <w:sz w:val="21"/>
+              </w:rPr>
+              <w:br/>
+              <w:t>ORD (228,000) &gt; LMT (200,000) -&gt; Order FAILS with rejection message:</w:t>
+            </w:r>
+            <w:r>
+              <w:rPr>
+                <w:rFonts w:ascii="Arial" w:hAnsi="Arial"/>
+                <w:sz w:val="21"/>
+              </w:rPr>
+              <w:br/>
+              <w:t>"Max Daily Turnover exceeds limit, LMT=200000.0, ORD=228000.0"</w:t>
+            </w:r>
+          </w:p>
+        </w:tc>
+      </w:tr>
+    </w:tbl>
     <w:p/>
     <w:sectPr>
       <w:pgSz w:w="11906" w:h="16838"/>

</xml_diff>